<commit_message>
Inclui mapas conceituais por slide no roteiro de fala e estudo dirigido
Co-Authored-By: Claude Opus 5.5 <noreply@anthropic.com>
Claude-Session: https://claude.ai/code/session_01HxStpW4pQoDfJdTDYr6zEC
</commit_message>
<xml_diff>
--- a/apresentacao_qualificacao/ROTEIRO_E_ESTUDO_DIRIGIDO.docx
+++ b/apresentacao_qualificacao/ROTEIRO_E_ESTUDO_DIRIGIDO.docx
@@ -44,7 +44,7 @@
         <w:pStyle w:val="ListBullet"/>
       </w:pPr>
       <w:r>
-        <w:t>Cada slide tem duas partes. A fala, na caixa azul, é o texto para dizer em voz alta, com o tempo previsto e o tempo acumulado. O estudo dirigido, logo abaixo, reúne a ideia central, os conceitos com a explicação que a tese adota, os autores e as páginas citadas, onde aprofundar na tese, perguntas de estudo (com a pista de resposta entre parênteses) e, quando houver, o cuidado sobre o que é fato, estimativa ou ainda a conferir.</w:t>
+        <w:t>No início, um mapa conceitual de toda a apresentação. Cada slide tem duas partes. A fala, na caixa azul, é o texto para dizer em voz alta, com o tempo previsto e o tempo acumulado. O estudo dirigido, logo abaixo, começa pelo mapa conceitual do slide e reúne a ideia central, os conceitos com a explicação que a tese adota, os autores e as páginas citadas, onde aprofundar na tese, perguntas de estudo (com a pista de resposta entre parênteses) e, quando houver, o cuidado sobre o que é fato, estimativa ou ainda a conferir.</w:t>
       </w:r>
     </w:p>
     <w:p>
@@ -605,6 +605,58 @@
         </w:tc>
       </w:tr>
     </w:tbl>
+    <w:p>
+      <w:pPr>
+        <w:pStyle w:val="Heading1"/>
+      </w:pPr>
+      <w:r>
+        <w:t>Mapa conceitual da apresentação</w:t>
+      </w:r>
+    </w:p>
+    <w:p>
+      <w:r>
+        <w:t>Como ler os mapas: o conceito central fica no retângulo azul; cada seta leva a um conceito ligado a ele, e a frase sobre a seta diz a relação (leia "conceito central + frase de ligação + conceito"). O retângulo amarelo é o desdobramento: aonde o slide leva. Cada slide de conteúdo tem o seu mapa no início do estudo dirigido.</w:t>
+      </w:r>
+    </w:p>
+    <w:p>
+      <w:pPr>
+        <w:jc w:val="center"/>
+      </w:pPr>
+      <w:r>
+        <w:drawing>
+          <wp:inline xmlns:a="http://schemas.openxmlformats.org/drawingml/2006/main" xmlns:pic="http://schemas.openxmlformats.org/drawingml/2006/picture">
+            <wp:extent cx="5903999" cy="3719519"/>
+            <wp:docPr id="1" name="Picture 1"/>
+            <wp:cNvGraphicFramePr>
+              <a:graphicFrameLocks noChangeAspect="1"/>
+            </wp:cNvGraphicFramePr>
+            <a:graphic>
+              <a:graphicData uri="http://schemas.openxmlformats.org/drawingml/2006/picture">
+                <pic:pic>
+                  <pic:nvPicPr>
+                    <pic:cNvPr id="0" name="mapa_00.png"/>
+                    <pic:cNvPicPr/>
+                  </pic:nvPicPr>
+                  <pic:blipFill>
+                    <a:blip r:embed="rId9"/>
+                    <a:stretch>
+                      <a:fillRect/>
+                    </a:stretch>
+                  </pic:blipFill>
+                  <pic:spPr>
+                    <a:xfrm>
+                      <a:off x="0" y="0"/>
+                      <a:ext cx="5903999" cy="3719519"/>
+                    </a:xfrm>
+                    <a:prstGeom prst="rect"/>
+                  </pic:spPr>
+                </pic:pic>
+              </a:graphicData>
+            </a:graphic>
+          </wp:inline>
+        </w:drawing>
+      </w:r>
+    </w:p>
     <w:p>
       <w:pPr>
         <w:pStyle w:val="Heading1"/>
@@ -2218,6 +2270,53 @@
         <w:rPr>
           <w:b/>
         </w:rPr>
+        <w:t>Mapa conceitual</w:t>
+      </w:r>
+    </w:p>
+    <w:p>
+      <w:pPr>
+        <w:jc w:val="center"/>
+      </w:pPr>
+      <w:r>
+        <w:drawing>
+          <wp:inline xmlns:a="http://schemas.openxmlformats.org/drawingml/2006/main" xmlns:pic="http://schemas.openxmlformats.org/drawingml/2006/picture">
+            <wp:extent cx="5903999" cy="2881152"/>
+            <wp:docPr id="2" name="Picture 2"/>
+            <wp:cNvGraphicFramePr>
+              <a:graphicFrameLocks noChangeAspect="1"/>
+            </wp:cNvGraphicFramePr>
+            <a:graphic>
+              <a:graphicData uri="http://schemas.openxmlformats.org/drawingml/2006/picture">
+                <pic:pic>
+                  <pic:nvPicPr>
+                    <pic:cNvPr id="0" name="mapa_03.png"/>
+                    <pic:cNvPicPr/>
+                  </pic:nvPicPr>
+                  <pic:blipFill>
+                    <a:blip r:embed="rId10"/>
+                    <a:stretch>
+                      <a:fillRect/>
+                    </a:stretch>
+                  </pic:blipFill>
+                  <pic:spPr>
+                    <a:xfrm>
+                      <a:off x="0" y="0"/>
+                      <a:ext cx="5903999" cy="2881152"/>
+                    </a:xfrm>
+                    <a:prstGeom prst="rect"/>
+                  </pic:spPr>
+                </pic:pic>
+              </a:graphicData>
+            </a:graphic>
+          </wp:inline>
+        </w:drawing>
+      </w:r>
+    </w:p>
+    <w:p>
+      <w:r>
+        <w:rPr>
+          <w:b/>
+        </w:rPr>
         <w:t xml:space="preserve">Ideia central: </w:t>
       </w:r>
       <w:r>
@@ -2416,6 +2515,53 @@
         <w:rPr>
           <w:b/>
         </w:rPr>
+        <w:t>Mapa conceitual</w:t>
+      </w:r>
+    </w:p>
+    <w:p>
+      <w:pPr>
+        <w:jc w:val="center"/>
+      </w:pPr>
+      <w:r>
+        <w:drawing>
+          <wp:inline xmlns:a="http://schemas.openxmlformats.org/drawingml/2006/main" xmlns:pic="http://schemas.openxmlformats.org/drawingml/2006/picture">
+            <wp:extent cx="5903999" cy="2739456"/>
+            <wp:docPr id="3" name="Picture 3"/>
+            <wp:cNvGraphicFramePr>
+              <a:graphicFrameLocks noChangeAspect="1"/>
+            </wp:cNvGraphicFramePr>
+            <a:graphic>
+              <a:graphicData uri="http://schemas.openxmlformats.org/drawingml/2006/picture">
+                <pic:pic>
+                  <pic:nvPicPr>
+                    <pic:cNvPr id="0" name="mapa_04.png"/>
+                    <pic:cNvPicPr/>
+                  </pic:nvPicPr>
+                  <pic:blipFill>
+                    <a:blip r:embed="rId11"/>
+                    <a:stretch>
+                      <a:fillRect/>
+                    </a:stretch>
+                  </pic:blipFill>
+                  <pic:spPr>
+                    <a:xfrm>
+                      <a:off x="0" y="0"/>
+                      <a:ext cx="5903999" cy="2739456"/>
+                    </a:xfrm>
+                    <a:prstGeom prst="rect"/>
+                  </pic:spPr>
+                </pic:pic>
+              </a:graphicData>
+            </a:graphic>
+          </wp:inline>
+        </w:drawing>
+      </w:r>
+    </w:p>
+    <w:p>
+      <w:r>
+        <w:rPr>
+          <w:b/>
+        </w:rPr>
         <w:t xml:space="preserve">Ideia central: </w:t>
       </w:r>
       <w:r>
@@ -2602,6 +2748,53 @@
         <w:rPr>
           <w:b/>
         </w:rPr>
+        <w:t>Mapa conceitual</w:t>
+      </w:r>
+    </w:p>
+    <w:p>
+      <w:pPr>
+        <w:jc w:val="center"/>
+      </w:pPr>
+      <w:r>
+        <w:drawing>
+          <wp:inline xmlns:a="http://schemas.openxmlformats.org/drawingml/2006/main" xmlns:pic="http://schemas.openxmlformats.org/drawingml/2006/picture">
+            <wp:extent cx="5903999" cy="2881152"/>
+            <wp:docPr id="4" name="Picture 4"/>
+            <wp:cNvGraphicFramePr>
+              <a:graphicFrameLocks noChangeAspect="1"/>
+            </wp:cNvGraphicFramePr>
+            <a:graphic>
+              <a:graphicData uri="http://schemas.openxmlformats.org/drawingml/2006/picture">
+                <pic:pic>
+                  <pic:nvPicPr>
+                    <pic:cNvPr id="0" name="mapa_05.png"/>
+                    <pic:cNvPicPr/>
+                  </pic:nvPicPr>
+                  <pic:blipFill>
+                    <a:blip r:embed="rId12"/>
+                    <a:stretch>
+                      <a:fillRect/>
+                    </a:stretch>
+                  </pic:blipFill>
+                  <pic:spPr>
+                    <a:xfrm>
+                      <a:off x="0" y="0"/>
+                      <a:ext cx="5903999" cy="2881152"/>
+                    </a:xfrm>
+                    <a:prstGeom prst="rect"/>
+                  </pic:spPr>
+                </pic:pic>
+              </a:graphicData>
+            </a:graphic>
+          </wp:inline>
+        </w:drawing>
+      </w:r>
+    </w:p>
+    <w:p>
+      <w:r>
+        <w:rPr>
+          <w:b/>
+        </w:rPr>
         <w:t xml:space="preserve">Ideia central: </w:t>
       </w:r>
       <w:r>
@@ -2804,6 +2997,53 @@
         <w:rPr>
           <w:b/>
         </w:rPr>
+        <w:t>Mapa conceitual</w:t>
+      </w:r>
+    </w:p>
+    <w:p>
+      <w:pPr>
+        <w:jc w:val="center"/>
+      </w:pPr>
+      <w:r>
+        <w:drawing>
+          <wp:inline xmlns:a="http://schemas.openxmlformats.org/drawingml/2006/main" xmlns:pic="http://schemas.openxmlformats.org/drawingml/2006/picture">
+            <wp:extent cx="5903999" cy="3229487"/>
+            <wp:docPr id="5" name="Picture 5"/>
+            <wp:cNvGraphicFramePr>
+              <a:graphicFrameLocks noChangeAspect="1"/>
+            </wp:cNvGraphicFramePr>
+            <a:graphic>
+              <a:graphicData uri="http://schemas.openxmlformats.org/drawingml/2006/picture">
+                <pic:pic>
+                  <pic:nvPicPr>
+                    <pic:cNvPr id="0" name="mapa_06.png"/>
+                    <pic:cNvPicPr/>
+                  </pic:nvPicPr>
+                  <pic:blipFill>
+                    <a:blip r:embed="rId13"/>
+                    <a:stretch>
+                      <a:fillRect/>
+                    </a:stretch>
+                  </pic:blipFill>
+                  <pic:spPr>
+                    <a:xfrm>
+                      <a:off x="0" y="0"/>
+                      <a:ext cx="5903999" cy="3229487"/>
+                    </a:xfrm>
+                    <a:prstGeom prst="rect"/>
+                  </pic:spPr>
+                </pic:pic>
+              </a:graphicData>
+            </a:graphic>
+          </wp:inline>
+        </w:drawing>
+      </w:r>
+    </w:p>
+    <w:p>
+      <w:r>
+        <w:rPr>
+          <w:b/>
+        </w:rPr>
         <w:t xml:space="preserve">Ideia central: </w:t>
       </w:r>
       <w:r>
@@ -2981,6 +3221,53 @@
         <w:rPr>
           <w:b/>
         </w:rPr>
+        <w:t>Mapa conceitual</w:t>
+      </w:r>
+    </w:p>
+    <w:p>
+      <w:pPr>
+        <w:jc w:val="center"/>
+      </w:pPr>
+      <w:r>
+        <w:drawing>
+          <wp:inline xmlns:a="http://schemas.openxmlformats.org/drawingml/2006/main" xmlns:pic="http://schemas.openxmlformats.org/drawingml/2006/picture">
+            <wp:extent cx="5903999" cy="2391120"/>
+            <wp:docPr id="6" name="Picture 6"/>
+            <wp:cNvGraphicFramePr>
+              <a:graphicFrameLocks noChangeAspect="1"/>
+            </wp:cNvGraphicFramePr>
+            <a:graphic>
+              <a:graphicData uri="http://schemas.openxmlformats.org/drawingml/2006/picture">
+                <pic:pic>
+                  <pic:nvPicPr>
+                    <pic:cNvPr id="0" name="mapa_07.png"/>
+                    <pic:cNvPicPr/>
+                  </pic:nvPicPr>
+                  <pic:blipFill>
+                    <a:blip r:embed="rId14"/>
+                    <a:stretch>
+                      <a:fillRect/>
+                    </a:stretch>
+                  </pic:blipFill>
+                  <pic:spPr>
+                    <a:xfrm>
+                      <a:off x="0" y="0"/>
+                      <a:ext cx="5903999" cy="2391120"/>
+                    </a:xfrm>
+                    <a:prstGeom prst="rect"/>
+                  </pic:spPr>
+                </pic:pic>
+              </a:graphicData>
+            </a:graphic>
+          </wp:inline>
+        </w:drawing>
+      </w:r>
+    </w:p>
+    <w:p>
+      <w:r>
+        <w:rPr>
+          <w:b/>
+        </w:rPr>
         <w:t xml:space="preserve">Ideia central: </w:t>
       </w:r>
       <w:r>
@@ -3254,6 +3541,53 @@
         <w:rPr>
           <w:b/>
         </w:rPr>
+        <w:t>Mapa conceitual</w:t>
+      </w:r>
+    </w:p>
+    <w:p>
+      <w:pPr>
+        <w:jc w:val="center"/>
+      </w:pPr>
+      <w:r>
+        <w:drawing>
+          <wp:inline xmlns:a="http://schemas.openxmlformats.org/drawingml/2006/main" xmlns:pic="http://schemas.openxmlformats.org/drawingml/2006/picture">
+            <wp:extent cx="5903999" cy="3371183"/>
+            <wp:docPr id="7" name="Picture 7"/>
+            <wp:cNvGraphicFramePr>
+              <a:graphicFrameLocks noChangeAspect="1"/>
+            </wp:cNvGraphicFramePr>
+            <a:graphic>
+              <a:graphicData uri="http://schemas.openxmlformats.org/drawingml/2006/picture">
+                <pic:pic>
+                  <pic:nvPicPr>
+                    <pic:cNvPr id="0" name="mapa_09.png"/>
+                    <pic:cNvPicPr/>
+                  </pic:nvPicPr>
+                  <pic:blipFill>
+                    <a:blip r:embed="rId15"/>
+                    <a:stretch>
+                      <a:fillRect/>
+                    </a:stretch>
+                  </pic:blipFill>
+                  <pic:spPr>
+                    <a:xfrm>
+                      <a:off x="0" y="0"/>
+                      <a:ext cx="5903999" cy="3371183"/>
+                    </a:xfrm>
+                    <a:prstGeom prst="rect"/>
+                  </pic:spPr>
+                </pic:pic>
+              </a:graphicData>
+            </a:graphic>
+          </wp:inline>
+        </w:drawing>
+      </w:r>
+    </w:p>
+    <w:p>
+      <w:r>
+        <w:rPr>
+          <w:b/>
+        </w:rPr>
         <w:t xml:space="preserve">Ideia central: </w:t>
       </w:r>
       <w:r>
@@ -3465,6 +3799,53 @@
         <w:rPr>
           <w:b/>
         </w:rPr>
+        <w:t>Mapa conceitual</w:t>
+      </w:r>
+    </w:p>
+    <w:p>
+      <w:pPr>
+        <w:jc w:val="center"/>
+      </w:pPr>
+      <w:r>
+        <w:drawing>
+          <wp:inline xmlns:a="http://schemas.openxmlformats.org/drawingml/2006/main" xmlns:pic="http://schemas.openxmlformats.org/drawingml/2006/picture">
+            <wp:extent cx="5903999" cy="2946096"/>
+            <wp:docPr id="8" name="Picture 8"/>
+            <wp:cNvGraphicFramePr>
+              <a:graphicFrameLocks noChangeAspect="1"/>
+            </wp:cNvGraphicFramePr>
+            <a:graphic>
+              <a:graphicData uri="http://schemas.openxmlformats.org/drawingml/2006/picture">
+                <pic:pic>
+                  <pic:nvPicPr>
+                    <pic:cNvPr id="0" name="mapa_10.png"/>
+                    <pic:cNvPicPr/>
+                  </pic:nvPicPr>
+                  <pic:blipFill>
+                    <a:blip r:embed="rId16"/>
+                    <a:stretch>
+                      <a:fillRect/>
+                    </a:stretch>
+                  </pic:blipFill>
+                  <pic:spPr>
+                    <a:xfrm>
+                      <a:off x="0" y="0"/>
+                      <a:ext cx="5903999" cy="2946096"/>
+                    </a:xfrm>
+                    <a:prstGeom prst="rect"/>
+                  </pic:spPr>
+                </pic:pic>
+              </a:graphicData>
+            </a:graphic>
+          </wp:inline>
+        </w:drawing>
+      </w:r>
+    </w:p>
+    <w:p>
+      <w:r>
+        <w:rPr>
+          <w:b/>
+        </w:rPr>
         <w:t xml:space="preserve">Ideia central: </w:t>
       </w:r>
       <w:r>
@@ -3719,6 +4100,53 @@
         <w:rPr>
           <w:b/>
         </w:rPr>
+        <w:t>Mapa conceitual</w:t>
+      </w:r>
+    </w:p>
+    <w:p>
+      <w:pPr>
+        <w:jc w:val="center"/>
+      </w:pPr>
+      <w:r>
+        <w:drawing>
+          <wp:inline xmlns:a="http://schemas.openxmlformats.org/drawingml/2006/main" xmlns:pic="http://schemas.openxmlformats.org/drawingml/2006/picture">
+            <wp:extent cx="5903999" cy="2391120"/>
+            <wp:docPr id="9" name="Picture 9"/>
+            <wp:cNvGraphicFramePr>
+              <a:graphicFrameLocks noChangeAspect="1"/>
+            </wp:cNvGraphicFramePr>
+            <a:graphic>
+              <a:graphicData uri="http://schemas.openxmlformats.org/drawingml/2006/picture">
+                <pic:pic>
+                  <pic:nvPicPr>
+                    <pic:cNvPr id="0" name="mapa_12.png"/>
+                    <pic:cNvPicPr/>
+                  </pic:nvPicPr>
+                  <pic:blipFill>
+                    <a:blip r:embed="rId17"/>
+                    <a:stretch>
+                      <a:fillRect/>
+                    </a:stretch>
+                  </pic:blipFill>
+                  <pic:spPr>
+                    <a:xfrm>
+                      <a:off x="0" y="0"/>
+                      <a:ext cx="5903999" cy="2391120"/>
+                    </a:xfrm>
+                    <a:prstGeom prst="rect"/>
+                  </pic:spPr>
+                </pic:pic>
+              </a:graphicData>
+            </a:graphic>
+          </wp:inline>
+        </w:drawing>
+      </w:r>
+    </w:p>
+    <w:p>
+      <w:r>
+        <w:rPr>
+          <w:b/>
+        </w:rPr>
         <w:t xml:space="preserve">Ideia central: </w:t>
       </w:r>
       <w:r>
@@ -3949,6 +4377,53 @@
         <w:rPr>
           <w:b/>
         </w:rPr>
+        <w:t>Mapa conceitual</w:t>
+      </w:r>
+    </w:p>
+    <w:p>
+      <w:pPr>
+        <w:jc w:val="center"/>
+      </w:pPr>
+      <w:r>
+        <w:drawing>
+          <wp:inline xmlns:a="http://schemas.openxmlformats.org/drawingml/2006/main" xmlns:pic="http://schemas.openxmlformats.org/drawingml/2006/picture">
+            <wp:extent cx="5903999" cy="2249424"/>
+            <wp:docPr id="10" name="Picture 10"/>
+            <wp:cNvGraphicFramePr>
+              <a:graphicFrameLocks noChangeAspect="1"/>
+            </wp:cNvGraphicFramePr>
+            <a:graphic>
+              <a:graphicData uri="http://schemas.openxmlformats.org/drawingml/2006/picture">
+                <pic:pic>
+                  <pic:nvPicPr>
+                    <pic:cNvPr id="0" name="mapa_13.png"/>
+                    <pic:cNvPicPr/>
+                  </pic:nvPicPr>
+                  <pic:blipFill>
+                    <a:blip r:embed="rId18"/>
+                    <a:stretch>
+                      <a:fillRect/>
+                    </a:stretch>
+                  </pic:blipFill>
+                  <pic:spPr>
+                    <a:xfrm>
+                      <a:off x="0" y="0"/>
+                      <a:ext cx="5903999" cy="2249424"/>
+                    </a:xfrm>
+                    <a:prstGeom prst="rect"/>
+                  </pic:spPr>
+                </pic:pic>
+              </a:graphicData>
+            </a:graphic>
+          </wp:inline>
+        </w:drawing>
+      </w:r>
+    </w:p>
+    <w:p>
+      <w:r>
+        <w:rPr>
+          <w:b/>
+        </w:rPr>
         <w:t xml:space="preserve">Ideia central: </w:t>
       </w:r>
       <w:r>
@@ -4163,6 +4638,53 @@
         <w:rPr>
           <w:b/>
         </w:rPr>
+        <w:t>Mapa conceitual</w:t>
+      </w:r>
+    </w:p>
+    <w:p>
+      <w:pPr>
+        <w:jc w:val="center"/>
+      </w:pPr>
+      <w:r>
+        <w:drawing>
+          <wp:inline xmlns:a="http://schemas.openxmlformats.org/drawingml/2006/main" xmlns:pic="http://schemas.openxmlformats.org/drawingml/2006/picture">
+            <wp:extent cx="5903999" cy="2946096"/>
+            <wp:docPr id="11" name="Picture 11"/>
+            <wp:cNvGraphicFramePr>
+              <a:graphicFrameLocks noChangeAspect="1"/>
+            </wp:cNvGraphicFramePr>
+            <a:graphic>
+              <a:graphicData uri="http://schemas.openxmlformats.org/drawingml/2006/picture">
+                <pic:pic>
+                  <pic:nvPicPr>
+                    <pic:cNvPr id="0" name="mapa_14.png"/>
+                    <pic:cNvPicPr/>
+                  </pic:nvPicPr>
+                  <pic:blipFill>
+                    <a:blip r:embed="rId19"/>
+                    <a:stretch>
+                      <a:fillRect/>
+                    </a:stretch>
+                  </pic:blipFill>
+                  <pic:spPr>
+                    <a:xfrm>
+                      <a:off x="0" y="0"/>
+                      <a:ext cx="5903999" cy="2946096"/>
+                    </a:xfrm>
+                    <a:prstGeom prst="rect"/>
+                  </pic:spPr>
+                </pic:pic>
+              </a:graphicData>
+            </a:graphic>
+          </wp:inline>
+        </w:drawing>
+      </w:r>
+    </w:p>
+    <w:p>
+      <w:r>
+        <w:rPr>
+          <w:b/>
+        </w:rPr>
         <w:t xml:space="preserve">Ideia central: </w:t>
       </w:r>
       <w:r>
@@ -4478,6 +5000,53 @@
         <w:rPr>
           <w:b/>
         </w:rPr>
+        <w:t>Mapa conceitual</w:t>
+      </w:r>
+    </w:p>
+    <w:p>
+      <w:pPr>
+        <w:jc w:val="center"/>
+      </w:pPr>
+      <w:r>
+        <w:drawing>
+          <wp:inline xmlns:a="http://schemas.openxmlformats.org/drawingml/2006/main" xmlns:pic="http://schemas.openxmlformats.org/drawingml/2006/picture">
+            <wp:extent cx="5903999" cy="2804400"/>
+            <wp:docPr id="12" name="Picture 12"/>
+            <wp:cNvGraphicFramePr>
+              <a:graphicFrameLocks noChangeAspect="1"/>
+            </wp:cNvGraphicFramePr>
+            <a:graphic>
+              <a:graphicData uri="http://schemas.openxmlformats.org/drawingml/2006/picture">
+                <pic:pic>
+                  <pic:nvPicPr>
+                    <pic:cNvPr id="0" name="mapa_16.png"/>
+                    <pic:cNvPicPr/>
+                  </pic:nvPicPr>
+                  <pic:blipFill>
+                    <a:blip r:embed="rId20"/>
+                    <a:stretch>
+                      <a:fillRect/>
+                    </a:stretch>
+                  </pic:blipFill>
+                  <pic:spPr>
+                    <a:xfrm>
+                      <a:off x="0" y="0"/>
+                      <a:ext cx="5903999" cy="2804400"/>
+                    </a:xfrm>
+                    <a:prstGeom prst="rect"/>
+                  </pic:spPr>
+                </pic:pic>
+              </a:graphicData>
+            </a:graphic>
+          </wp:inline>
+        </w:drawing>
+      </w:r>
+    </w:p>
+    <w:p>
+      <w:r>
+        <w:rPr>
+          <w:b/>
+        </w:rPr>
         <w:t xml:space="preserve">Ideia central: </w:t>
       </w:r>
       <w:r>
@@ -4681,6 +5250,53 @@
         <w:rPr>
           <w:b/>
         </w:rPr>
+        <w:t>Mapa conceitual</w:t>
+      </w:r>
+    </w:p>
+    <w:p>
+      <w:pPr>
+        <w:jc w:val="center"/>
+      </w:pPr>
+      <w:r>
+        <w:drawing>
+          <wp:inline xmlns:a="http://schemas.openxmlformats.org/drawingml/2006/main" xmlns:pic="http://schemas.openxmlformats.org/drawingml/2006/picture">
+            <wp:extent cx="5903999" cy="2804400"/>
+            <wp:docPr id="13" name="Picture 13"/>
+            <wp:cNvGraphicFramePr>
+              <a:graphicFrameLocks noChangeAspect="1"/>
+            </wp:cNvGraphicFramePr>
+            <a:graphic>
+              <a:graphicData uri="http://schemas.openxmlformats.org/drawingml/2006/picture">
+                <pic:pic>
+                  <pic:nvPicPr>
+                    <pic:cNvPr id="0" name="mapa_17.png"/>
+                    <pic:cNvPicPr/>
+                  </pic:nvPicPr>
+                  <pic:blipFill>
+                    <a:blip r:embed="rId21"/>
+                    <a:stretch>
+                      <a:fillRect/>
+                    </a:stretch>
+                  </pic:blipFill>
+                  <pic:spPr>
+                    <a:xfrm>
+                      <a:off x="0" y="0"/>
+                      <a:ext cx="5903999" cy="2804400"/>
+                    </a:xfrm>
+                    <a:prstGeom prst="rect"/>
+                  </pic:spPr>
+                </pic:pic>
+              </a:graphicData>
+            </a:graphic>
+          </wp:inline>
+        </w:drawing>
+      </w:r>
+    </w:p>
+    <w:p>
+      <w:r>
+        <w:rPr>
+          <w:b/>
+        </w:rPr>
         <w:t xml:space="preserve">Ideia central: </w:t>
       </w:r>
       <w:r>
@@ -4989,6 +5605,53 @@
         <w:rPr>
           <w:b/>
         </w:rPr>
+        <w:t>Mapa conceitual</w:t>
+      </w:r>
+    </w:p>
+    <w:p>
+      <w:pPr>
+        <w:jc w:val="center"/>
+      </w:pPr>
+      <w:r>
+        <w:drawing>
+          <wp:inline xmlns:a="http://schemas.openxmlformats.org/drawingml/2006/main" xmlns:pic="http://schemas.openxmlformats.org/drawingml/2006/picture">
+            <wp:extent cx="5903999" cy="2739456"/>
+            <wp:docPr id="14" name="Picture 14"/>
+            <wp:cNvGraphicFramePr>
+              <a:graphicFrameLocks noChangeAspect="1"/>
+            </wp:cNvGraphicFramePr>
+            <a:graphic>
+              <a:graphicData uri="http://schemas.openxmlformats.org/drawingml/2006/picture">
+                <pic:pic>
+                  <pic:nvPicPr>
+                    <pic:cNvPr id="0" name="mapa_19.png"/>
+                    <pic:cNvPicPr/>
+                  </pic:nvPicPr>
+                  <pic:blipFill>
+                    <a:blip r:embed="rId22"/>
+                    <a:stretch>
+                      <a:fillRect/>
+                    </a:stretch>
+                  </pic:blipFill>
+                  <pic:spPr>
+                    <a:xfrm>
+                      <a:off x="0" y="0"/>
+                      <a:ext cx="5903999" cy="2739456"/>
+                    </a:xfrm>
+                    <a:prstGeom prst="rect"/>
+                  </pic:spPr>
+                </pic:pic>
+              </a:graphicData>
+            </a:graphic>
+          </wp:inline>
+        </w:drawing>
+      </w:r>
+    </w:p>
+    <w:p>
+      <w:r>
+        <w:rPr>
+          <w:b/>
+        </w:rPr>
         <w:t xml:space="preserve">Ideia central: </w:t>
       </w:r>
       <w:r>
@@ -5175,6 +5838,53 @@
         <w:rPr>
           <w:b/>
         </w:rPr>
+        <w:t>Mapa conceitual</w:t>
+      </w:r>
+    </w:p>
+    <w:p>
+      <w:pPr>
+        <w:jc w:val="center"/>
+      </w:pPr>
+      <w:r>
+        <w:drawing>
+          <wp:inline xmlns:a="http://schemas.openxmlformats.org/drawingml/2006/main" xmlns:pic="http://schemas.openxmlformats.org/drawingml/2006/picture">
+            <wp:extent cx="5903999" cy="2946096"/>
+            <wp:docPr id="15" name="Picture 15"/>
+            <wp:cNvGraphicFramePr>
+              <a:graphicFrameLocks noChangeAspect="1"/>
+            </wp:cNvGraphicFramePr>
+            <a:graphic>
+              <a:graphicData uri="http://schemas.openxmlformats.org/drawingml/2006/picture">
+                <pic:pic>
+                  <pic:nvPicPr>
+                    <pic:cNvPr id="0" name="mapa_20.png"/>
+                    <pic:cNvPicPr/>
+                  </pic:nvPicPr>
+                  <pic:blipFill>
+                    <a:blip r:embed="rId23"/>
+                    <a:stretch>
+                      <a:fillRect/>
+                    </a:stretch>
+                  </pic:blipFill>
+                  <pic:spPr>
+                    <a:xfrm>
+                      <a:off x="0" y="0"/>
+                      <a:ext cx="5903999" cy="2946096"/>
+                    </a:xfrm>
+                    <a:prstGeom prst="rect"/>
+                  </pic:spPr>
+                </pic:pic>
+              </a:graphicData>
+            </a:graphic>
+          </wp:inline>
+        </w:drawing>
+      </w:r>
+    </w:p>
+    <w:p>
+      <w:r>
+        <w:rPr>
+          <w:b/>
+        </w:rPr>
         <w:t xml:space="preserve">Ideia central: </w:t>
       </w:r>
       <w:r>
@@ -5375,6 +6085,53 @@
         <w:rPr>
           <w:b/>
         </w:rPr>
+        <w:t>Mapa conceitual</w:t>
+      </w:r>
+    </w:p>
+    <w:p>
+      <w:pPr>
+        <w:jc w:val="center"/>
+      </w:pPr>
+      <w:r>
+        <w:drawing>
+          <wp:inline xmlns:a="http://schemas.openxmlformats.org/drawingml/2006/main" xmlns:pic="http://schemas.openxmlformats.org/drawingml/2006/picture">
+            <wp:extent cx="5903999" cy="3861215"/>
+            <wp:docPr id="16" name="Picture 16"/>
+            <wp:cNvGraphicFramePr>
+              <a:graphicFrameLocks noChangeAspect="1"/>
+            </wp:cNvGraphicFramePr>
+            <a:graphic>
+              <a:graphicData uri="http://schemas.openxmlformats.org/drawingml/2006/picture">
+                <pic:pic>
+                  <pic:nvPicPr>
+                    <pic:cNvPr id="0" name="mapa_21.png"/>
+                    <pic:cNvPicPr/>
+                  </pic:nvPicPr>
+                  <pic:blipFill>
+                    <a:blip r:embed="rId24"/>
+                    <a:stretch>
+                      <a:fillRect/>
+                    </a:stretch>
+                  </pic:blipFill>
+                  <pic:spPr>
+                    <a:xfrm>
+                      <a:off x="0" y="0"/>
+                      <a:ext cx="5903999" cy="3861215"/>
+                    </a:xfrm>
+                    <a:prstGeom prst="rect"/>
+                  </pic:spPr>
+                </pic:pic>
+              </a:graphicData>
+            </a:graphic>
+          </wp:inline>
+        </w:drawing>
+      </w:r>
+    </w:p>
+    <w:p>
+      <w:r>
+        <w:rPr>
+          <w:b/>
+        </w:rPr>
         <w:t xml:space="preserve">Ideia central: </w:t>
       </w:r>
       <w:r>
@@ -5708,6 +6465,53 @@
         <w:rPr>
           <w:b/>
         </w:rPr>
+        <w:t>Mapa conceitual</w:t>
+      </w:r>
+    </w:p>
+    <w:p>
+      <w:pPr>
+        <w:jc w:val="center"/>
+      </w:pPr>
+      <w:r>
+        <w:drawing>
+          <wp:inline xmlns:a="http://schemas.openxmlformats.org/drawingml/2006/main" xmlns:pic="http://schemas.openxmlformats.org/drawingml/2006/picture">
+            <wp:extent cx="5903999" cy="2739456"/>
+            <wp:docPr id="17" name="Picture 17"/>
+            <wp:cNvGraphicFramePr>
+              <a:graphicFrameLocks noChangeAspect="1"/>
+            </wp:cNvGraphicFramePr>
+            <a:graphic>
+              <a:graphicData uri="http://schemas.openxmlformats.org/drawingml/2006/picture">
+                <pic:pic>
+                  <pic:nvPicPr>
+                    <pic:cNvPr id="0" name="mapa_23.png"/>
+                    <pic:cNvPicPr/>
+                  </pic:nvPicPr>
+                  <pic:blipFill>
+                    <a:blip r:embed="rId25"/>
+                    <a:stretch>
+                      <a:fillRect/>
+                    </a:stretch>
+                  </pic:blipFill>
+                  <pic:spPr>
+                    <a:xfrm>
+                      <a:off x="0" y="0"/>
+                      <a:ext cx="5903999" cy="2739456"/>
+                    </a:xfrm>
+                    <a:prstGeom prst="rect"/>
+                  </pic:spPr>
+                </pic:pic>
+              </a:graphicData>
+            </a:graphic>
+          </wp:inline>
+        </w:drawing>
+      </w:r>
+    </w:p>
+    <w:p>
+      <w:r>
+        <w:rPr>
+          <w:b/>
+        </w:rPr>
         <w:t xml:space="preserve">Ideia central: </w:t>
       </w:r>
       <w:r>
@@ -5931,6 +6735,53 @@
         <w:rPr>
           <w:b/>
         </w:rPr>
+        <w:t>Mapa conceitual</w:t>
+      </w:r>
+    </w:p>
+    <w:p>
+      <w:pPr>
+        <w:jc w:val="center"/>
+      </w:pPr>
+      <w:r>
+        <w:drawing>
+          <wp:inline xmlns:a="http://schemas.openxmlformats.org/drawingml/2006/main" xmlns:pic="http://schemas.openxmlformats.org/drawingml/2006/picture">
+            <wp:extent cx="5903999" cy="2456064"/>
+            <wp:docPr id="18" name="Picture 18"/>
+            <wp:cNvGraphicFramePr>
+              <a:graphicFrameLocks noChangeAspect="1"/>
+            </wp:cNvGraphicFramePr>
+            <a:graphic>
+              <a:graphicData uri="http://schemas.openxmlformats.org/drawingml/2006/picture">
+                <pic:pic>
+                  <pic:nvPicPr>
+                    <pic:cNvPr id="0" name="mapa_24.png"/>
+                    <pic:cNvPicPr/>
+                  </pic:nvPicPr>
+                  <pic:blipFill>
+                    <a:blip r:embed="rId26"/>
+                    <a:stretch>
+                      <a:fillRect/>
+                    </a:stretch>
+                  </pic:blipFill>
+                  <pic:spPr>
+                    <a:xfrm>
+                      <a:off x="0" y="0"/>
+                      <a:ext cx="5903999" cy="2456064"/>
+                    </a:xfrm>
+                    <a:prstGeom prst="rect"/>
+                  </pic:spPr>
+                </pic:pic>
+              </a:graphicData>
+            </a:graphic>
+          </wp:inline>
+        </w:drawing>
+      </w:r>
+    </w:p>
+    <w:p>
+      <w:r>
+        <w:rPr>
+          <w:b/>
+        </w:rPr>
         <w:t xml:space="preserve">Ideia central: </w:t>
       </w:r>
       <w:r>
@@ -6143,6 +6994,53 @@
         <w:rPr>
           <w:b/>
         </w:rPr>
+        <w:t>Mapa conceitual</w:t>
+      </w:r>
+    </w:p>
+    <w:p>
+      <w:pPr>
+        <w:jc w:val="center"/>
+      </w:pPr>
+      <w:r>
+        <w:drawing>
+          <wp:inline xmlns:a="http://schemas.openxmlformats.org/drawingml/2006/main" xmlns:pic="http://schemas.openxmlformats.org/drawingml/2006/picture">
+            <wp:extent cx="5903999" cy="2456064"/>
+            <wp:docPr id="19" name="Picture 19"/>
+            <wp:cNvGraphicFramePr>
+              <a:graphicFrameLocks noChangeAspect="1"/>
+            </wp:cNvGraphicFramePr>
+            <a:graphic>
+              <a:graphicData uri="http://schemas.openxmlformats.org/drawingml/2006/picture">
+                <pic:pic>
+                  <pic:nvPicPr>
+                    <pic:cNvPr id="0" name="mapa_25.png"/>
+                    <pic:cNvPicPr/>
+                  </pic:nvPicPr>
+                  <pic:blipFill>
+                    <a:blip r:embed="rId27"/>
+                    <a:stretch>
+                      <a:fillRect/>
+                    </a:stretch>
+                  </pic:blipFill>
+                  <pic:spPr>
+                    <a:xfrm>
+                      <a:off x="0" y="0"/>
+                      <a:ext cx="5903999" cy="2456064"/>
+                    </a:xfrm>
+                    <a:prstGeom prst="rect"/>
+                  </pic:spPr>
+                </pic:pic>
+              </a:graphicData>
+            </a:graphic>
+          </wp:inline>
+        </w:drawing>
+      </w:r>
+    </w:p>
+    <w:p>
+      <w:r>
+        <w:rPr>
+          <w:b/>
+        </w:rPr>
         <w:t xml:space="preserve">Ideia central: </w:t>
       </w:r>
       <w:r>
@@ -6354,6 +7252,53 @@
         <w:rPr>
           <w:b/>
         </w:rPr>
+        <w:t>Mapa conceitual</w:t>
+      </w:r>
+    </w:p>
+    <w:p>
+      <w:pPr>
+        <w:jc w:val="center"/>
+      </w:pPr>
+      <w:r>
+        <w:drawing>
+          <wp:inline xmlns:a="http://schemas.openxmlformats.org/drawingml/2006/main" xmlns:pic="http://schemas.openxmlformats.org/drawingml/2006/picture">
+            <wp:extent cx="5903999" cy="3011039"/>
+            <wp:docPr id="20" name="Picture 20"/>
+            <wp:cNvGraphicFramePr>
+              <a:graphicFrameLocks noChangeAspect="1"/>
+            </wp:cNvGraphicFramePr>
+            <a:graphic>
+              <a:graphicData uri="http://schemas.openxmlformats.org/drawingml/2006/picture">
+                <pic:pic>
+                  <pic:nvPicPr>
+                    <pic:cNvPr id="0" name="mapa_26.png"/>
+                    <pic:cNvPicPr/>
+                  </pic:nvPicPr>
+                  <pic:blipFill>
+                    <a:blip r:embed="rId28"/>
+                    <a:stretch>
+                      <a:fillRect/>
+                    </a:stretch>
+                  </pic:blipFill>
+                  <pic:spPr>
+                    <a:xfrm>
+                      <a:off x="0" y="0"/>
+                      <a:ext cx="5903999" cy="3011039"/>
+                    </a:xfrm>
+                    <a:prstGeom prst="rect"/>
+                  </pic:spPr>
+                </pic:pic>
+              </a:graphicData>
+            </a:graphic>
+          </wp:inline>
+        </w:drawing>
+      </w:r>
+    </w:p>
+    <w:p>
+      <w:r>
+        <w:rPr>
+          <w:b/>
+        </w:rPr>
         <w:t xml:space="preserve">Ideia central: </w:t>
       </w:r>
       <w:r>
@@ -6505,6 +7450,53 @@
       </w:pPr>
       <w:r>
         <w:t>Estudo dirigido</w:t>
+      </w:r>
+    </w:p>
+    <w:p>
+      <w:r>
+        <w:rPr>
+          <w:b/>
+        </w:rPr>
+        <w:t>Mapa conceitual</w:t>
+      </w:r>
+    </w:p>
+    <w:p>
+      <w:pPr>
+        <w:jc w:val="center"/>
+      </w:pPr>
+      <w:r>
+        <w:drawing>
+          <wp:inline xmlns:a="http://schemas.openxmlformats.org/drawingml/2006/main" xmlns:pic="http://schemas.openxmlformats.org/drawingml/2006/picture">
+            <wp:extent cx="5903999" cy="2249424"/>
+            <wp:docPr id="21" name="Picture 21"/>
+            <wp:cNvGraphicFramePr>
+              <a:graphicFrameLocks noChangeAspect="1"/>
+            </wp:cNvGraphicFramePr>
+            <a:graphic>
+              <a:graphicData uri="http://schemas.openxmlformats.org/drawingml/2006/picture">
+                <pic:pic>
+                  <pic:nvPicPr>
+                    <pic:cNvPr id="0" name="mapa_27.png"/>
+                    <pic:cNvPicPr/>
+                  </pic:nvPicPr>
+                  <pic:blipFill>
+                    <a:blip r:embed="rId29"/>
+                    <a:stretch>
+                      <a:fillRect/>
+                    </a:stretch>
+                  </pic:blipFill>
+                  <pic:spPr>
+                    <a:xfrm>
+                      <a:off x="0" y="0"/>
+                      <a:ext cx="5903999" cy="2249424"/>
+                    </a:xfrm>
+                    <a:prstGeom prst="rect"/>
+                  </pic:spPr>
+                </pic:pic>
+              </a:graphicData>
+            </a:graphic>
+          </wp:inline>
+        </w:drawing>
       </w:r>
     </w:p>
     <w:p>

</xml_diff>

<commit_message>
Transforma o slide 4 em infográfico da questão de pesquisa e atualiza fala, mapa e estudo dirigido
Co-Authored-By: Claude Opus 5.5 <noreply@anthropic.com>
Claude-Session: https://claude.ai/code/session_01HxStpW4pQoDfJdTDYr6zEC
</commit_message>
<xml_diff>
--- a/apresentacao_qualificacao/ROTEIRO_E_ESTUDO_DIRIGIDO.docx
+++ b/apresentacao_qualificacao/ROTEIRO_E_ESTUDO_DIRIGIDO.docx
@@ -52,7 +52,7 @@
         <w:pStyle w:val="ListBullet"/>
       </w:pPr>
       <w:r>
-        <w:t>A fala soma 2893 palavras, cerca de 23 minutos a 125 palavras por minuto, ritmo pausado. O restante dos 25 minutos fica para trocas de slide, pausas e o tempo de apontar fotos e mapa.</w:t>
+        <w:t>A fala soma 2928 palavras, cerca de 23 minutos a 125 palavras por minuto, ritmo pausado. O restante dos 25 minutos fica para trocas de slide, pausas e o tempo de apontar fotos e mapa.</w:t>
       </w:r>
     </w:p>
     <w:p>
@@ -60,7 +60,7 @@
         <w:pStyle w:val="ListBullet"/>
       </w:pPr>
       <w:r>
-        <w:t>Pontos de controle: fim do slide 10 por volta de 09:10; fim do slide 17 por volta de 15:25; fim do slide 25 por volta de 22:10.</w:t>
+        <w:t>Pontos de controle: fim do slide 10 por volta de 09:15; fim do slide 17 por volta de 15:25; fim do slide 25 por volta de 22:10.</w:t>
       </w:r>
     </w:p>
     <w:p>
@@ -238,7 +238,7 @@
           </w:tcPr>
           <w:p>
             <w:r>
-              <w:t>05:45</w:t>
+              <w:t>05:50</w:t>
             </w:r>
           </w:p>
         </w:tc>
@@ -248,7 +248,7 @@
           </w:tcPr>
           <w:p>
             <w:r>
-              <w:t>06:40</w:t>
+              <w:t>06:45</w:t>
             </w:r>
           </w:p>
         </w:tc>
@@ -290,7 +290,7 @@
           </w:tcPr>
           <w:p>
             <w:r>
-              <w:t>09:10</w:t>
+              <w:t>09:15</w:t>
             </w:r>
           </w:p>
         </w:tc>
@@ -322,7 +322,7 @@
           </w:tcPr>
           <w:p>
             <w:r>
-              <w:t>04:15</w:t>
+              <w:t>04:10</w:t>
             </w:r>
           </w:p>
         </w:tc>
@@ -2454,7 +2454,7 @@
           <w:color w:val="555555"/>
           <w:sz w:val="20"/>
         </w:rPr>
-        <w:t>60 s  ·  ao final: 02:55</w:t>
+        <w:t>70 s  ·  ao final: 03:05</w:t>
       </w:r>
     </w:p>
     <w:p>
@@ -2463,7 +2463,7 @@
           <w:i/>
           <w:color w:val="555555"/>
         </w:rPr>
-        <w:t>[Ler a pergunta devagar, acompanhando a lâmina. Pausa antes da última frase.]</w:t>
+        <w:t>[Seguir o infográfico da esquerda para a direita, apontando cada cartão; a pergunta completa fica no alto para a banca. Pausa no cartão da resistência.]</w:t>
       </w:r>
     </w:p>
     <w:tbl>
@@ -2491,7 +2491,7 @@
               <w:rPr>
                 <w:sz w:val="24"/>
               </w:rPr>
-              <w:t>Daí a questão que orienta a pesquisa. Como a Política Nacional de Educação Digital é recontextualizada pela Secretaria Municipal de Educação de Tibau do Sul, num território que reúne áreas urbanas e rurais, povoados com realidades distintas e uma comunidade quilombola, e como essa recontextualização chega à Escola Municipal Domitila Castelo da Silva, em Pipa, onde os profissionais a encenam, atravessados pelas culturas profissionais, pelas condições materiais e institucionais da escola e pelas especificidades do lugar? Ainda não sabemos se a PNED será acolhida, adaptada, posta de lado ou contestada. A resistência, que está no título, é uma possibilidade a examinar nos dados.</w:t>
+              <w:t>Daí a questão que orienta a pesquisa, que leio seguindo o infográfico. A Política Nacional de Educação Digital é recontextualizada pela Secretaria Municipal de Educação, que a traduz para um território diverso, com sede, áreas rurais, povoados e uma comunidade quilombola. Essa tradução chega à Escola Municipal Domitila Castelo da Silva, em Pipa, onde os profissionais a encenam, atravessados pelas culturas profissionais, pelas condições materiais e institucionais da escola e pelas especificidades do lugar. Desse encontro saem formas de atuação: acomodações, negociações, ressignificações e, talvez, resistências. A resistência, que está no título, é uma possibilidade a examinar nos dados, sem ser pressuposta. As atuações são coletivas, criativas e limitadas. E, com Stuart Hall, numa aproximação que é nossa, entendo que os sentidos organizam as ações; por isso, as narrativas dos profissionais ocupam o centro da produção de dados.</w:t>
             </w:r>
           </w:p>
         </w:tc>
@@ -2525,7 +2525,7 @@
       <w:r>
         <w:drawing>
           <wp:inline xmlns:a="http://schemas.openxmlformats.org/drawingml/2006/main" xmlns:pic="http://schemas.openxmlformats.org/drawingml/2006/picture">
-            <wp:extent cx="5903999" cy="2739456"/>
+            <wp:extent cx="5903999" cy="3719519"/>
             <wp:docPr id="3" name="Picture 3"/>
             <wp:cNvGraphicFramePr>
               <a:graphicFrameLocks noChangeAspect="1"/>
@@ -2546,7 +2546,7 @@
                   <pic:spPr>
                     <a:xfrm>
                       <a:off x="0" y="0"/>
-                      <a:ext cx="5903999" cy="2739456"/>
+                      <a:ext cx="5903999" cy="3719519"/>
                     </a:xfrm>
                     <a:prstGeom prst="rect"/>
                   </pic:spPr>
@@ -2565,7 +2565,7 @@
         <w:t xml:space="preserve">Ideia central: </w:t>
       </w:r>
       <w:r>
-        <w:t>Pergunta como a PNED é encenada e recontextualizada e como culturas profissionais, condições da escola e território atravessam esse processo, produzindo formas de atuação.</w:t>
+        <w:t>A questão em cadeia, como no infográfico: a PNED é recontextualizada pela SME para um território diverso, encenada na escola de Pipa, atravessada por culturas profissionais, condições e lugar, e produz formas de atuação; a resistência fica como hipótese.</w:t>
       </w:r>
     </w:p>
     <w:p>
@@ -2626,21 +2626,35 @@
         <w:rPr>
           <w:b/>
         </w:rPr>
-        <w:t xml:space="preserve">Citação opcional de Hall: </w:t>
-      </w:r>
-      <w:r>
-        <w:t>"devem aprender a habitar, no mínimo, duas identidades, a falar duas linguagens culturais, a traduzir e a negociar entre elas" (HALL, 2006, p. 89). Hall trata de diáspora, não de política educacional: a aproximação com a encenação é nossa e precisa ser dita.</w:t>
-      </w:r>
-    </w:p>
-    <w:p>
+        <w:t xml:space="preserve">Sentidos organizam ações (Hall): </w:t>
+      </w:r>
+      <w:r>
+        <w:t>No slide: um discurso é "um modo de construir sentidos que influencia e organiza tanto nossas ações quanto a concepção que temos de nós mesmos" (HALL, 2006, p. 50-51). Hall trata de cultura nacional, não de política educacional: a aproximação é nossa e precisa ser dita. Daí a decisão de pôr as narrativas dos profissionais no centro da produção de dados.</w:t>
+      </w:r>
+    </w:p>
+    <w:p>
+      <w:pPr>
+        <w:pStyle w:val="ListBullet"/>
+      </w:pPr>
       <w:r>
         <w:rPr>
           <w:b/>
         </w:rPr>
+        <w:t xml:space="preserve">Alternativa de Hall: </w:t>
+      </w:r>
+      <w:r>
+        <w:t>"devem aprender a habitar, no mínimo, duas identidades, a falar duas linguagens culturais, a traduzir e a negociar entre elas" (HALL, 2006, p. 89), mais próxima de tradução e negociação.</w:t>
+      </w:r>
+    </w:p>
+    <w:p>
+      <w:r>
+        <w:rPr>
+          <w:b/>
+        </w:rPr>
         <w:t xml:space="preserve">Autores e obras: </w:t>
       </w:r>
       <w:r>
-        <w:t>Bowe, Ball e Gold (1992, p. 22); Ball, Maguire e Braun (2016, p. 14): as políticas "raramente ditam ou determinam a prática"; Hall (2006, p. 89), se a citação for usada.</w:t>
+        <w:t>Bowe, Ball e Gold (1992, p. 22); Ball, Maguire e Braun (2016, p. 14): as políticas "raramente ditam ou determinam a prática"; Hall (2006, p. 50-51; p. 89 como alternativa).</w:t>
       </w:r>
     </w:p>
     <w:p>
@@ -2671,6 +2685,17 @@
           <w:i/>
         </w:rPr>
         <w:t>O que garante que a pesquisa não "encontre" a resistência que procura? (critérios datados e assinados antes da 1ª entrevista, cap. 4, 4.3.1).</w:t>
+      </w:r>
+    </w:p>
+    <w:p>
+      <w:pPr>
+        <w:pStyle w:val="ListBullet"/>
+      </w:pPr>
+      <w:r>
+        <w:rPr>
+          <w:i/>
+        </w:rPr>
+        <w:t>Por que um autor dos estudos culturais na questão de uma tese de política educacional? (sentidos organizam ações; por isso, as narrativas no centro; aproximação declarada).</w:t>
       </w:r>
     </w:p>
     <w:p>
@@ -2687,7 +2712,7 @@
           <w:color w:val="555555"/>
           <w:sz w:val="20"/>
         </w:rPr>
-        <w:t>105 s  ·  ao final: 04:40</w:t>
+        <w:t>105 s  ·  ao final: 04:50</w:t>
       </w:r>
     </w:p>
     <w:p>
@@ -2945,7 +2970,7 @@
           <w:color w:val="555555"/>
           <w:sz w:val="20"/>
         </w:rPr>
-        <w:t>60 s  ·  ao final: 05:40</w:t>
+        <w:t>60 s  ·  ao final: 05:50</w:t>
       </w:r>
     </w:p>
     <w:tbl>
@@ -3169,7 +3194,7 @@
           <w:color w:val="555555"/>
           <w:sz w:val="20"/>
         </w:rPr>
-        <w:t>60 s  ·  ao final: 06:40</w:t>
+        <w:t>55 s  ·  ao final: 06:45</w:t>
       </w:r>
     </w:p>
     <w:tbl>
@@ -3406,7 +3431,7 @@
           <w:color w:val="555555"/>
           <w:sz w:val="20"/>
         </w:rPr>
-        <w:t>10 s  ·  ao final: 06:50</w:t>
+        <w:t>10 s  ·  ao final: 06:55</w:t>
       </w:r>
     </w:p>
     <w:tbl>
@@ -3489,7 +3514,7 @@
           <w:color w:val="555555"/>
           <w:sz w:val="20"/>
         </w:rPr>
-        <w:t>60 s  ·  ao final: 07:50</w:t>
+        <w:t>60 s  ·  ao final: 07:55</w:t>
       </w:r>
     </w:p>
     <w:tbl>
@@ -3738,7 +3763,7 @@
           <w:color w:val="555555"/>
           <w:sz w:val="20"/>
         </w:rPr>
-        <w:t>80 s  ·  ao final: 09:10</w:t>
+        <w:t>80 s  ·  ao final: 09:15</w:t>
       </w:r>
     </w:p>
     <w:p>
@@ -3956,7 +3981,7 @@
           <w:color w:val="555555"/>
           <w:sz w:val="20"/>
         </w:rPr>
-        <w:t>10 s  ·  ao final: 09:20</w:t>
+        <w:t>10 s  ·  ao final: 09:25</w:t>
       </w:r>
     </w:p>
     <w:tbl>
@@ -4039,7 +4064,7 @@
           <w:color w:val="555555"/>
           <w:sz w:val="20"/>
         </w:rPr>
-        <w:t>85 s  ·  ao final: 10:45</w:t>
+        <w:t>85 s  ·  ao final: 10:50</w:t>
       </w:r>
     </w:p>
     <w:p>
@@ -4325,7 +4350,7 @@
           <w:color w:val="555555"/>
           <w:sz w:val="20"/>
         </w:rPr>
-        <w:t>80 s  ·  ao final: 12:05</w:t>
+        <w:t>80 s  ·  ao final: 12:10</w:t>
       </w:r>
     </w:p>
     <w:tbl>
@@ -4577,7 +4602,7 @@
           <w:color w:val="555555"/>
           <w:sz w:val="20"/>
         </w:rPr>
-        <w:t>80 s  ·  ao final: 13:25</w:t>
+        <w:t>75 s  ·  ao final: 13:25</w:t>
       </w:r>
     </w:p>
     <w:p>

</xml_diff>

<commit_message>
Encerra a apresentação com frase autoral sobre habitar o digital em Pipa
Co-Authored-By: Claude Opus 5.5 <noreply@anthropic.com>
Claude-Session: https://claude.ai/code/session_01HxStpW4pQoDfJdTDYr6zEC
</commit_message>
<xml_diff>
--- a/apresentacao_qualificacao/ROTEIRO_E_ESTUDO_DIRIGIDO.docx
+++ b/apresentacao_qualificacao/ROTEIRO_E_ESTUDO_DIRIGIDO.docx
@@ -52,7 +52,7 @@
         <w:pStyle w:val="ListBullet"/>
       </w:pPr>
       <w:r>
-        <w:t>A fala soma 2928 palavras, cerca de 23 minutos a 125 palavras por minuto, ritmo pausado. O restante dos 25 minutos fica para trocas de slide, pausas e o tempo de apontar fotos e mapa.</w:t>
+        <w:t>A fala soma 2989 palavras, cerca de 24 minutos a 125 palavras por minuto, ritmo pausado. O restante dos 25 minutos fica para trocas de slide, pausas e o tempo de apontar fotos e mapa.</w:t>
       </w:r>
     </w:p>
     <w:p>
@@ -60,7 +60,7 @@
         <w:pStyle w:val="ListBullet"/>
       </w:pPr>
       <w:r>
-        <w:t>Pontos de controle: fim do slide 10 por volta de 09:15; fim do slide 17 por volta de 15:25; fim do slide 25 por volta de 22:10.</w:t>
+        <w:t>Pontos de controle: fim do slide 10 por volta de 09:10; fim do slide 17 por volta de 15:15; fim do slide 25 por volta de 21:55.</w:t>
       </w:r>
     </w:p>
     <w:p>
@@ -238,7 +238,7 @@
           </w:tcPr>
           <w:p>
             <w:r>
-              <w:t>05:50</w:t>
+              <w:t>05:45</w:t>
             </w:r>
           </w:p>
         </w:tc>
@@ -248,7 +248,7 @@
           </w:tcPr>
           <w:p>
             <w:r>
-              <w:t>06:45</w:t>
+              <w:t>06:40</w:t>
             </w:r>
           </w:p>
         </w:tc>
@@ -290,7 +290,7 @@
           </w:tcPr>
           <w:p>
             <w:r>
-              <w:t>09:15</w:t>
+              <w:t>09:10</w:t>
             </w:r>
           </w:p>
         </w:tc>
@@ -332,7 +332,7 @@
           </w:tcPr>
           <w:p>
             <w:r>
-              <w:t>13:25</w:t>
+              <w:t>13:20</w:t>
             </w:r>
           </w:p>
         </w:tc>
@@ -364,7 +364,7 @@
           </w:tcPr>
           <w:p>
             <w:r>
-              <w:t>02:00</w:t>
+              <w:t>01:55</w:t>
             </w:r>
           </w:p>
         </w:tc>
@@ -374,7 +374,7 @@
           </w:tcPr>
           <w:p>
             <w:r>
-              <w:t>15:25</w:t>
+              <w:t>15:15</w:t>
             </w:r>
           </w:p>
         </w:tc>
@@ -416,7 +416,7 @@
           </w:tcPr>
           <w:p>
             <w:r>
-              <w:t>19:15</w:t>
+              <w:t>19:05</w:t>
             </w:r>
           </w:p>
         </w:tc>
@@ -448,7 +448,7 @@
           </w:tcPr>
           <w:p>
             <w:r>
-              <w:t>02:55</w:t>
+              <w:t>02:50</w:t>
             </w:r>
           </w:p>
         </w:tc>
@@ -458,7 +458,7 @@
           </w:tcPr>
           <w:p>
             <w:r>
-              <w:t>22:10</w:t>
+              <w:t>21:55</w:t>
             </w:r>
           </w:p>
         </w:tc>
@@ -490,7 +490,7 @@
           </w:tcPr>
           <w:p>
             <w:r>
-              <w:t>02:50</w:t>
+              <w:t>03:05</w:t>
             </w:r>
           </w:p>
         </w:tc>
@@ -2218,7 +2218,7 @@
           <w:color w:val="555555"/>
           <w:sz w:val="20"/>
         </w:rPr>
-        <w:t>60 s  ·  ao final: 01:55</w:t>
+        <w:t>55 s  ·  ao final: 01:50</w:t>
       </w:r>
     </w:p>
     <w:tbl>
@@ -2454,7 +2454,7 @@
           <w:color w:val="555555"/>
           <w:sz w:val="20"/>
         </w:rPr>
-        <w:t>70 s  ·  ao final: 03:05</w:t>
+        <w:t>70 s  ·  ao final: 03:00</w:t>
       </w:r>
     </w:p>
     <w:p>
@@ -2712,7 +2712,7 @@
           <w:color w:val="555555"/>
           <w:sz w:val="20"/>
         </w:rPr>
-        <w:t>105 s  ·  ao final: 04:50</w:t>
+        <w:t>105 s  ·  ao final: 04:45</w:t>
       </w:r>
     </w:p>
     <w:p>
@@ -2970,7 +2970,7 @@
           <w:color w:val="555555"/>
           <w:sz w:val="20"/>
         </w:rPr>
-        <w:t>60 s  ·  ao final: 05:50</w:t>
+        <w:t>60 s  ·  ao final: 05:45</w:t>
       </w:r>
     </w:p>
     <w:tbl>
@@ -3194,7 +3194,7 @@
           <w:color w:val="555555"/>
           <w:sz w:val="20"/>
         </w:rPr>
-        <w:t>55 s  ·  ao final: 06:45</w:t>
+        <w:t>55 s  ·  ao final: 06:40</w:t>
       </w:r>
     </w:p>
     <w:tbl>
@@ -3431,7 +3431,7 @@
           <w:color w:val="555555"/>
           <w:sz w:val="20"/>
         </w:rPr>
-        <w:t>10 s  ·  ao final: 06:55</w:t>
+        <w:t>10 s  ·  ao final: 06:50</w:t>
       </w:r>
     </w:p>
     <w:tbl>
@@ -3514,7 +3514,7 @@
           <w:color w:val="555555"/>
           <w:sz w:val="20"/>
         </w:rPr>
-        <w:t>60 s  ·  ao final: 07:55</w:t>
+        <w:t>60 s  ·  ao final: 07:50</w:t>
       </w:r>
     </w:p>
     <w:tbl>
@@ -3763,7 +3763,7 @@
           <w:color w:val="555555"/>
           <w:sz w:val="20"/>
         </w:rPr>
-        <w:t>80 s  ·  ao final: 09:15</w:t>
+        <w:t>80 s  ·  ao final: 09:10</w:t>
       </w:r>
     </w:p>
     <w:p>
@@ -3981,7 +3981,7 @@
           <w:color w:val="555555"/>
           <w:sz w:val="20"/>
         </w:rPr>
-        <w:t>10 s  ·  ao final: 09:25</w:t>
+        <w:t>10 s  ·  ao final: 09:20</w:t>
       </w:r>
     </w:p>
     <w:tbl>
@@ -4064,7 +4064,7 @@
           <w:color w:val="555555"/>
           <w:sz w:val="20"/>
         </w:rPr>
-        <w:t>85 s  ·  ao final: 10:50</w:t>
+        <w:t>85 s  ·  ao final: 10:45</w:t>
       </w:r>
     </w:p>
     <w:p>
@@ -4350,7 +4350,7 @@
           <w:color w:val="555555"/>
           <w:sz w:val="20"/>
         </w:rPr>
-        <w:t>80 s  ·  ao final: 12:10</w:t>
+        <w:t>80 s  ·  ao final: 12:05</w:t>
       </w:r>
     </w:p>
     <w:tbl>
@@ -4602,7 +4602,7 @@
           <w:color w:val="555555"/>
           <w:sz w:val="20"/>
         </w:rPr>
-        <w:t>75 s  ·  ao final: 13:25</w:t>
+        <w:t>75 s  ·  ao final: 13:20</w:t>
       </w:r>
     </w:p>
     <w:p>
@@ -4890,7 +4890,7 @@
           <w:color w:val="555555"/>
           <w:sz w:val="20"/>
         </w:rPr>
-        <w:t>10 s  ·  ao final: 13:35</w:t>
+        <w:t>10 s  ·  ao final: 13:30</w:t>
       </w:r>
     </w:p>
     <w:tbl>
@@ -4973,7 +4973,7 @@
           <w:color w:val="555555"/>
           <w:sz w:val="20"/>
         </w:rPr>
-        <w:t>55 s  ·  ao final: 14:30</w:t>
+        <w:t>50 s  ·  ao final: 14:20</w:t>
       </w:r>
     </w:p>
     <w:tbl>
@@ -5223,7 +5223,7 @@
           <w:color w:val="555555"/>
           <w:sz w:val="20"/>
         </w:rPr>
-        <w:t>55 s  ·  ao final: 15:25</w:t>
+        <w:t>55 s  ·  ao final: 15:15</w:t>
       </w:r>
     </w:p>
     <w:tbl>
@@ -5486,7 +5486,7 @@
           <w:color w:val="555555"/>
           <w:sz w:val="20"/>
         </w:rPr>
-        <w:t>10 s  ·  ao final: 15:35</w:t>
+        <w:t>10 s  ·  ao final: 15:25</w:t>
       </w:r>
     </w:p>
     <w:tbl>
@@ -5569,7 +5569,7 @@
           <w:color w:val="555555"/>
           <w:sz w:val="20"/>
         </w:rPr>
-        <w:t>65 s  ·  ao final: 16:40</w:t>
+        <w:t>65 s  ·  ao final: 16:30</w:t>
       </w:r>
     </w:p>
     <w:p>
@@ -5802,7 +5802,7 @@
           <w:color w:val="555555"/>
           <w:sz w:val="20"/>
         </w:rPr>
-        <w:t>70 s  ·  ao final: 17:50</w:t>
+        <w:t>70 s  ·  ao final: 17:40</w:t>
       </w:r>
     </w:p>
     <w:p>
@@ -6049,7 +6049,7 @@
           <w:color w:val="555555"/>
           <w:sz w:val="20"/>
         </w:rPr>
-        <w:t>85 s  ·  ao final: 19:15</w:t>
+        <w:t>85 s  ·  ao final: 19:05</w:t>
       </w:r>
     </w:p>
     <w:p>
@@ -6346,7 +6346,7 @@
           <w:color w:val="555555"/>
           <w:sz w:val="20"/>
         </w:rPr>
-        <w:t>10 s  ·  ao final: 19:25</w:t>
+        <w:t>10 s  ·  ao final: 19:15</w:t>
       </w:r>
     </w:p>
     <w:tbl>
@@ -6429,7 +6429,7 @@
           <w:color w:val="555555"/>
           <w:sz w:val="20"/>
         </w:rPr>
-        <w:t>70 s  ·  ao final: 20:35</w:t>
+        <w:t>65 s  ·  ao final: 20:20</w:t>
       </w:r>
     </w:p>
     <w:p>
@@ -6699,7 +6699,7 @@
           <w:color w:val="555555"/>
           <w:sz w:val="20"/>
         </w:rPr>
-        <w:t>45 s  ·  ao final: 21:20</w:t>
+        <w:t>45 s  ·  ao final: 21:05</w:t>
       </w:r>
     </w:p>
     <w:p>
@@ -6958,7 +6958,7 @@
           <w:color w:val="555555"/>
           <w:sz w:val="20"/>
         </w:rPr>
-        <w:t>50 s  ·  ao final: 22:10</w:t>
+        <w:t>50 s  ·  ao final: 21:55</w:t>
       </w:r>
     </w:p>
     <w:p>
@@ -7216,7 +7216,7 @@
           <w:color w:val="555555"/>
           <w:sz w:val="20"/>
         </w:rPr>
-        <w:t>85 s  ·  ao final: 23:35</w:t>
+        <w:t>80 s  ·  ao final: 23:15</w:t>
       </w:r>
     </w:p>
     <w:p>
@@ -7421,7 +7421,7 @@
           <w:color w:val="555555"/>
           <w:sz w:val="20"/>
         </w:rPr>
-        <w:t>70 s  ·  ao final: 24:45</w:t>
+        <w:t>65 s  ·  ao final: 24:20</w:t>
       </w:r>
     </w:p>
     <w:p>
@@ -7638,7 +7638,16 @@
           <w:color w:val="555555"/>
           <w:sz w:val="20"/>
         </w:rPr>
-        <w:t>15 s  ·  ao final: 25:00</w:t>
+        <w:t>40 s  ·  ao final: 25:00</w:t>
+      </w:r>
+    </w:p>
+    <w:p>
+      <w:r>
+        <w:rPr>
+          <w:i/>
+          <w:color w:val="555555"/>
+        </w:rPr>
+        <w:t>[Dizer a frase devagar, olhando para a banca; pausa antes de "Agradeço".]</w:t>
       </w:r>
     </w:p>
     <w:tbl>
@@ -7666,7 +7675,7 @@
               <w:rPr>
                 <w:sz w:val="24"/>
               </w:rPr>
-              <w:t>Agradeço a atenção e fico à disposição para ouvir as considerações da banca, que vão ajudar a tornar esta pesquisa mais consistente.</w:t>
+              <w:t>Encerro com uma frase que define esta pesquisa. Se habitar é estar presente e em relação, habitar o digital depende de condições que o território distribui de modo desigual. Em Pipa, é na escola que essa desigualdade ganha corpo e idade, e é dali que esta pesquisa pergunta quem pode, de fato, habitar o mundo que a lei promete às crianças. Agradeço a atenção e fico à disposição para ouvir as considerações da banca, que vão ajudar a tornar esta pesquisa mais consistente.</w:t>
             </w:r>
           </w:p>
         </w:tc>
@@ -7676,6 +7685,116 @@
       <w:pPr>
         <w:spacing w:after="0"/>
       </w:pPr>
+    </w:p>
+    <w:p>
+      <w:pPr>
+        <w:pStyle w:val="Heading3"/>
+      </w:pPr>
+      <w:r>
+        <w:t>Estudo dirigido</w:t>
+      </w:r>
+    </w:p>
+    <w:p>
+      <w:r>
+        <w:rPr>
+          <w:b/>
+        </w:rPr>
+        <w:t xml:space="preserve">Ideia central: </w:t>
+      </w:r>
+      <w:r>
+        <w:t>Frase de encerramento, autoral, que retoma a formulação habitar o digital.</w:t>
+      </w:r>
+    </w:p>
+    <w:p>
+      <w:r>
+        <w:rPr>
+          <w:b/>
+        </w:rPr>
+        <w:t>Conceitos</w:t>
+      </w:r>
+    </w:p>
+    <w:p>
+      <w:pPr>
+        <w:pStyle w:val="ListBullet"/>
+      </w:pPr>
+      <w:r>
+        <w:rPr>
+          <w:b/>
+        </w:rPr>
+        <w:t xml:space="preserve">Habitar como presença e relação: </w:t>
+      </w:r>
+      <w:r>
+        <w:t>A frase ecoa Schlemmer, Backes e Palagi (2021, p. 15): habitar "tem o significado de estar presente" e tem "natureza relacional". Se a banca perguntar, a origem é essa.</w:t>
+      </w:r>
+    </w:p>
+    <w:p>
+      <w:pPr>
+        <w:pStyle w:val="ListBullet"/>
+      </w:pPr>
+      <w:r>
+        <w:rPr>
+          <w:b/>
+        </w:rPr>
+        <w:t xml:space="preserve">Desigualdade que ganha corpo e idade: </w:t>
+      </w:r>
+      <w:r>
+        <w:t>As condições de habitar o digital (acesso, participação, apropriação) chegam de modo desigual ao território e se tornam concretas na escola, com crianças de seis a dez anos.</w:t>
+      </w:r>
+    </w:p>
+    <w:p>
+      <w:pPr>
+        <w:pStyle w:val="ListBullet"/>
+      </w:pPr>
+      <w:r>
+        <w:rPr>
+          <w:b/>
+        </w:rPr>
+        <w:t xml:space="preserve">O mundo que a lei promete: </w:t>
+      </w:r>
+      <w:r>
+        <w:t>Retoma as promessas do eixo às crianças: participação consciente e democrática e proteção dos dados (art. 3º, III e IV).</w:t>
+      </w:r>
+    </w:p>
+    <w:p>
+      <w:r>
+        <w:rPr>
+          <w:b/>
+        </w:rPr>
+        <w:t xml:space="preserve">Autores e obras: </w:t>
+      </w:r>
+      <w:r>
+        <w:t>Schlemmer, Backes e Palagi (2021, p. 15); BRASIL (2023a, art. 3º).</w:t>
+      </w:r>
+    </w:p>
+    <w:p>
+      <w:r>
+        <w:rPr>
+          <w:b/>
+        </w:rPr>
+        <w:t xml:space="preserve">Onde aprofundar: </w:t>
+      </w:r>
+      <w:r>
+        <w:t>Cap. 3, seção 3.6 (habitar o digital).</w:t>
+      </w:r>
+    </w:p>
+    <w:p>
+      <w:r>
+        <w:rPr>
+          <w:b/>
+        </w:rPr>
+        <w:t>Perguntas de estudo</w:t>
+      </w:r>
+    </w:p>
+    <w:p>
+      <w:pPr>
+        <w:pStyle w:val="ListBullet"/>
+      </w:pPr>
+      <w:r>
+        <w:rPr>
+          <w:i/>
+        </w:rPr>
+        <w:t>O que significa dizer que a desigualdade "ganha corpo e idade" na escola? (as condições desiguais do território se concretizam nas crianças dos anos iniciais).</w:t>
+      </w:r>
     </w:p>
     <w:p>
       <w:r>

</xml_diff>

<commit_message>
Desfaz a inclusão da frase de encerramento no slide final e no roteiro
This reverts commit 0538052.

Co-Authored-By: Claude Opus 5.5 <noreply@anthropic.com>
Claude-Session: https://claude.ai/code/session_01HxStpW4pQoDfJdTDYr6zEC
</commit_message>
<xml_diff>
--- a/apresentacao_qualificacao/ROTEIRO_E_ESTUDO_DIRIGIDO.docx
+++ b/apresentacao_qualificacao/ROTEIRO_E_ESTUDO_DIRIGIDO.docx
@@ -52,7 +52,7 @@
         <w:pStyle w:val="ListBullet"/>
       </w:pPr>
       <w:r>
-        <w:t>A fala soma 2989 palavras, cerca de 24 minutos a 125 palavras por minuto, ritmo pausado. O restante dos 25 minutos fica para trocas de slide, pausas e o tempo de apontar fotos e mapa.</w:t>
+        <w:t>A fala soma 2928 palavras, cerca de 23 minutos a 125 palavras por minuto, ritmo pausado. O restante dos 25 minutos fica para trocas de slide, pausas e o tempo de apontar fotos e mapa.</w:t>
       </w:r>
     </w:p>
     <w:p>
@@ -60,7 +60,7 @@
         <w:pStyle w:val="ListBullet"/>
       </w:pPr>
       <w:r>
-        <w:t>Pontos de controle: fim do slide 10 por volta de 09:10; fim do slide 17 por volta de 15:15; fim do slide 25 por volta de 21:55.</w:t>
+        <w:t>Pontos de controle: fim do slide 10 por volta de 09:15; fim do slide 17 por volta de 15:25; fim do slide 25 por volta de 22:10.</w:t>
       </w:r>
     </w:p>
     <w:p>
@@ -238,7 +238,7 @@
           </w:tcPr>
           <w:p>
             <w:r>
-              <w:t>05:45</w:t>
+              <w:t>05:50</w:t>
             </w:r>
           </w:p>
         </w:tc>
@@ -248,7 +248,7 @@
           </w:tcPr>
           <w:p>
             <w:r>
-              <w:t>06:40</w:t>
+              <w:t>06:45</w:t>
             </w:r>
           </w:p>
         </w:tc>
@@ -290,7 +290,7 @@
           </w:tcPr>
           <w:p>
             <w:r>
-              <w:t>09:10</w:t>
+              <w:t>09:15</w:t>
             </w:r>
           </w:p>
         </w:tc>
@@ -332,7 +332,7 @@
           </w:tcPr>
           <w:p>
             <w:r>
-              <w:t>13:20</w:t>
+              <w:t>13:25</w:t>
             </w:r>
           </w:p>
         </w:tc>
@@ -364,7 +364,7 @@
           </w:tcPr>
           <w:p>
             <w:r>
-              <w:t>01:55</w:t>
+              <w:t>02:00</w:t>
             </w:r>
           </w:p>
         </w:tc>
@@ -374,7 +374,7 @@
           </w:tcPr>
           <w:p>
             <w:r>
-              <w:t>15:15</w:t>
+              <w:t>15:25</w:t>
             </w:r>
           </w:p>
         </w:tc>
@@ -416,7 +416,7 @@
           </w:tcPr>
           <w:p>
             <w:r>
-              <w:t>19:05</w:t>
+              <w:t>19:15</w:t>
             </w:r>
           </w:p>
         </w:tc>
@@ -448,7 +448,7 @@
           </w:tcPr>
           <w:p>
             <w:r>
-              <w:t>02:50</w:t>
+              <w:t>02:55</w:t>
             </w:r>
           </w:p>
         </w:tc>
@@ -458,7 +458,7 @@
           </w:tcPr>
           <w:p>
             <w:r>
-              <w:t>21:55</w:t>
+              <w:t>22:10</w:t>
             </w:r>
           </w:p>
         </w:tc>
@@ -490,7 +490,7 @@
           </w:tcPr>
           <w:p>
             <w:r>
-              <w:t>03:05</w:t>
+              <w:t>02:50</w:t>
             </w:r>
           </w:p>
         </w:tc>
@@ -2218,7 +2218,7 @@
           <w:color w:val="555555"/>
           <w:sz w:val="20"/>
         </w:rPr>
-        <w:t>55 s  ·  ao final: 01:50</w:t>
+        <w:t>60 s  ·  ao final: 01:55</w:t>
       </w:r>
     </w:p>
     <w:tbl>
@@ -2454,7 +2454,7 @@
           <w:color w:val="555555"/>
           <w:sz w:val="20"/>
         </w:rPr>
-        <w:t>70 s  ·  ao final: 03:00</w:t>
+        <w:t>70 s  ·  ao final: 03:05</w:t>
       </w:r>
     </w:p>
     <w:p>
@@ -2712,7 +2712,7 @@
           <w:color w:val="555555"/>
           <w:sz w:val="20"/>
         </w:rPr>
-        <w:t>105 s  ·  ao final: 04:45</w:t>
+        <w:t>105 s  ·  ao final: 04:50</w:t>
       </w:r>
     </w:p>
     <w:p>
@@ -2970,7 +2970,7 @@
           <w:color w:val="555555"/>
           <w:sz w:val="20"/>
         </w:rPr>
-        <w:t>60 s  ·  ao final: 05:45</w:t>
+        <w:t>60 s  ·  ao final: 05:50</w:t>
       </w:r>
     </w:p>
     <w:tbl>
@@ -3194,7 +3194,7 @@
           <w:color w:val="555555"/>
           <w:sz w:val="20"/>
         </w:rPr>
-        <w:t>55 s  ·  ao final: 06:40</w:t>
+        <w:t>55 s  ·  ao final: 06:45</w:t>
       </w:r>
     </w:p>
     <w:tbl>
@@ -3431,7 +3431,7 @@
           <w:color w:val="555555"/>
           <w:sz w:val="20"/>
         </w:rPr>
-        <w:t>10 s  ·  ao final: 06:50</w:t>
+        <w:t>10 s  ·  ao final: 06:55</w:t>
       </w:r>
     </w:p>
     <w:tbl>
@@ -3514,7 +3514,7 @@
           <w:color w:val="555555"/>
           <w:sz w:val="20"/>
         </w:rPr>
-        <w:t>60 s  ·  ao final: 07:50</w:t>
+        <w:t>60 s  ·  ao final: 07:55</w:t>
       </w:r>
     </w:p>
     <w:tbl>
@@ -3763,7 +3763,7 @@
           <w:color w:val="555555"/>
           <w:sz w:val="20"/>
         </w:rPr>
-        <w:t>80 s  ·  ao final: 09:10</w:t>
+        <w:t>80 s  ·  ao final: 09:15</w:t>
       </w:r>
     </w:p>
     <w:p>
@@ -3981,7 +3981,7 @@
           <w:color w:val="555555"/>
           <w:sz w:val="20"/>
         </w:rPr>
-        <w:t>10 s  ·  ao final: 09:20</w:t>
+        <w:t>10 s  ·  ao final: 09:25</w:t>
       </w:r>
     </w:p>
     <w:tbl>
@@ -4064,7 +4064,7 @@
           <w:color w:val="555555"/>
           <w:sz w:val="20"/>
         </w:rPr>
-        <w:t>85 s  ·  ao final: 10:45</w:t>
+        <w:t>85 s  ·  ao final: 10:50</w:t>
       </w:r>
     </w:p>
     <w:p>
@@ -4350,7 +4350,7 @@
           <w:color w:val="555555"/>
           <w:sz w:val="20"/>
         </w:rPr>
-        <w:t>80 s  ·  ao final: 12:05</w:t>
+        <w:t>80 s  ·  ao final: 12:10</w:t>
       </w:r>
     </w:p>
     <w:tbl>
@@ -4602,7 +4602,7 @@
           <w:color w:val="555555"/>
           <w:sz w:val="20"/>
         </w:rPr>
-        <w:t>75 s  ·  ao final: 13:20</w:t>
+        <w:t>75 s  ·  ao final: 13:25</w:t>
       </w:r>
     </w:p>
     <w:p>
@@ -4890,7 +4890,7 @@
           <w:color w:val="555555"/>
           <w:sz w:val="20"/>
         </w:rPr>
-        <w:t>10 s  ·  ao final: 13:30</w:t>
+        <w:t>10 s  ·  ao final: 13:35</w:t>
       </w:r>
     </w:p>
     <w:tbl>
@@ -4973,7 +4973,7 @@
           <w:color w:val="555555"/>
           <w:sz w:val="20"/>
         </w:rPr>
-        <w:t>50 s  ·  ao final: 14:20</w:t>
+        <w:t>55 s  ·  ao final: 14:30</w:t>
       </w:r>
     </w:p>
     <w:tbl>
@@ -5223,7 +5223,7 @@
           <w:color w:val="555555"/>
           <w:sz w:val="20"/>
         </w:rPr>
-        <w:t>55 s  ·  ao final: 15:15</w:t>
+        <w:t>55 s  ·  ao final: 15:25</w:t>
       </w:r>
     </w:p>
     <w:tbl>
@@ -5486,7 +5486,7 @@
           <w:color w:val="555555"/>
           <w:sz w:val="20"/>
         </w:rPr>
-        <w:t>10 s  ·  ao final: 15:25</w:t>
+        <w:t>10 s  ·  ao final: 15:35</w:t>
       </w:r>
     </w:p>
     <w:tbl>
@@ -5569,7 +5569,7 @@
           <w:color w:val="555555"/>
           <w:sz w:val="20"/>
         </w:rPr>
-        <w:t>65 s  ·  ao final: 16:30</w:t>
+        <w:t>65 s  ·  ao final: 16:40</w:t>
       </w:r>
     </w:p>
     <w:p>
@@ -5802,7 +5802,7 @@
           <w:color w:val="555555"/>
           <w:sz w:val="20"/>
         </w:rPr>
-        <w:t>70 s  ·  ao final: 17:40</w:t>
+        <w:t>70 s  ·  ao final: 17:50</w:t>
       </w:r>
     </w:p>
     <w:p>
@@ -6049,7 +6049,7 @@
           <w:color w:val="555555"/>
           <w:sz w:val="20"/>
         </w:rPr>
-        <w:t>85 s  ·  ao final: 19:05</w:t>
+        <w:t>85 s  ·  ao final: 19:15</w:t>
       </w:r>
     </w:p>
     <w:p>
@@ -6346,7 +6346,7 @@
           <w:color w:val="555555"/>
           <w:sz w:val="20"/>
         </w:rPr>
-        <w:t>10 s  ·  ao final: 19:15</w:t>
+        <w:t>10 s  ·  ao final: 19:25</w:t>
       </w:r>
     </w:p>
     <w:tbl>
@@ -6429,7 +6429,7 @@
           <w:color w:val="555555"/>
           <w:sz w:val="20"/>
         </w:rPr>
-        <w:t>65 s  ·  ao final: 20:20</w:t>
+        <w:t>70 s  ·  ao final: 20:35</w:t>
       </w:r>
     </w:p>
     <w:p>
@@ -6699,7 +6699,7 @@
           <w:color w:val="555555"/>
           <w:sz w:val="20"/>
         </w:rPr>
-        <w:t>45 s  ·  ao final: 21:05</w:t>
+        <w:t>45 s  ·  ao final: 21:20</w:t>
       </w:r>
     </w:p>
     <w:p>
@@ -6958,7 +6958,7 @@
           <w:color w:val="555555"/>
           <w:sz w:val="20"/>
         </w:rPr>
-        <w:t>50 s  ·  ao final: 21:55</w:t>
+        <w:t>50 s  ·  ao final: 22:10</w:t>
       </w:r>
     </w:p>
     <w:p>
@@ -7216,7 +7216,7 @@
           <w:color w:val="555555"/>
           <w:sz w:val="20"/>
         </w:rPr>
-        <w:t>80 s  ·  ao final: 23:15</w:t>
+        <w:t>85 s  ·  ao final: 23:35</w:t>
       </w:r>
     </w:p>
     <w:p>
@@ -7421,7 +7421,7 @@
           <w:color w:val="555555"/>
           <w:sz w:val="20"/>
         </w:rPr>
-        <w:t>65 s  ·  ao final: 24:20</w:t>
+        <w:t>70 s  ·  ao final: 24:45</w:t>
       </w:r>
     </w:p>
     <w:p>
@@ -7638,16 +7638,7 @@
           <w:color w:val="555555"/>
           <w:sz w:val="20"/>
         </w:rPr>
-        <w:t>40 s  ·  ao final: 25:00</w:t>
-      </w:r>
-    </w:p>
-    <w:p>
-      <w:r>
-        <w:rPr>
-          <w:i/>
-          <w:color w:val="555555"/>
-        </w:rPr>
-        <w:t>[Dizer a frase devagar, olhando para a banca; pausa antes de "Agradeço".]</w:t>
+        <w:t>15 s  ·  ao final: 25:00</w:t>
       </w:r>
     </w:p>
     <w:tbl>
@@ -7675,7 +7666,7 @@
               <w:rPr>
                 <w:sz w:val="24"/>
               </w:rPr>
-              <w:t>Encerro com uma frase que define esta pesquisa. Se habitar é estar presente e em relação, habitar o digital depende de condições que o território distribui de modo desigual. Em Pipa, é na escola que essa desigualdade ganha corpo e idade, e é dali que esta pesquisa pergunta quem pode, de fato, habitar o mundo que a lei promete às crianças. Agradeço a atenção e fico à disposição para ouvir as considerações da banca, que vão ajudar a tornar esta pesquisa mais consistente.</w:t>
+              <w:t>Agradeço a atenção e fico à disposição para ouvir as considerações da banca, que vão ajudar a tornar esta pesquisa mais consistente.</w:t>
             </w:r>
           </w:p>
         </w:tc>
@@ -7685,116 +7676,6 @@
       <w:pPr>
         <w:spacing w:after="0"/>
       </w:pPr>
-    </w:p>
-    <w:p>
-      <w:pPr>
-        <w:pStyle w:val="Heading3"/>
-      </w:pPr>
-      <w:r>
-        <w:t>Estudo dirigido</w:t>
-      </w:r>
-    </w:p>
-    <w:p>
-      <w:r>
-        <w:rPr>
-          <w:b/>
-        </w:rPr>
-        <w:t xml:space="preserve">Ideia central: </w:t>
-      </w:r>
-      <w:r>
-        <w:t>Frase de encerramento, autoral, que retoma a formulação habitar o digital.</w:t>
-      </w:r>
-    </w:p>
-    <w:p>
-      <w:r>
-        <w:rPr>
-          <w:b/>
-        </w:rPr>
-        <w:t>Conceitos</w:t>
-      </w:r>
-    </w:p>
-    <w:p>
-      <w:pPr>
-        <w:pStyle w:val="ListBullet"/>
-      </w:pPr>
-      <w:r>
-        <w:rPr>
-          <w:b/>
-        </w:rPr>
-        <w:t xml:space="preserve">Habitar como presença e relação: </w:t>
-      </w:r>
-      <w:r>
-        <w:t>A frase ecoa Schlemmer, Backes e Palagi (2021, p. 15): habitar "tem o significado de estar presente" e tem "natureza relacional". Se a banca perguntar, a origem é essa.</w:t>
-      </w:r>
-    </w:p>
-    <w:p>
-      <w:pPr>
-        <w:pStyle w:val="ListBullet"/>
-      </w:pPr>
-      <w:r>
-        <w:rPr>
-          <w:b/>
-        </w:rPr>
-        <w:t xml:space="preserve">Desigualdade que ganha corpo e idade: </w:t>
-      </w:r>
-      <w:r>
-        <w:t>As condições de habitar o digital (acesso, participação, apropriação) chegam de modo desigual ao território e se tornam concretas na escola, com crianças de seis a dez anos.</w:t>
-      </w:r>
-    </w:p>
-    <w:p>
-      <w:pPr>
-        <w:pStyle w:val="ListBullet"/>
-      </w:pPr>
-      <w:r>
-        <w:rPr>
-          <w:b/>
-        </w:rPr>
-        <w:t xml:space="preserve">O mundo que a lei promete: </w:t>
-      </w:r>
-      <w:r>
-        <w:t>Retoma as promessas do eixo às crianças: participação consciente e democrática e proteção dos dados (art. 3º, III e IV).</w:t>
-      </w:r>
-    </w:p>
-    <w:p>
-      <w:r>
-        <w:rPr>
-          <w:b/>
-        </w:rPr>
-        <w:t xml:space="preserve">Autores e obras: </w:t>
-      </w:r>
-      <w:r>
-        <w:t>Schlemmer, Backes e Palagi (2021, p. 15); BRASIL (2023a, art. 3º).</w:t>
-      </w:r>
-    </w:p>
-    <w:p>
-      <w:r>
-        <w:rPr>
-          <w:b/>
-        </w:rPr>
-        <w:t xml:space="preserve">Onde aprofundar: </w:t>
-      </w:r>
-      <w:r>
-        <w:t>Cap. 3, seção 3.6 (habitar o digital).</w:t>
-      </w:r>
-    </w:p>
-    <w:p>
-      <w:r>
-        <w:rPr>
-          <w:b/>
-        </w:rPr>
-        <w:t>Perguntas de estudo</w:t>
-      </w:r>
-    </w:p>
-    <w:p>
-      <w:pPr>
-        <w:pStyle w:val="ListBullet"/>
-      </w:pPr>
-      <w:r>
-        <w:rPr>
-          <w:i/>
-        </w:rPr>
-        <w:t>O que significa dizer que a desigualdade "ganha corpo e idade" na escola? (as condições desiguais do território se concretizam nas crianças dos anos iniciais).</w:t>
-      </w:r>
     </w:p>
     <w:p>
       <w:r>

</xml_diff>

<commit_message>
Acrescenta slide com o que foi feito e o que falta fazer, a pedido da orientadora
Co-Authored-By: Claude Opus 5.5 <noreply@anthropic.com>
Claude-Session: https://claude.ai/code/session_01HxStpW4pQoDfJdTDYr6zEC
</commit_message>
<xml_diff>
--- a/apresentacao_qualificacao/ROTEIRO_E_ESTUDO_DIRIGIDO.docx
+++ b/apresentacao_qualificacao/ROTEIRO_E_ESTUDO_DIRIGIDO.docx
@@ -28,7 +28,7 @@
       <w:r>
         <w:t>Yzynya Silva Rezende Machado · Orientadora: Profa. Dra. Maria Cristina Leandro de Paiva</w:t>
         <w:br/>
-        <w:t>Apresentação: Qualificacao_PNED_Pipa.pptx (30 slides; 21 de conteúdo) · Duração prevista: 25 minutos</w:t>
+        <w:t>Apresentação: Qualificacao_PNED_Pipa.pptx (31 slides; 22 de conteúdo) · Duração prevista: 25 minutos</w:t>
       </w:r>
     </w:p>
     <w:p>
@@ -52,7 +52,7 @@
         <w:pStyle w:val="ListBullet"/>
       </w:pPr>
       <w:r>
-        <w:t>A fala soma 2928 palavras, cerca de 23 minutos a 125 palavras por minuto, ritmo pausado. O restante dos 25 minutos fica para trocas de slide, pausas e o tempo de apontar fotos e mapa.</w:t>
+        <w:t>A fala soma 3024 palavras, cerca de 24 minutos a 125 palavras por minuto, ritmo pausado. O restante dos 25 minutos fica para trocas de slide, pausas e o tempo de apontar fotos e mapa.</w:t>
       </w:r>
     </w:p>
     <w:p>
@@ -60,7 +60,7 @@
         <w:pStyle w:val="ListBullet"/>
       </w:pPr>
       <w:r>
-        <w:t>Pontos de controle: fim do slide 10 por volta de 09:15; fim do slide 17 por volta de 15:25; fim do slide 25 por volta de 22:10.</w:t>
+        <w:t>Pontos de controle: fim do slide 10 por volta de 09:00; fim do slide 17 por volta de 14:55; fim do slide 25 por volta de 21:35.</w:t>
       </w:r>
     </w:p>
     <w:p>
@@ -238,7 +238,7 @@
           </w:tcPr>
           <w:p>
             <w:r>
-              <w:t>05:50</w:t>
+              <w:t>05:35</w:t>
             </w:r>
           </w:p>
         </w:tc>
@@ -248,7 +248,7 @@
           </w:tcPr>
           <w:p>
             <w:r>
-              <w:t>06:45</w:t>
+              <w:t>06:30</w:t>
             </w:r>
           </w:p>
         </w:tc>
@@ -290,7 +290,7 @@
           </w:tcPr>
           <w:p>
             <w:r>
-              <w:t>09:15</w:t>
+              <w:t>09:00</w:t>
             </w:r>
           </w:p>
         </w:tc>
@@ -322,7 +322,7 @@
           </w:tcPr>
           <w:p>
             <w:r>
-              <w:t>04:10</w:t>
+              <w:t>04:05</w:t>
             </w:r>
           </w:p>
         </w:tc>
@@ -332,7 +332,7 @@
           </w:tcPr>
           <w:p>
             <w:r>
-              <w:t>13:25</w:t>
+              <w:t>13:05</w:t>
             </w:r>
           </w:p>
         </w:tc>
@@ -364,7 +364,7 @@
           </w:tcPr>
           <w:p>
             <w:r>
-              <w:t>02:00</w:t>
+              <w:t>01:50</w:t>
             </w:r>
           </w:p>
         </w:tc>
@@ -374,7 +374,7 @@
           </w:tcPr>
           <w:p>
             <w:r>
-              <w:t>15:25</w:t>
+              <w:t>14:55</w:t>
             </w:r>
           </w:p>
         </w:tc>
@@ -416,7 +416,7 @@
           </w:tcPr>
           <w:p>
             <w:r>
-              <w:t>19:15</w:t>
+              <w:t>18:45</w:t>
             </w:r>
           </w:p>
         </w:tc>
@@ -448,7 +448,7 @@
           </w:tcPr>
           <w:p>
             <w:r>
-              <w:t>02:55</w:t>
+              <w:t>02:50</w:t>
             </w:r>
           </w:p>
         </w:tc>
@@ -458,7 +458,7 @@
           </w:tcPr>
           <w:p>
             <w:r>
-              <w:t>22:10</w:t>
+              <w:t>21:35</w:t>
             </w:r>
           </w:p>
         </w:tc>
@@ -480,7 +480,7 @@
           </w:tcPr>
           <w:p>
             <w:r>
-              <w:t>26-28</w:t>
+              <w:t>26-29</w:t>
             </w:r>
           </w:p>
         </w:tc>
@@ -490,7 +490,7 @@
           </w:tcPr>
           <w:p>
             <w:r>
-              <w:t>02:50</w:t>
+              <w:t>03:25</w:t>
             </w:r>
           </w:p>
         </w:tc>
@@ -522,7 +522,7 @@
           </w:tcPr>
           <w:p>
             <w:r>
-              <w:t>29-30</w:t>
+              <w:t>30-31</w:t>
             </w:r>
           </w:p>
         </w:tc>
@@ -572,7 +572,7 @@
               <w:rPr>
                 <w:b/>
               </w:rPr>
-              <w:t>1-30</w:t>
+              <w:t>1-31</w:t>
             </w:r>
           </w:p>
         </w:tc>
@@ -2218,7 +2218,7 @@
           <w:color w:val="555555"/>
           <w:sz w:val="20"/>
         </w:rPr>
-        <w:t>60 s  ·  ao final: 01:55</w:t>
+        <w:t>55 s  ·  ao final: 01:50</w:t>
       </w:r>
     </w:p>
     <w:tbl>
@@ -2454,7 +2454,7 @@
           <w:color w:val="555555"/>
           <w:sz w:val="20"/>
         </w:rPr>
-        <w:t>70 s  ·  ao final: 03:05</w:t>
+        <w:t>70 s  ·  ao final: 03:00</w:t>
       </w:r>
     </w:p>
     <w:p>
@@ -2712,7 +2712,7 @@
           <w:color w:val="555555"/>
           <w:sz w:val="20"/>
         </w:rPr>
-        <w:t>105 s  ·  ao final: 04:50</w:t>
+        <w:t>95 s  ·  ao final: 04:35</w:t>
       </w:r>
     </w:p>
     <w:p>
@@ -2970,7 +2970,7 @@
           <w:color w:val="555555"/>
           <w:sz w:val="20"/>
         </w:rPr>
-        <w:t>60 s  ·  ao final: 05:50</w:t>
+        <w:t>60 s  ·  ao final: 05:35</w:t>
       </w:r>
     </w:p>
     <w:tbl>
@@ -3194,7 +3194,7 @@
           <w:color w:val="555555"/>
           <w:sz w:val="20"/>
         </w:rPr>
-        <w:t>55 s  ·  ao final: 06:45</w:t>
+        <w:t>55 s  ·  ao final: 06:30</w:t>
       </w:r>
     </w:p>
     <w:tbl>
@@ -3431,7 +3431,7 @@
           <w:color w:val="555555"/>
           <w:sz w:val="20"/>
         </w:rPr>
-        <w:t>10 s  ·  ao final: 06:55</w:t>
+        <w:t>10 s  ·  ao final: 06:40</w:t>
       </w:r>
     </w:p>
     <w:tbl>
@@ -3514,7 +3514,7 @@
           <w:color w:val="555555"/>
           <w:sz w:val="20"/>
         </w:rPr>
-        <w:t>60 s  ·  ao final: 07:55</w:t>
+        <w:t>60 s  ·  ao final: 07:40</w:t>
       </w:r>
     </w:p>
     <w:tbl>
@@ -3763,7 +3763,7 @@
           <w:color w:val="555555"/>
           <w:sz w:val="20"/>
         </w:rPr>
-        <w:t>80 s  ·  ao final: 09:15</w:t>
+        <w:t>80 s  ·  ao final: 09:00</w:t>
       </w:r>
     </w:p>
     <w:p>
@@ -3981,7 +3981,7 @@
           <w:color w:val="555555"/>
           <w:sz w:val="20"/>
         </w:rPr>
-        <w:t>10 s  ·  ao final: 09:25</w:t>
+        <w:t>10 s  ·  ao final: 09:10</w:t>
       </w:r>
     </w:p>
     <w:tbl>
@@ -4064,7 +4064,7 @@
           <w:color w:val="555555"/>
           <w:sz w:val="20"/>
         </w:rPr>
-        <w:t>85 s  ·  ao final: 10:50</w:t>
+        <w:t>85 s  ·  ao final: 10:35</w:t>
       </w:r>
     </w:p>
     <w:p>
@@ -4350,7 +4350,7 @@
           <w:color w:val="555555"/>
           <w:sz w:val="20"/>
         </w:rPr>
-        <w:t>80 s  ·  ao final: 12:10</w:t>
+        <w:t>80 s  ·  ao final: 11:55</w:t>
       </w:r>
     </w:p>
     <w:tbl>
@@ -4602,7 +4602,7 @@
           <w:color w:val="555555"/>
           <w:sz w:val="20"/>
         </w:rPr>
-        <w:t>75 s  ·  ao final: 13:25</w:t>
+        <w:t>70 s  ·  ao final: 13:05</w:t>
       </w:r>
     </w:p>
     <w:p>
@@ -4890,7 +4890,7 @@
           <w:color w:val="555555"/>
           <w:sz w:val="20"/>
         </w:rPr>
-        <w:t>10 s  ·  ao final: 13:35</w:t>
+        <w:t>10 s  ·  ao final: 13:15</w:t>
       </w:r>
     </w:p>
     <w:tbl>
@@ -4973,7 +4973,7 @@
           <w:color w:val="555555"/>
           <w:sz w:val="20"/>
         </w:rPr>
-        <w:t>55 s  ·  ao final: 14:30</w:t>
+        <w:t>50 s  ·  ao final: 14:05</w:t>
       </w:r>
     </w:p>
     <w:tbl>
@@ -5223,7 +5223,7 @@
           <w:color w:val="555555"/>
           <w:sz w:val="20"/>
         </w:rPr>
-        <w:t>55 s  ·  ao final: 15:25</w:t>
+        <w:t>50 s  ·  ao final: 14:55</w:t>
       </w:r>
     </w:p>
     <w:tbl>
@@ -5486,7 +5486,7 @@
           <w:color w:val="555555"/>
           <w:sz w:val="20"/>
         </w:rPr>
-        <w:t>10 s  ·  ao final: 15:35</w:t>
+        <w:t>10 s  ·  ao final: 15:05</w:t>
       </w:r>
     </w:p>
     <w:tbl>
@@ -5569,7 +5569,7 @@
           <w:color w:val="555555"/>
           <w:sz w:val="20"/>
         </w:rPr>
-        <w:t>65 s  ·  ao final: 16:40</w:t>
+        <w:t>65 s  ·  ao final: 16:10</w:t>
       </w:r>
     </w:p>
     <w:p>
@@ -5802,7 +5802,7 @@
           <w:color w:val="555555"/>
           <w:sz w:val="20"/>
         </w:rPr>
-        <w:t>70 s  ·  ao final: 17:50</w:t>
+        <w:t>70 s  ·  ao final: 17:20</w:t>
       </w:r>
     </w:p>
     <w:p>
@@ -6049,7 +6049,7 @@
           <w:color w:val="555555"/>
           <w:sz w:val="20"/>
         </w:rPr>
-        <w:t>85 s  ·  ao final: 19:15</w:t>
+        <w:t>85 s  ·  ao final: 18:45</w:t>
       </w:r>
     </w:p>
     <w:p>
@@ -6346,7 +6346,7 @@
           <w:color w:val="555555"/>
           <w:sz w:val="20"/>
         </w:rPr>
-        <w:t>10 s  ·  ao final: 19:25</w:t>
+        <w:t>10 s  ·  ao final: 18:55</w:t>
       </w:r>
     </w:p>
     <w:tbl>
@@ -6429,7 +6429,7 @@
           <w:color w:val="555555"/>
           <w:sz w:val="20"/>
         </w:rPr>
-        <w:t>70 s  ·  ao final: 20:35</w:t>
+        <w:t>65 s  ·  ao final: 20:00</w:t>
       </w:r>
     </w:p>
     <w:p>
@@ -6699,7 +6699,7 @@
           <w:color w:val="555555"/>
           <w:sz w:val="20"/>
         </w:rPr>
-        <w:t>45 s  ·  ao final: 21:20</w:t>
+        <w:t>45 s  ·  ao final: 20:45</w:t>
       </w:r>
     </w:p>
     <w:p>
@@ -6958,7 +6958,7 @@
           <w:color w:val="555555"/>
           <w:sz w:val="20"/>
         </w:rPr>
-        <w:t>50 s  ·  ao final: 22:10</w:t>
+        <w:t>50 s  ·  ao final: 21:35</w:t>
       </w:r>
     </w:p>
     <w:p>
@@ -7216,7 +7216,7 @@
           <w:color w:val="555555"/>
           <w:sz w:val="20"/>
         </w:rPr>
-        <w:t>85 s  ·  ao final: 23:35</w:t>
+        <w:t>80 s  ·  ao final: 22:55</w:t>
       </w:r>
     </w:p>
     <w:p>
@@ -7412,7 +7412,7 @@
         <w:pStyle w:val="Heading2"/>
       </w:pPr>
       <w:r>
-        <w:t>Slide 27 · A questão aberta e os próximos passos</w:t>
+        <w:t>Slide 27 · A questão aberta</w:t>
       </w:r>
     </w:p>
     <w:p>
@@ -7421,7 +7421,7 @@
           <w:color w:val="555555"/>
           <w:sz w:val="20"/>
         </w:rPr>
-        <w:t>70 s  ·  ao final: 24:45</w:t>
+        <w:t>40 s  ·  ao final: 23:35</w:t>
       </w:r>
     </w:p>
     <w:p>
@@ -7458,7 +7458,7 @@
               <w:rPr>
                 <w:sz w:val="24"/>
               </w:rPr>
-              <w:t>Termino com a questão que atravessa toda a pesquisa. A política fez da educação digital um direito e deixou os meios na dependência de cada ente federado. A pergunta de fundo, que só as narrativas dos profissionais podem responder, é esta: quando a política não faz chegar o equipamento nem a formação, quem paga, no cotidiano escolar, por esse vazio material e formativo? E o que isso significa para os direitos que a lei prometeu às crianças? Para respondê-la, os próximos passos são submeter a emenda ao Comitê de Ética, com a Secretaria como coparticipante, realizar o campo em dez semanas, completar a análise documental, com os documentos já solicitados à direção da escola e ao técnico da Secretaria, e escrever o capítulo 7, incorporando as contribuições desta banca.</w:t>
+              <w:t>Chego à questão que atravessa toda a pesquisa. A política fez da educação digital um direito e deixou os meios na dependência de cada ente federado. A pergunta de fundo, que só as narrativas dos profissionais podem responder, é esta: quando a política não faz chegar o equipamento nem a formação, quem paga, no cotidiano escolar, por esse vazio material e formativo? E o que isso significa para os direitos que a lei prometeu às crianças?</w:t>
             </w:r>
           </w:p>
         </w:tc>
@@ -7558,20 +7558,6 @@
       </w:r>
     </w:p>
     <w:p>
-      <w:pPr>
-        <w:pStyle w:val="ListBullet"/>
-      </w:pPr>
-      <w:r>
-        <w:rPr>
-          <w:b/>
-        </w:rPr>
-        <w:t xml:space="preserve">Próximos passos: </w:t>
-      </w:r>
-      <w:r>
-        <w:t>Emenda ao CEP; campo; análise documental (documentos já solicitados à direção e ao técnico da Secretaria); capítulo 7.</w:t>
-      </w:r>
-    </w:p>
-    <w:p>
       <w:r>
         <w:rPr>
           <w:b/>
@@ -7629,7 +7615,249 @@
         <w:pStyle w:val="Heading2"/>
       </w:pPr>
       <w:r>
-        <w:t>Slide 28 · Agradecimento</w:t>
+        <w:t>Slide 28 · O que foi feito e o que falta fazer</w:t>
+      </w:r>
+    </w:p>
+    <w:p>
+      <w:r>
+        <w:rPr>
+          <w:color w:val="555555"/>
+          <w:sz w:val="20"/>
+        </w:rPr>
+        <w:t>70 s  ·  ao final: 24:45</w:t>
+      </w:r>
+    </w:p>
+    <w:p>
+      <w:r>
+        <w:rPr>
+          <w:i/>
+          <w:color w:val="555555"/>
+        </w:rPr>
+        <w:t>[Ler o cartão da esquerda e depois o da direita; não ler os números do CEP em voz alta.]</w:t>
+      </w:r>
+    </w:p>
+    <w:tbl>
+      <w:tblPr>
+        <w:tblStyle w:val="TableGrid"/>
+        <w:tblW w:type="auto" w:w="0"/>
+        <w:tblLook w:firstColumn="1" w:firstRow="1" w:lastColumn="0" w:lastRow="0" w:noHBand="0" w:noVBand="1" w:val="04A0"/>
+      </w:tblPr>
+      <w:tblGrid>
+        <w:gridCol w:w="9632"/>
+      </w:tblGrid>
+      <w:tr>
+        <w:tc>
+          <w:tcPr>
+            <w:tcW w:type="dxa" w:w="9632"/>
+            <w:shd w:val="clear" w:color="auto" w:fill="EEF0FB"/>
+          </w:tcPr>
+          <w:p>
+            <w:pPr>
+              <w:spacing w:line="300" w:lineRule="auto"/>
+              <w:jc w:val="both"/>
+            </w:pPr>
+            <w:r/>
+            <w:r>
+              <w:rPr>
+                <w:sz w:val="24"/>
+              </w:rPr>
+              <w:t>Para encerrar, o que foi feito e o que falta fazer. Integralizei 315 das 330 horas de componentes curriculares e a proficiência em espanhol. O projeto foi aprovado no Comitê de Ética; o texto de qualificação reúne a revisão, os fundamentos, a metodologia, a agenda e a PNED e o território de Pipa e da escola; o registro iconográfico está feito, e os documentos já foram solicitados à direção e à Secretaria. Apresentei a pesquisa no ConWiTE, no ConBAlf e no Colóquio de Políticas Educacionais. Falta submeter a emenda ao Comitê de Ética, com a Secretaria como coparticipante e o projeto atualizado à PNED; realizar o campo em dez semanas, começando pelo técnico da Secretaria; transcrever, analisar e fazer a devolutiva; e escrever o capítulo 7, revisando os capítulos com as contribuições desta banca. Restam ainda dois seminários, a proficiência em inglês, os artigos, o depósito e a defesa.</w:t>
+            </w:r>
+          </w:p>
+        </w:tc>
+      </w:tr>
+    </w:tbl>
+    <w:p>
+      <w:pPr>
+        <w:spacing w:after="0"/>
+      </w:pPr>
+    </w:p>
+    <w:p>
+      <w:pPr>
+        <w:pStyle w:val="Heading3"/>
+      </w:pPr>
+      <w:r>
+        <w:t>Estudo dirigido</w:t>
+      </w:r>
+    </w:p>
+    <w:p>
+      <w:r>
+        <w:rPr>
+          <w:b/>
+        </w:rPr>
+        <w:t>Mapa conceitual</w:t>
+      </w:r>
+    </w:p>
+    <w:p>
+      <w:pPr>
+        <w:jc w:val="center"/>
+      </w:pPr>
+      <w:r>
+        <w:drawing>
+          <wp:inline xmlns:a="http://schemas.openxmlformats.org/drawingml/2006/main" xmlns:pic="http://schemas.openxmlformats.org/drawingml/2006/picture">
+            <wp:extent cx="5903999" cy="3577823"/>
+            <wp:docPr id="22" name="Picture 22"/>
+            <wp:cNvGraphicFramePr>
+              <a:graphicFrameLocks noChangeAspect="1"/>
+            </wp:cNvGraphicFramePr>
+            <a:graphic>
+              <a:graphicData uri="http://schemas.openxmlformats.org/drawingml/2006/picture">
+                <pic:pic>
+                  <pic:nvPicPr>
+                    <pic:cNvPr id="0" name="mapa_28.png"/>
+                    <pic:cNvPicPr/>
+                  </pic:nvPicPr>
+                  <pic:blipFill>
+                    <a:blip r:embed="rId30"/>
+                    <a:stretch>
+                      <a:fillRect/>
+                    </a:stretch>
+                  </pic:blipFill>
+                  <pic:spPr>
+                    <a:xfrm>
+                      <a:off x="0" y="0"/>
+                      <a:ext cx="5903999" cy="3577823"/>
+                    </a:xfrm>
+                    <a:prstGeom prst="rect"/>
+                  </pic:spPr>
+                </pic:pic>
+              </a:graphicData>
+            </a:graphic>
+          </wp:inline>
+        </w:drawing>
+      </w:r>
+    </w:p>
+    <w:p>
+      <w:r>
+        <w:rPr>
+          <w:b/>
+        </w:rPr>
+        <w:t xml:space="preserve">Ideia central: </w:t>
+      </w:r>
+      <w:r>
+        <w:t>Balanço do percurso, pedido pela orientadora: o que já foi cumprido e o que falta até a defesa.</w:t>
+      </w:r>
+    </w:p>
+    <w:p>
+      <w:r>
+        <w:rPr>
+          <w:b/>
+        </w:rPr>
+        <w:t>Conceitos</w:t>
+      </w:r>
+    </w:p>
+    <w:p>
+      <w:pPr>
+        <w:pStyle w:val="ListBullet"/>
+      </w:pPr>
+      <w:r>
+        <w:rPr>
+          <w:b/>
+        </w:rPr>
+        <w:t xml:space="preserve">Feito: </w:t>
+      </w:r>
+      <w:r>
+        <w:t>Componentes curriculares: 315 h de 330 h integralizadas (histórico de 25/08/2026); proficiência em espanhol; aprovação no CEP (Parecer nº 8.038.332; CAAE 91393625.4.0000.5292); texto de qualificação; registro iconográfico; documentos solicitados à direção e à SME; produção em eventos (ConWiTE 2024 e 2026, ConBAlf 2025, V Colóquio de Políticas Educacionais 2025).</w:t>
+      </w:r>
+    </w:p>
+    <w:p>
+      <w:pPr>
+        <w:pStyle w:val="ListBullet"/>
+      </w:pPr>
+      <w:r>
+        <w:rPr>
+          <w:b/>
+        </w:rPr>
+        <w:t xml:space="preserve">Falta fazer: </w:t>
+      </w:r>
+      <w:r>
+        <w:t>Emenda ao CEP (SME coparticipante e projeto atualizado à PNED); campo em dez semanas; transcrição, análise temática reflexiva e devolutiva; capítulo 7, revisão e considerações finais; Seminário de Formação Doutoral II e Seminário de Pesquisa IV (matriculados); proficiência em inglês; artigos; depósito e defesa.</w:t>
+      </w:r>
+    </w:p>
+    <w:p>
+      <w:pPr>
+        <w:pStyle w:val="ListBullet"/>
+      </w:pPr>
+      <w:r>
+        <w:rPr>
+          <w:b/>
+        </w:rPr>
+        <w:t xml:space="preserve">Por que a emenda: </w:t>
+      </w:r>
+      <w:r>
+        <w:t>O projeto aprovado no CEP tem o título anterior, sobre a Política de Inovação Educação Conectada (PIEC); a emenda alinha o protocolo ao objeto atual e inclui a SME como coparticipante.</w:t>
+      </w:r>
+    </w:p>
+    <w:p>
+      <w:r>
+        <w:rPr>
+          <w:b/>
+        </w:rPr>
+        <w:t xml:space="preserve">Autores e obras: </w:t>
+      </w:r>
+      <w:r>
+        <w:t>Relatório de atividades da licença para estudos (23/09/2026); Histórico escolar SIGAA (25/08/2026); Parecer consubstanciado do CEP nº 8.038.332.</w:t>
+      </w:r>
+    </w:p>
+    <w:p>
+      <w:r>
+        <w:rPr>
+          <w:b/>
+        </w:rPr>
+        <w:t xml:space="preserve">Onde aprofundar: </w:t>
+      </w:r>
+      <w:r>
+        <w:t>Cap. 4, seções 4.4 e 4.5.4 (cronograma).</w:t>
+      </w:r>
+    </w:p>
+    <w:p>
+      <w:r>
+        <w:rPr>
+          <w:b/>
+        </w:rPr>
+        <w:t>Perguntas de estudo</w:t>
+      </w:r>
+    </w:p>
+    <w:p>
+      <w:pPr>
+        <w:pStyle w:val="ListBullet"/>
+      </w:pPr>
+      <w:r>
+        <w:rPr>
+          <w:i/>
+        </w:rPr>
+        <w:t>Por que o campo ainda não começou? (depende da emenda ao CEP, com a SME coparticipante).</w:t>
+      </w:r>
+    </w:p>
+    <w:p>
+      <w:pPr>
+        <w:pStyle w:val="ListBullet"/>
+      </w:pPr>
+      <w:r>
+        <w:rPr>
+          <w:i/>
+        </w:rPr>
+        <w:t>Qual é o prazo? (o histórico registra prazo padrão de conclusão em fev. 2027; confirmar o cronograma com a orientadora).</w:t>
+      </w:r>
+    </w:p>
+    <w:p>
+      <w:r>
+        <w:rPr>
+          <w:b/>
+          <w:color w:val="B03A2E"/>
+        </w:rPr>
+        <w:t xml:space="preserve">Cuidado: </w:t>
+      </w:r>
+      <w:r>
+        <w:t>A conferir: o relatório de 23/09/2026 lista apenas os capítulos 1, 5 e 6 em primeira versão; o slide diz que o texto de qualificação reúne também RSL, fundamentos e metodologia. Ajustar se não for o caso.</w:t>
+      </w:r>
+    </w:p>
+    <w:p>
+      <w:pPr>
+        <w:pStyle w:val="Heading2"/>
+      </w:pPr>
+      <w:r>
+        <w:t>Slide 29 · Agradecimento</w:t>
       </w:r>
     </w:p>
     <w:p>
@@ -7695,7 +7923,7 @@
         <w:pStyle w:val="Heading2"/>
       </w:pPr>
       <w:r>
-        <w:t>Slide 29 · Referências (1/2)</w:t>
+        <w:t>Slide 30 · Referências (1/2)</w:t>
       </w:r>
     </w:p>
     <w:p>
@@ -7751,7 +7979,7 @@
         <w:pStyle w:val="Heading2"/>
       </w:pPr>
       <w:r>
-        <w:t>Slide 30 · Referências (2/2)</w:t>
+        <w:t>Slide 31 · Referências (2/2)</w:t>
       </w:r>
     </w:p>
     <w:p>

</xml_diff>

<commit_message>
Reduz a questão de pesquisa, explicita a documentação solicitada e acrescenta slide de conceitos e teóricos
Co-Authored-By: Claude Opus 5.5 <noreply@anthropic.com>
Claude-Session: https://claude.ai/code/session_01HxStpW4pQoDfJdTDYr6zEC
</commit_message>
<xml_diff>
--- a/apresentacao_qualificacao/ROTEIRO_E_ESTUDO_DIRIGIDO.docx
+++ b/apresentacao_qualificacao/ROTEIRO_E_ESTUDO_DIRIGIDO.docx
@@ -28,7 +28,7 @@
       <w:r>
         <w:t>Yzynya Silva Rezende Machado · Orientadora: Profa. Dra. Maria Cristina Leandro de Paiva</w:t>
         <w:br/>
-        <w:t>Apresentação: Qualificacao_PNED_Pipa.pptx (31 slides; 22 de conteúdo) · Duração prevista: 25 minutos</w:t>
+        <w:t>Apresentação: Qualificacao_PNED_Pipa.pptx (32 slides; 23 de conteúdo) · Duração prevista: 25 minutos</w:t>
       </w:r>
     </w:p>
     <w:p>
@@ -52,7 +52,7 @@
         <w:pStyle w:val="ListBullet"/>
       </w:pPr>
       <w:r>
-        <w:t>A fala soma 3024 palavras, cerca de 24 minutos a 125 palavras por minuto, ritmo pausado. O restante dos 25 minutos fica para trocas de slide, pausas e o tempo de apontar fotos e mapa.</w:t>
+        <w:t>A fala soma 3087 palavras, cerca de 25 minutos a 125 palavras por minuto, ritmo pausado. O restante dos 25 minutos fica para trocas de slide, pausas e o tempo de apontar fotos e mapa.</w:t>
       </w:r>
     </w:p>
     <w:p>
@@ -60,7 +60,7 @@
         <w:pStyle w:val="ListBullet"/>
       </w:pPr>
       <w:r>
-        <w:t>Pontos de controle: fim do slide 10 por volta de 09:00; fim do slide 17 por volta de 14:55; fim do slide 25 por volta de 21:35.</w:t>
+        <w:t>Pontos de controle: fim do slide 10 por volta de 08:40; fim do slide 18 por volta de 15:13; fim do slide 26 por volta de 21:48.</w:t>
       </w:r>
     </w:p>
     <w:p>
@@ -238,7 +238,7 @@
           </w:tcPr>
           <w:p>
             <w:r>
-              <w:t>05:35</w:t>
+              <w:t>05:15</w:t>
             </w:r>
           </w:p>
         </w:tc>
@@ -248,7 +248,7 @@
           </w:tcPr>
           <w:p>
             <w:r>
-              <w:t>06:30</w:t>
+              <w:t>06:10</w:t>
             </w:r>
           </w:p>
         </w:tc>
@@ -290,7 +290,7 @@
           </w:tcPr>
           <w:p>
             <w:r>
-              <w:t>09:00</w:t>
+              <w:t>08:40</w:t>
             </w:r>
           </w:p>
         </w:tc>
@@ -312,7 +312,7 @@
           </w:tcPr>
           <w:p>
             <w:r>
-              <w:t>11-14</w:t>
+              <w:t>11-15</w:t>
             </w:r>
           </w:p>
         </w:tc>
@@ -322,7 +322,7 @@
           </w:tcPr>
           <w:p>
             <w:r>
-              <w:t>04:05</w:t>
+              <w:t>04:43</w:t>
             </w:r>
           </w:p>
         </w:tc>
@@ -332,7 +332,7 @@
           </w:tcPr>
           <w:p>
             <w:r>
-              <w:t>13:05</w:t>
+              <w:t>13:23</w:t>
             </w:r>
           </w:p>
         </w:tc>
@@ -354,7 +354,7 @@
           </w:tcPr>
           <w:p>
             <w:r>
-              <w:t>15-17</w:t>
+              <w:t>16-18</w:t>
             </w:r>
           </w:p>
         </w:tc>
@@ -374,7 +374,7 @@
           </w:tcPr>
           <w:p>
             <w:r>
-              <w:t>14:55</w:t>
+              <w:t>15:13</w:t>
             </w:r>
           </w:p>
         </w:tc>
@@ -396,7 +396,7 @@
           </w:tcPr>
           <w:p>
             <w:r>
-              <w:t>18-21</w:t>
+              <w:t>19-22</w:t>
             </w:r>
           </w:p>
         </w:tc>
@@ -416,7 +416,7 @@
           </w:tcPr>
           <w:p>
             <w:r>
-              <w:t>18:45</w:t>
+              <w:t>19:03</w:t>
             </w:r>
           </w:p>
         </w:tc>
@@ -438,7 +438,7 @@
           </w:tcPr>
           <w:p>
             <w:r>
-              <w:t>22-25</w:t>
+              <w:t>23-26</w:t>
             </w:r>
           </w:p>
         </w:tc>
@@ -448,7 +448,7 @@
           </w:tcPr>
           <w:p>
             <w:r>
-              <w:t>02:50</w:t>
+              <w:t>02:45</w:t>
             </w:r>
           </w:p>
         </w:tc>
@@ -458,7 +458,7 @@
           </w:tcPr>
           <w:p>
             <w:r>
-              <w:t>21:35</w:t>
+              <w:t>21:48</w:t>
             </w:r>
           </w:p>
         </w:tc>
@@ -480,7 +480,7 @@
           </w:tcPr>
           <w:p>
             <w:r>
-              <w:t>26-29</w:t>
+              <w:t>27-30</w:t>
             </w:r>
           </w:p>
         </w:tc>
@@ -490,7 +490,7 @@
           </w:tcPr>
           <w:p>
             <w:r>
-              <w:t>03:25</w:t>
+              <w:t>03:12</w:t>
             </w:r>
           </w:p>
         </w:tc>
@@ -522,7 +522,7 @@
           </w:tcPr>
           <w:p>
             <w:r>
-              <w:t>30-31</w:t>
+              <w:t>31-32</w:t>
             </w:r>
           </w:p>
         </w:tc>
@@ -572,7 +572,7 @@
               <w:rPr>
                 <w:b/>
               </w:rPr>
-              <w:t>1-31</w:t>
+              <w:t>1-32</w:t>
             </w:r>
           </w:p>
         </w:tc>
@@ -788,7 +788,7 @@
               <w:rPr>
                 <w:sz w:val="20"/>
               </w:rPr>
-              <w:t>12</w:t>
+              <w:t>12, 15</w:t>
             </w:r>
           </w:p>
         </w:tc>
@@ -842,7 +842,7 @@
               <w:rPr>
                 <w:sz w:val="20"/>
               </w:rPr>
-              <w:t>1, 3, 12</w:t>
+              <w:t>1, 3, 12, 15</w:t>
             </w:r>
           </w:p>
         </w:tc>
@@ -1004,7 +1004,7 @@
               <w:rPr>
                 <w:sz w:val="20"/>
               </w:rPr>
-              <w:t>5, 13</w:t>
+              <w:t>5, 13, 15</w:t>
             </w:r>
           </w:p>
         </w:tc>
@@ -1220,7 +1220,7 @@
               <w:rPr>
                 <w:sz w:val="20"/>
               </w:rPr>
-              <w:t>7, 14, 23</w:t>
+              <w:t>7, 14, 24, 15</w:t>
             </w:r>
           </w:p>
         </w:tc>
@@ -1274,7 +1274,7 @@
               <w:rPr>
                 <w:sz w:val="20"/>
               </w:rPr>
-              <w:t>14, 25</w:t>
+              <w:t>14, 26</w:t>
             </w:r>
           </w:p>
         </w:tc>
@@ -1328,7 +1328,7 @@
               <w:rPr>
                 <w:sz w:val="20"/>
               </w:rPr>
-              <w:t>7, 14, 24</w:t>
+              <w:t>7, 14, 25</w:t>
             </w:r>
           </w:p>
         </w:tc>
@@ -1382,7 +1382,7 @@
               <w:rPr>
                 <w:sz w:val="20"/>
               </w:rPr>
-              <w:t>14</w:t>
+              <w:t>14, 15</w:t>
             </w:r>
           </w:p>
         </w:tc>
@@ -1436,7 +1436,7 @@
               <w:rPr>
                 <w:sz w:val="20"/>
               </w:rPr>
-              <w:t>14, 26</w:t>
+              <w:t>14, 27</w:t>
             </w:r>
           </w:p>
         </w:tc>
@@ -1598,7 +1598,7 @@
               <w:rPr>
                 <w:sz w:val="20"/>
               </w:rPr>
-              <w:t>20</w:t>
+              <w:t>21</w:t>
             </w:r>
           </w:p>
         </w:tc>
@@ -1652,7 +1652,7 @@
               <w:rPr>
                 <w:sz w:val="20"/>
               </w:rPr>
-              <w:t>21, 26</w:t>
+              <w:t>22, 27</w:t>
             </w:r>
           </w:p>
         </w:tc>
@@ -1706,7 +1706,7 @@
               <w:rPr>
                 <w:sz w:val="20"/>
               </w:rPr>
-              <w:t>25, 26</w:t>
+              <w:t>26, 27</w:t>
             </w:r>
           </w:p>
         </w:tc>
@@ -1814,7 +1814,7 @@
               <w:rPr>
                 <w:sz w:val="20"/>
               </w:rPr>
-              <w:t>16, 17</w:t>
+              <w:t>17, 18</w:t>
             </w:r>
           </w:p>
         </w:tc>
@@ -1868,7 +1868,7 @@
               <w:rPr>
                 <w:sz w:val="20"/>
               </w:rPr>
-              <w:t>3, 16, 23</w:t>
+              <w:t>3, 17, 24</w:t>
             </w:r>
           </w:p>
         </w:tc>
@@ -1922,7 +1922,7 @@
               <w:rPr>
                 <w:sz w:val="20"/>
               </w:rPr>
-              <w:t>21</w:t>
+              <w:t>22</w:t>
             </w:r>
           </w:p>
         </w:tc>
@@ -2454,7 +2454,7 @@
           <w:color w:val="555555"/>
           <w:sz w:val="20"/>
         </w:rPr>
-        <w:t>70 s  ·  ao final: 03:00</w:t>
+        <w:t>55 s  ·  ao final: 02:45</w:t>
       </w:r>
     </w:p>
     <w:p>
@@ -2491,7 +2491,7 @@
               <w:rPr>
                 <w:sz w:val="24"/>
               </w:rPr>
-              <w:t>Daí a questão que orienta a pesquisa, que leio seguindo o infográfico. A Política Nacional de Educação Digital é recontextualizada pela Secretaria Municipal de Educação, que a traduz para um território diverso, com sede, áreas rurais, povoados e uma comunidade quilombola. Essa tradução chega à Escola Municipal Domitila Castelo da Silva, em Pipa, onde os profissionais a encenam, atravessados pelas culturas profissionais, pelas condições materiais e institucionais da escola e pelas especificidades do lugar. Desse encontro saem formas de atuação: acomodações, negociações, ressignificações e, talvez, resistências. A resistência, que está no título, é uma possibilidade a examinar nos dados, sem ser pressuposta. As atuações são coletivas, criativas e limitadas. E, com Stuart Hall, numa aproximação que é nossa, entendo que os sentidos organizam as ações; por isso, as narrativas dos profissionais ocupam o centro da produção de dados.</w:t>
+              <w:t>Daí a questão que orienta a pesquisa: como a Política Nacional de Educação Digital é recontextualizada e encenada pelos profissionais da educação de Tibau do Sul (RN), da Secretaria Municipal de Educação à escola de Pipa, atravessados pelas culturas profissionais, pelas condições materiais e institucionais e pelas especificidades do lugar, e que formas de atuação emergem desse processo, entre acomodações, negociações, ressignificações e resistências? O infográfico mostra como as partes se ligam. A resistência é uma possibilidade a examinar nos dados, sem ser pressuposta. E, com Stuart Hall, numa aproximação nossa, entendo que os sentidos organizam as ações; por isso, as narrativas dos profissionais ocupam o centro da produção de dados.</w:t>
             </w:r>
           </w:p>
         </w:tc>
@@ -2565,7 +2565,7 @@
         <w:t xml:space="preserve">Ideia central: </w:t>
       </w:r>
       <w:r>
-        <w:t>A questão em cadeia, como no infográfico: a PNED é recontextualizada pela SME para um território diverso, encenada na escola de Pipa, atravessada por culturas profissionais, condições e lugar, e produz formas de atuação; a resistência fica como hipótese.</w:t>
+        <w:t>A questão, reduzida a pedido da orientadora, em cadeia como no infográfico: a PNED é recontextualizada e encenada pelos profissionais, da SME à escola de Pipa, atravessados por culturas profissionais, condições e lugar, e produz formas de atuação; a resistência fica como hipótese.</w:t>
       </w:r>
     </w:p>
     <w:p>
@@ -2574,6 +2574,20 @@
           <w:b/>
         </w:rPr>
         <w:t>Conceitos</w:t>
+      </w:r>
+    </w:p>
+    <w:p>
+      <w:pPr>
+        <w:pStyle w:val="ListBullet"/>
+      </w:pPr>
+      <w:r>
+        <w:rPr>
+          <w:b/>
+        </w:rPr>
+        <w:t xml:space="preserve">Questão revisada: </w:t>
+      </w:r>
+      <w:r>
+        <w:t>Como a Política Nacional de Educação Digital é recontextualizada e encenada pelos profissionais da educação de Tibau do Sul (RN), da Secretaria Municipal de Educação à escola de Pipa, atravessados pelas culturas profissionais, pelas condições materiais e institucionais e pelas especificidades do lugar, e que formas de atuação emergem desse processo, entre acomodações, negociações, ressignificações e resistências?</w:t>
       </w:r>
     </w:p>
     <w:p>
@@ -2712,7 +2726,7 @@
           <w:color w:val="555555"/>
           <w:sz w:val="20"/>
         </w:rPr>
-        <w:t>95 s  ·  ao final: 04:35</w:t>
+        <w:t>90 s  ·  ao final: 04:15</w:t>
       </w:r>
     </w:p>
     <w:p>
@@ -2970,7 +2984,7 @@
           <w:color w:val="555555"/>
           <w:sz w:val="20"/>
         </w:rPr>
-        <w:t>60 s  ·  ao final: 05:35</w:t>
+        <w:t>60 s  ·  ao final: 05:15</w:t>
       </w:r>
     </w:p>
     <w:tbl>
@@ -3194,7 +3208,7 @@
           <w:color w:val="555555"/>
           <w:sz w:val="20"/>
         </w:rPr>
-        <w:t>55 s  ·  ao final: 06:30</w:t>
+        <w:t>55 s  ·  ao final: 06:10</w:t>
       </w:r>
     </w:p>
     <w:tbl>
@@ -3431,7 +3445,7 @@
           <w:color w:val="555555"/>
           <w:sz w:val="20"/>
         </w:rPr>
-        <w:t>10 s  ·  ao final: 06:40</w:t>
+        <w:t>10 s  ·  ao final: 06:20</w:t>
       </w:r>
     </w:p>
     <w:tbl>
@@ -3514,7 +3528,7 @@
           <w:color w:val="555555"/>
           <w:sz w:val="20"/>
         </w:rPr>
-        <w:t>60 s  ·  ao final: 07:40</w:t>
+        <w:t>60 s  ·  ao final: 07:20</w:t>
       </w:r>
     </w:p>
     <w:tbl>
@@ -3763,7 +3777,7 @@
           <w:color w:val="555555"/>
           <w:sz w:val="20"/>
         </w:rPr>
-        <w:t>80 s  ·  ao final: 09:00</w:t>
+        <w:t>80 s  ·  ao final: 08:40</w:t>
       </w:r>
     </w:p>
     <w:p>
@@ -3981,7 +3995,7 @@
           <w:color w:val="555555"/>
           <w:sz w:val="20"/>
         </w:rPr>
-        <w:t>10 s  ·  ao final: 09:10</w:t>
+        <w:t>10 s  ·  ao final: 08:50</w:t>
       </w:r>
     </w:p>
     <w:tbl>
@@ -4064,7 +4078,7 @@
           <w:color w:val="555555"/>
           <w:sz w:val="20"/>
         </w:rPr>
-        <w:t>85 s  ·  ao final: 10:35</w:t>
+        <w:t>85 s  ·  ao final: 10:15</w:t>
       </w:r>
     </w:p>
     <w:p>
@@ -4350,7 +4364,7 @@
           <w:color w:val="555555"/>
           <w:sz w:val="20"/>
         </w:rPr>
-        <w:t>80 s  ·  ao final: 11:55</w:t>
+        <w:t>80 s  ·  ao final: 11:35</w:t>
       </w:r>
     </w:p>
     <w:tbl>
@@ -4602,7 +4616,7 @@
           <w:color w:val="555555"/>
           <w:sz w:val="20"/>
         </w:rPr>
-        <w:t>70 s  ·  ao final: 13:05</w:t>
+        <w:t>65 s  ·  ao final: 12:40</w:t>
       </w:r>
     </w:p>
     <w:p>
@@ -4864,24 +4878,11 @@
       </w:r>
     </w:p>
     <w:p>
-      <w:r>
-        <w:br w:type="page"/>
-      </w:r>
-    </w:p>
-    <w:p>
-      <w:pPr>
-        <w:pStyle w:val="Heading1"/>
-      </w:pPr>
-      <w:r>
-        <w:t>METODOLOGIA</w:t>
-      </w:r>
-    </w:p>
-    <w:p>
       <w:pPr>
         <w:pStyle w:val="Heading2"/>
       </w:pPr>
       <w:r>
-        <w:t>Slide 15 · Divisor: Metodologia</w:t>
+        <w:t>Slide 15 · Conceitos e teóricos que guiam a tese</w:t>
       </w:r>
     </w:p>
     <w:p>
@@ -4890,7 +4891,278 @@
           <w:color w:val="555555"/>
           <w:sz w:val="20"/>
         </w:rPr>
-        <w:t>10 s  ·  ao final: 13:15</w:t>
+        <w:t>43 s  ·  ao final: 13:23</w:t>
+      </w:r>
+    </w:p>
+    <w:p>
+      <w:r>
+        <w:rPr>
+          <w:i/>
+          <w:color w:val="555555"/>
+        </w:rPr>
+        <w:t>[Apontar as quatro colunas da esquerda para a direita e, por fim, a faixa amarela.]</w:t>
+      </w:r>
+    </w:p>
+    <w:tbl>
+      <w:tblPr>
+        <w:tblStyle w:val="TableGrid"/>
+        <w:tblW w:type="auto" w:w="0"/>
+        <w:tblLook w:firstColumn="1" w:firstRow="1" w:lastColumn="0" w:lastRow="0" w:noHBand="0" w:noVBand="1" w:val="04A0"/>
+      </w:tblPr>
+      <w:tblGrid>
+        <w:gridCol w:w="9632"/>
+      </w:tblGrid>
+      <w:tr>
+        <w:tc>
+          <w:tcPr>
+            <w:tcW w:type="dxa" w:w="9632"/>
+            <w:shd w:val="clear" w:color="auto" w:fill="EEF0FB"/>
+          </w:tcPr>
+          <w:p>
+            <w:pPr>
+              <w:spacing w:line="300" w:lineRule="auto"/>
+              <w:jc w:val="both"/>
+            </w:pPr>
+            <w:r/>
+            <w:r>
+              <w:rPr>
+                <w:sz w:val="24"/>
+              </w:rPr>
+              <w:t>Antes da metodologia, reúno os conceitos e os autores que guiam a tese. A política é lida pelo ciclo de políticas, de Bowe, Ball e Gold, com Mainardes, e pela teoria da atuação de Ball, Maguire e Braun. Os profissionais, pelas culturas profissionais de Hargreaves, pela performatividade em Ball, pelo poder em Foucault e pelos sentidos em Hall. O território, por Milton Santos e Doreen Massey e pelo habitar em Schlemmer, Backes e Palagi. As crianças, pelo Comentário Geral nº 25 da ONU. Daí nascem as três formulações da tese.</w:t>
+            </w:r>
+          </w:p>
+        </w:tc>
+      </w:tr>
+    </w:tbl>
+    <w:p>
+      <w:pPr>
+        <w:spacing w:after="0"/>
+      </w:pPr>
+    </w:p>
+    <w:p>
+      <w:pPr>
+        <w:pStyle w:val="Heading3"/>
+      </w:pPr>
+      <w:r>
+        <w:t>Estudo dirigido</w:t>
+      </w:r>
+    </w:p>
+    <w:p>
+      <w:r>
+        <w:rPr>
+          <w:b/>
+        </w:rPr>
+        <w:t>Mapa conceitual</w:t>
+      </w:r>
+    </w:p>
+    <w:p>
+      <w:pPr>
+        <w:jc w:val="center"/>
+      </w:pPr>
+      <w:r>
+        <w:drawing>
+          <wp:inline xmlns:a="http://schemas.openxmlformats.org/drawingml/2006/main" xmlns:pic="http://schemas.openxmlformats.org/drawingml/2006/picture">
+            <wp:extent cx="5903999" cy="3306239"/>
+            <wp:docPr id="12" name="Picture 12"/>
+            <wp:cNvGraphicFramePr>
+              <a:graphicFrameLocks noChangeAspect="1"/>
+            </wp:cNvGraphicFramePr>
+            <a:graphic>
+              <a:graphicData uri="http://schemas.openxmlformats.org/drawingml/2006/picture">
+                <pic:pic>
+                  <pic:nvPicPr>
+                    <pic:cNvPr id="0" name="mapa_15.png"/>
+                    <pic:cNvPicPr/>
+                  </pic:nvPicPr>
+                  <pic:blipFill>
+                    <a:blip r:embed="rId20"/>
+                    <a:stretch>
+                      <a:fillRect/>
+                    </a:stretch>
+                  </pic:blipFill>
+                  <pic:spPr>
+                    <a:xfrm>
+                      <a:off x="0" y="0"/>
+                      <a:ext cx="5903999" cy="3306239"/>
+                    </a:xfrm>
+                    <a:prstGeom prst="rect"/>
+                  </pic:spPr>
+                </pic:pic>
+              </a:graphicData>
+            </a:graphic>
+          </wp:inline>
+        </w:drawing>
+      </w:r>
+    </w:p>
+    <w:p>
+      <w:r>
+        <w:rPr>
+          <w:b/>
+        </w:rPr>
+        <w:t xml:space="preserve">Ideia central: </w:t>
+      </w:r>
+      <w:r>
+        <w:t>Síntese do quadro teórico em quatro frentes (política, profissionais, território, crianças) e as três formulações próprias da tese.</w:t>
+      </w:r>
+    </w:p>
+    <w:p>
+      <w:r>
+        <w:rPr>
+          <w:b/>
+        </w:rPr>
+        <w:t>Conceitos</w:t>
+      </w:r>
+    </w:p>
+    <w:p>
+      <w:pPr>
+        <w:pStyle w:val="ListBullet"/>
+      </w:pPr>
+      <w:r>
+        <w:rPr>
+          <w:b/>
+        </w:rPr>
+        <w:t xml:space="preserve">A política: </w:t>
+      </w:r>
+      <w:r>
+        <w:t>Ciclo de políticas (BOWE; BALL; GOLD, 1992; MAINARDES, 2006); atuação como interpretar e traduzir (BALL; MAGUIRE; BRAUN, 2016); recontextualização, a política "recriada" na prática (BOWE; BALL; GOLD, 1992, p. 22).</w:t>
+      </w:r>
+    </w:p>
+    <w:p>
+      <w:pPr>
+        <w:pStyle w:val="ListBullet"/>
+      </w:pPr>
+      <w:r>
+        <w:rPr>
+          <w:b/>
+        </w:rPr>
+        <w:t xml:space="preserve">Os profissionais: </w:t>
+      </w:r>
+      <w:r>
+        <w:t>Culturas profissionais (HARGREAVES, 2005); performatividade e fabricação (BALL, 2002; 2008); poder e resistência (FOUCAULT, 1999; BALL, 2011; FREIRE, 2019); sentidos que organizam ações (HALL, 2006).</w:t>
+      </w:r>
+    </w:p>
+    <w:p>
+      <w:pPr>
+        <w:pStyle w:val="ListBullet"/>
+      </w:pPr>
+      <w:r>
+        <w:rPr>
+          <w:b/>
+        </w:rPr>
+        <w:t xml:space="preserve">O território: </w:t>
+      </w:r>
+      <w:r>
+        <w:t>Território usado e rugosidades (SANTOS, 1999; 2006; 2012); lugar como encontro de trajetórias (MASSEY, 2008); habitar e Educação OnLIFE (SCHLEMMER; BACKES; PALAGI, 2021; DI FELICE, 2009).</w:t>
+      </w:r>
+    </w:p>
+    <w:p>
+      <w:pPr>
+        <w:pStyle w:val="ListBullet"/>
+      </w:pPr>
+      <w:r>
+        <w:rPr>
+          <w:b/>
+        </w:rPr>
+        <w:t xml:space="preserve">As crianças: </w:t>
+      </w:r>
+      <w:r>
+        <w:t>Provisão, proteção e participação no ambiente digital (ONU, 2021); direitos do eixo à participação e à proteção dos dados (BRASIL, 2023, art. 3º, III e IV).</w:t>
+      </w:r>
+    </w:p>
+    <w:p>
+      <w:pPr>
+        <w:pStyle w:val="ListBullet"/>
+      </w:pPr>
+      <w:r>
+        <w:rPr>
+          <w:b/>
+        </w:rPr>
+        <w:t xml:space="preserve">Formulações da tese: </w:t>
+      </w:r>
+      <w:r>
+        <w:t>Habitar o digital (cap. 3), rugosidade tecnológica (cap. 6) e vazio material (cap. 5).</w:t>
+      </w:r>
+    </w:p>
+    <w:p>
+      <w:r>
+        <w:rPr>
+          <w:b/>
+        </w:rPr>
+        <w:t xml:space="preserve">Autores e obras: </w:t>
+      </w:r>
+      <w:r>
+        <w:t>Os mesmos autores dos slides 12 a 14, reunidos.</w:t>
+      </w:r>
+    </w:p>
+    <w:p>
+      <w:r>
+        <w:rPr>
+          <w:b/>
+        </w:rPr>
+        <w:t xml:space="preserve">Onde aprofundar: </w:t>
+      </w:r>
+      <w:r>
+        <w:t>Cap. 3, seções 3.1 a 3.6.</w:t>
+      </w:r>
+    </w:p>
+    <w:p>
+      <w:r>
+        <w:rPr>
+          <w:b/>
+        </w:rPr>
+        <w:t>Perguntas de estudo</w:t>
+      </w:r>
+    </w:p>
+    <w:p>
+      <w:pPr>
+        <w:pStyle w:val="ListBullet"/>
+      </w:pPr>
+      <w:r>
+        <w:rPr>
+          <w:i/>
+        </w:rPr>
+        <w:t>Como autores de tradições diferentes conversam na tese? (o ciclo de políticas organiza; a atuação explica o contexto da prática; o território situa; os direitos das crianças dão o critério de leitura).</w:t>
+      </w:r>
+    </w:p>
+    <w:p>
+      <w:pPr>
+        <w:pStyle w:val="ListBullet"/>
+      </w:pPr>
+      <w:r>
+        <w:rPr>
+          <w:i/>
+        </w:rPr>
+        <w:t>Por que Hall aparece entre os teóricos? (sentidos que organizam ações; aproximação declarada, slide 4).</w:t>
+      </w:r>
+    </w:p>
+    <w:p>
+      <w:r>
+        <w:br w:type="page"/>
+      </w:r>
+    </w:p>
+    <w:p>
+      <w:pPr>
+        <w:pStyle w:val="Heading1"/>
+      </w:pPr>
+      <w:r>
+        <w:t>METODOLOGIA</w:t>
+      </w:r>
+    </w:p>
+    <w:p>
+      <w:pPr>
+        <w:pStyle w:val="Heading2"/>
+      </w:pPr>
+      <w:r>
+        <w:t>Slide 16 · Divisor: Metodologia</w:t>
+      </w:r>
+    </w:p>
+    <w:p>
+      <w:r>
+        <w:rPr>
+          <w:color w:val="555555"/>
+          <w:sz w:val="20"/>
+        </w:rPr>
+        <w:t>10 s  ·  ao final: 13:33</w:t>
       </w:r>
     </w:p>
     <w:tbl>
@@ -4964,7 +5236,7 @@
         <w:pStyle w:val="Heading2"/>
       </w:pPr>
       <w:r>
-        <w:t>Slide 16 · Desenho e participantes</w:t>
+        <w:t>Slide 17 · Desenho e participantes</w:t>
       </w:r>
     </w:p>
     <w:p>
@@ -4973,7 +5245,7 @@
           <w:color w:val="555555"/>
           <w:sz w:val="20"/>
         </w:rPr>
-        <w:t>50 s  ·  ao final: 14:05</w:t>
+        <w:t>50 s  ·  ao final: 14:23</w:t>
       </w:r>
     </w:p>
     <w:tbl>
@@ -5002,256 +5274,6 @@
                 <w:sz w:val="24"/>
               </w:rPr>
               <w:t>A pesquisa é qualitativa e interpretativa, como a define Minayo, e se organiza como estudo de caso único, nos termos de Yin: o caso é a encenação da PNED na escola de Pipa. O percurso em funil passa pelo território municipal e pelos documentos da Secretaria antes de chegar a Pipa e à escola. Não faremos observação de aula, delimitação que Ball, Maguire e Braun também adotaram. Participam um técnico da Secretaria, cuja entrevista abre o campo, e 24 profissionais da escola. A escola tem 351 crianças em quinze turmas, que não participam da produção de dados.</w:t>
-            </w:r>
-          </w:p>
-        </w:tc>
-      </w:tr>
-    </w:tbl>
-    <w:p>
-      <w:pPr>
-        <w:spacing w:after="0"/>
-      </w:pPr>
-    </w:p>
-    <w:p>
-      <w:pPr>
-        <w:pStyle w:val="Heading3"/>
-      </w:pPr>
-      <w:r>
-        <w:t>Estudo dirigido</w:t>
-      </w:r>
-    </w:p>
-    <w:p>
-      <w:r>
-        <w:rPr>
-          <w:b/>
-        </w:rPr>
-        <w:t>Mapa conceitual</w:t>
-      </w:r>
-    </w:p>
-    <w:p>
-      <w:pPr>
-        <w:jc w:val="center"/>
-      </w:pPr>
-      <w:r>
-        <w:drawing>
-          <wp:inline xmlns:a="http://schemas.openxmlformats.org/drawingml/2006/main" xmlns:pic="http://schemas.openxmlformats.org/drawingml/2006/picture">
-            <wp:extent cx="5903999" cy="2804400"/>
-            <wp:docPr id="12" name="Picture 12"/>
-            <wp:cNvGraphicFramePr>
-              <a:graphicFrameLocks noChangeAspect="1"/>
-            </wp:cNvGraphicFramePr>
-            <a:graphic>
-              <a:graphicData uri="http://schemas.openxmlformats.org/drawingml/2006/picture">
-                <pic:pic>
-                  <pic:nvPicPr>
-                    <pic:cNvPr id="0" name="mapa_16.png"/>
-                    <pic:cNvPicPr/>
-                  </pic:nvPicPr>
-                  <pic:blipFill>
-                    <a:blip r:embed="rId20"/>
-                    <a:stretch>
-                      <a:fillRect/>
-                    </a:stretch>
-                  </pic:blipFill>
-                  <pic:spPr>
-                    <a:xfrm>
-                      <a:off x="0" y="0"/>
-                      <a:ext cx="5903999" cy="2804400"/>
-                    </a:xfrm>
-                    <a:prstGeom prst="rect"/>
-                  </pic:spPr>
-                </pic:pic>
-              </a:graphicData>
-            </a:graphic>
-          </wp:inline>
-        </w:drawing>
-      </w:r>
-    </w:p>
-    <w:p>
-      <w:r>
-        <w:rPr>
-          <w:b/>
-        </w:rPr>
-        <w:t xml:space="preserve">Ideia central: </w:t>
-      </w:r>
-      <w:r>
-        <w:t>Estudo de caso único, qualitativo: o caso é a encenação da PNED na escola de Pipa; o percurso em funil passa pelo território e pela SME. Participam 24 profissionais e um técnico da SME.</w:t>
-      </w:r>
-    </w:p>
-    <w:p>
-      <w:r>
-        <w:rPr>
-          <w:b/>
-        </w:rPr>
-        <w:t>Conceitos</w:t>
-      </w:r>
-    </w:p>
-    <w:p>
-      <w:pPr>
-        <w:pStyle w:val="ListBullet"/>
-      </w:pPr>
-      <w:r>
-        <w:rPr>
-          <w:b/>
-        </w:rPr>
-        <w:t xml:space="preserve">Abordagem qualitativa: </w:t>
-      </w:r>
-      <w:r>
-        <w:t>Trabalha com sentidos, experiências, valores e interpretações (MINAYO, 2009).</w:t>
-      </w:r>
-    </w:p>
-    <w:p>
-      <w:pPr>
-        <w:pStyle w:val="ListBullet"/>
-      </w:pPr>
-      <w:r>
-        <w:rPr>
-          <w:b/>
-        </w:rPr>
-        <w:t xml:space="preserve">Estudo de caso único: </w:t>
-      </w:r>
-      <w:r>
-        <w:t>Fenômeno contemporâneo em contexto real, com limites pouco definidos (YIN, 2001). O caso é a escola de Pipa; a rede e a SME entram como contexto, sem "unidades incorporadas".</w:t>
-      </w:r>
-    </w:p>
-    <w:p>
-      <w:pPr>
-        <w:pStyle w:val="ListBullet"/>
-      </w:pPr>
-      <w:r>
-        <w:rPr>
-          <w:b/>
-        </w:rPr>
-        <w:t xml:space="preserve">Delimitação sem observação de aula: </w:t>
-      </w:r>
-      <w:r>
-        <w:t>Mesma delimitação de Ball, Maguire e Braun: "temos de confiar nos relatos dos professores" (2016, p. 49).</w:t>
-      </w:r>
-    </w:p>
-    <w:p>
-      <w:pPr>
-        <w:pStyle w:val="ListBullet"/>
-      </w:pPr>
-      <w:r>
-        <w:rPr>
-          <w:b/>
-        </w:rPr>
-        <w:t xml:space="preserve">Análise temática reflexiva: </w:t>
-      </w:r>
-      <w:r>
-        <w:t>A subjetividade de quem analisa é recurso e precisa ser explicitada (BRAUN; CLARKE, 2006, 2019).</w:t>
-      </w:r>
-    </w:p>
-    <w:p>
-      <w:pPr>
-        <w:pStyle w:val="ListBullet"/>
-      </w:pPr>
-      <w:r>
-        <w:rPr>
-          <w:b/>
-        </w:rPr>
-        <w:t xml:space="preserve">Participantes: </w:t>
-      </w:r>
-      <w:r>
-        <w:t>Diretor, vice-diretora, coordenadora pedagógica, 4 do apoio pedagógico, 15 regentes e 2 no apoio à recomposição de aula; mais 1 técnico da SME. 351 crianças em 15 turmas (TIBAU DO SUL, 2026), que não participam da produção de dados.</w:t>
-      </w:r>
-    </w:p>
-    <w:p>
-      <w:r>
-        <w:rPr>
-          <w:b/>
-        </w:rPr>
-        <w:t xml:space="preserve">Autores e obras: </w:t>
-      </w:r>
-      <w:r>
-        <w:t>Minayo (2009); Yin (2001); Braun e Clarke (2006; 2019); Tibau do Sul (2026), relatório de turmas.</w:t>
-      </w:r>
-    </w:p>
-    <w:p>
-      <w:r>
-        <w:rPr>
-          <w:b/>
-        </w:rPr>
-        <w:t xml:space="preserve">Onde aprofundar: </w:t>
-      </w:r>
-      <w:r>
-        <w:t>Cap. 4, seções 4.1 (posicionamento, abordagem, estudo de caso) e 4.4.1 (participantes).</w:t>
-      </w:r>
-    </w:p>
-    <w:p>
-      <w:r>
-        <w:rPr>
-          <w:b/>
-        </w:rPr>
-        <w:t>Perguntas de estudo</w:t>
-      </w:r>
-    </w:p>
-    <w:p>
-      <w:pPr>
-        <w:pStyle w:val="ListBullet"/>
-      </w:pPr>
-      <w:r>
-        <w:rPr>
-          <w:i/>
-        </w:rPr>
-        <w:t>Como a proximidade da pesquisadora com a rede é controlada? (4.1.2).</w:t>
-      </w:r>
-    </w:p>
-    <w:p>
-      <w:r>
-        <w:rPr>
-          <w:b/>
-          <w:color w:val="B03A2E"/>
-        </w:rPr>
-        <w:t xml:space="preserve">Cuidado: </w:t>
-      </w:r>
-      <w:r>
-        <w:t>Fato: os números de participantes e crianças vêm do relatório de turmas (TIBAU DO SUL, 2026).</w:t>
-      </w:r>
-    </w:p>
-    <w:p>
-      <w:pPr>
-        <w:pStyle w:val="Heading2"/>
-      </w:pPr>
-      <w:r>
-        <w:t>Slide 17 · Construção dos dados</w:t>
-      </w:r>
-    </w:p>
-    <w:p>
-      <w:r>
-        <w:rPr>
-          <w:color w:val="555555"/>
-          <w:sz w:val="20"/>
-        </w:rPr>
-        <w:t>50 s  ·  ao final: 14:55</w:t>
-      </w:r>
-    </w:p>
-    <w:tbl>
-      <w:tblPr>
-        <w:tblStyle w:val="TableGrid"/>
-        <w:tblW w:type="auto" w:w="0"/>
-        <w:tblLook w:firstColumn="1" w:firstRow="1" w:lastColumn="0" w:lastRow="0" w:noHBand="0" w:noVBand="1" w:val="04A0"/>
-      </w:tblPr>
-      <w:tblGrid>
-        <w:gridCol w:w="9632"/>
-      </w:tblGrid>
-      <w:tr>
-        <w:tc>
-          <w:tcPr>
-            <w:tcW w:type="dxa" w:w="9632"/>
-            <w:shd w:val="clear" w:color="auto" w:fill="EEF0FB"/>
-          </w:tcPr>
-          <w:p>
-            <w:pPr>
-              <w:spacing w:line="300" w:lineRule="auto"/>
-              <w:jc w:val="both"/>
-            </w:pPr>
-            <w:r/>
-            <w:r>
-              <w:rPr>
-                <w:sz w:val="24"/>
-              </w:rPr>
-              <w:t>Os dados serão construídos em cinco movimentos, da rede à escola. O primeiro é a análise documental: o plano da rede, o currículo e as formações da Secretaria e, na escola, o Projeto Político-Pedagógico e os planos, documentos já solicitados ao técnico e à direção. O segundo lê o território municipal com dados do IBGE e do Censo Escolar e reúne as 38 imagens de Pipa e da escola. O terceiro é o questionário; o quarto, as entrevistas, começando pelo técnico; o quinto, a análise e a devolutiva. A emenda ao Comitê de Ética, com a Secretaria como coparticipante, ainda será submetida.</w:t>
             </w:r>
           </w:p>
         </w:tc>
@@ -5325,7 +5347,7 @@
         <w:t xml:space="preserve">Ideia central: </w:t>
       </w:r>
       <w:r>
-        <w:t>Cinco movimentos e o campo; documentos já solicitados à direção e à Secretaria.</w:t>
+        <w:t>Estudo de caso único, qualitativo: o caso é a encenação da PNED na escola de Pipa; o percurso em funil passa pelo território e pela SME. Participam 24 profissionais e um técnico da SME.</w:t>
       </w:r>
     </w:p>
     <w:p>
@@ -5344,10 +5366,10 @@
         <w:rPr>
           <w:b/>
         </w:rPr>
-        <w:t xml:space="preserve">Análise documental: </w:t>
-      </w:r>
-      <w:r>
-        <w:t>Lida em diálogo com a ACP, por matriz orientada pelos objetivos (4.4.3).</w:t>
+        <w:t xml:space="preserve">Abordagem qualitativa: </w:t>
+      </w:r>
+      <w:r>
+        <w:t>Trabalha com sentidos, experiências, valores e interpretações (MINAYO, 2009).</w:t>
       </w:r>
     </w:p>
     <w:p>
@@ -5358,10 +5380,10 @@
         <w:rPr>
           <w:b/>
         </w:rPr>
-        <w:t xml:space="preserve">Território: </w:t>
-      </w:r>
-      <w:r>
-        <w:t>IBGE e Censo Escolar por localidade e 38 imagens de Pipa e da escola, lidas como evidência da configuração material visível.</w:t>
+        <w:t xml:space="preserve">Estudo de caso único: </w:t>
+      </w:r>
+      <w:r>
+        <w:t>Fenômeno contemporâneo em contexto real, com limites pouco definidos (YIN, 2001). O caso é a escola de Pipa; a rede e a SME entram como contexto, sem "unidades incorporadas".</w:t>
       </w:r>
     </w:p>
     <w:p>
@@ -5372,10 +5394,10 @@
         <w:rPr>
           <w:b/>
         </w:rPr>
-        <w:t xml:space="preserve">Registro iconográfico: </w:t>
-      </w:r>
-      <w:r>
-        <w:t>Imagens como evidência da configuração material visível, sem valor de prova sobre práticas (4.4.4).</w:t>
+        <w:t xml:space="preserve">Delimitação sem observação de aula: </w:t>
+      </w:r>
+      <w:r>
+        <w:t>Mesma delimitação de Ball, Maguire e Braun: "temos de confiar nos relatos dos professores" (2016, p. 49).</w:t>
       </w:r>
     </w:p>
     <w:p>
@@ -5386,10 +5408,10 @@
         <w:rPr>
           <w:b/>
         </w:rPr>
-        <w:t xml:space="preserve">Lentes sensibilizadoras: </w:t>
-      </w:r>
-      <w:r>
-        <w:t>Conceitos que orientam a primeira leitura dos dados sem se tornarem categorias fechadas (4.5.1).</w:t>
+        <w:t xml:space="preserve">Análise temática reflexiva: </w:t>
+      </w:r>
+      <w:r>
+        <w:t>A subjetividade de quem analisa é recurso e precisa ser explicitada (BRAUN; CLARKE, 2006, 2019).</w:t>
       </w:r>
     </w:p>
     <w:p>
@@ -5400,10 +5422,10 @@
         <w:rPr>
           <w:b/>
         </w:rPr>
-        <w:t xml:space="preserve">Ética: </w:t>
-      </w:r>
-      <w:r>
-        <w:t>Emenda ao protocolo aprovado no CEP; TCLE; pseudônimos; Res. CNS nº 466/2012 e nº 510/2016.</w:t>
+        <w:t xml:space="preserve">Participantes: </w:t>
+      </w:r>
+      <w:r>
+        <w:t>Diretor, vice-diretora, coordenadora pedagógica, 4 do apoio pedagógico, 15 regentes e 2 no apoio à recomposição de aula; mais 1 técnico da SME. 351 crianças em 15 turmas (TIBAU DO SUL, 2026), que não participam da produção de dados.</w:t>
       </w:r>
     </w:p>
     <w:p>
@@ -5414,7 +5436,7 @@
         <w:t xml:space="preserve">Autores e obras: </w:t>
       </w:r>
       <w:r>
-        <w:t>Mainardes (2006); Braun e Clarke (2006; 2019); BRASIL (2012; 2016).</w:t>
+        <w:t>Minayo (2009); Yin (2001); Braun e Clarke (2006; 2019); Tibau do Sul (2026), relatório de turmas.</w:t>
       </w:r>
     </w:p>
     <w:p>
@@ -5425,7 +5447,7 @@
         <w:t xml:space="preserve">Onde aprofundar: </w:t>
       </w:r>
       <w:r>
-        <w:t>Cap. 4, seções 4.4.2 a 4.4.6, 4.5.1, 4.5.2 e 4.5.4 (cronograma); Apêndices D (questionário) e E (roteiros).</w:t>
+        <w:t>Cap. 4, seções 4.1 (posicionamento, abordagem, estudo de caso) e 4.4.1 (participantes).</w:t>
       </w:r>
     </w:p>
     <w:p>
@@ -5444,7 +5466,7 @@
         <w:rPr>
           <w:i/>
         </w:rPr>
-        <w:t>Qual a função do questionário, se não há generalização estatística? (caracterizar e contextualizar, 4.4.5).</w:t>
+        <w:t>Como a proximidade da pesquisadora com a rede é controlada? (4.1.2).</w:t>
       </w:r>
     </w:p>
     <w:p>
@@ -5456,20 +5478,7 @@
         <w:t xml:space="preserve">Cuidado: </w:t>
       </w:r>
       <w:r>
-        <w:t>Fato: a emenda ao CEP ainda não foi submetida; dizer "será submetida".</w:t>
-      </w:r>
-    </w:p>
-    <w:p>
-      <w:r>
-        <w:br w:type="page"/>
-      </w:r>
-    </w:p>
-    <w:p>
-      <w:pPr>
-        <w:pStyle w:val="Heading1"/>
-      </w:pPr>
-      <w:r>
-        <w:t>AGENDA GLOBAL E PNED</w:t>
+        <w:t>Fato: os números de participantes e crianças vêm do relatório de turmas (TIBAU DO SUL, 2026).</w:t>
       </w:r>
     </w:p>
     <w:p>
@@ -5477,7 +5486,7 @@
         <w:pStyle w:val="Heading2"/>
       </w:pPr>
       <w:r>
-        <w:t>Slide 18 · Divisor: Agenda global e PNED</w:t>
+        <w:t>Slide 18 · Construção dos dados</w:t>
       </w:r>
     </w:p>
     <w:p>
@@ -5486,7 +5495,270 @@
           <w:color w:val="555555"/>
           <w:sz w:val="20"/>
         </w:rPr>
-        <w:t>10 s  ·  ao final: 15:05</w:t>
+        <w:t>50 s  ·  ao final: 15:13</w:t>
+      </w:r>
+    </w:p>
+    <w:tbl>
+      <w:tblPr>
+        <w:tblStyle w:val="TableGrid"/>
+        <w:tblW w:type="auto" w:w="0"/>
+        <w:tblLook w:firstColumn="1" w:firstRow="1" w:lastColumn="0" w:lastRow="0" w:noHBand="0" w:noVBand="1" w:val="04A0"/>
+      </w:tblPr>
+      <w:tblGrid>
+        <w:gridCol w:w="9632"/>
+      </w:tblGrid>
+      <w:tr>
+        <w:tc>
+          <w:tcPr>
+            <w:tcW w:type="dxa" w:w="9632"/>
+            <w:shd w:val="clear" w:color="auto" w:fill="EEF0FB"/>
+          </w:tcPr>
+          <w:p>
+            <w:pPr>
+              <w:spacing w:line="300" w:lineRule="auto"/>
+              <w:jc w:val="both"/>
+            </w:pPr>
+            <w:r/>
+            <w:r>
+              <w:rPr>
+                <w:sz w:val="24"/>
+              </w:rPr>
+              <w:t>Os dados serão construídos em cinco movimentos, da rede à escola. O primeiro é a análise documental: o plano da rede, o currículo e as formações da Secretaria e, na escola, o Projeto Político-Pedagógico e os planos, documentos já solicitados ao técnico e à direção. O segundo lê o território municipal com dados do IBGE e do Censo Escolar e reúne as 38 imagens de Pipa e da escola. O terceiro é o questionário; o quarto, as entrevistas, começando pelo técnico; o quinto, a análise e a devolutiva. A emenda ao Comitê de Ética, com a Secretaria como coparticipante, ainda será submetida.</w:t>
+            </w:r>
+          </w:p>
+        </w:tc>
+      </w:tr>
+    </w:tbl>
+    <w:p>
+      <w:pPr>
+        <w:spacing w:after="0"/>
+      </w:pPr>
+    </w:p>
+    <w:p>
+      <w:pPr>
+        <w:pStyle w:val="Heading3"/>
+      </w:pPr>
+      <w:r>
+        <w:t>Estudo dirigido</w:t>
+      </w:r>
+    </w:p>
+    <w:p>
+      <w:r>
+        <w:rPr>
+          <w:b/>
+        </w:rPr>
+        <w:t>Mapa conceitual</w:t>
+      </w:r>
+    </w:p>
+    <w:p>
+      <w:pPr>
+        <w:jc w:val="center"/>
+      </w:pPr>
+      <w:r>
+        <w:drawing>
+          <wp:inline xmlns:a="http://schemas.openxmlformats.org/drawingml/2006/main" xmlns:pic="http://schemas.openxmlformats.org/drawingml/2006/picture">
+            <wp:extent cx="5903999" cy="2804400"/>
+            <wp:docPr id="14" name="Picture 14"/>
+            <wp:cNvGraphicFramePr>
+              <a:graphicFrameLocks noChangeAspect="1"/>
+            </wp:cNvGraphicFramePr>
+            <a:graphic>
+              <a:graphicData uri="http://schemas.openxmlformats.org/drawingml/2006/picture">
+                <pic:pic>
+                  <pic:nvPicPr>
+                    <pic:cNvPr id="0" name="mapa_18.png"/>
+                    <pic:cNvPicPr/>
+                  </pic:nvPicPr>
+                  <pic:blipFill>
+                    <a:blip r:embed="rId22"/>
+                    <a:stretch>
+                      <a:fillRect/>
+                    </a:stretch>
+                  </pic:blipFill>
+                  <pic:spPr>
+                    <a:xfrm>
+                      <a:off x="0" y="0"/>
+                      <a:ext cx="5903999" cy="2804400"/>
+                    </a:xfrm>
+                    <a:prstGeom prst="rect"/>
+                  </pic:spPr>
+                </pic:pic>
+              </a:graphicData>
+            </a:graphic>
+          </wp:inline>
+        </w:drawing>
+      </w:r>
+    </w:p>
+    <w:p>
+      <w:r>
+        <w:rPr>
+          <w:b/>
+        </w:rPr>
+        <w:t xml:space="preserve">Ideia central: </w:t>
+      </w:r>
+      <w:r>
+        <w:t>Cinco movimentos e o campo; documentos já solicitados à direção e à Secretaria.</w:t>
+      </w:r>
+    </w:p>
+    <w:p>
+      <w:r>
+        <w:rPr>
+          <w:b/>
+        </w:rPr>
+        <w:t>Conceitos</w:t>
+      </w:r>
+    </w:p>
+    <w:p>
+      <w:pPr>
+        <w:pStyle w:val="ListBullet"/>
+      </w:pPr>
+      <w:r>
+        <w:rPr>
+          <w:b/>
+        </w:rPr>
+        <w:t xml:space="preserve">Análise documental: </w:t>
+      </w:r>
+      <w:r>
+        <w:t>Lida em diálogo com a ACP, por matriz orientada pelos objetivos (4.4.3).</w:t>
+      </w:r>
+    </w:p>
+    <w:p>
+      <w:pPr>
+        <w:pStyle w:val="ListBullet"/>
+      </w:pPr>
+      <w:r>
+        <w:rPr>
+          <w:b/>
+        </w:rPr>
+        <w:t xml:space="preserve">Território: </w:t>
+      </w:r>
+      <w:r>
+        <w:t>IBGE e Censo Escolar por localidade e 38 imagens de Pipa e da escola, lidas como evidência da configuração material visível.</w:t>
+      </w:r>
+    </w:p>
+    <w:p>
+      <w:pPr>
+        <w:pStyle w:val="ListBullet"/>
+      </w:pPr>
+      <w:r>
+        <w:rPr>
+          <w:b/>
+        </w:rPr>
+        <w:t xml:space="preserve">Registro iconográfico: </w:t>
+      </w:r>
+      <w:r>
+        <w:t>Imagens como evidência da configuração material visível, sem valor de prova sobre práticas (4.4.4).</w:t>
+      </w:r>
+    </w:p>
+    <w:p>
+      <w:pPr>
+        <w:pStyle w:val="ListBullet"/>
+      </w:pPr>
+      <w:r>
+        <w:rPr>
+          <w:b/>
+        </w:rPr>
+        <w:t xml:space="preserve">Lentes sensibilizadoras: </w:t>
+      </w:r>
+      <w:r>
+        <w:t>Conceitos que orientam a primeira leitura dos dados sem se tornarem categorias fechadas (4.5.1).</w:t>
+      </w:r>
+    </w:p>
+    <w:p>
+      <w:pPr>
+        <w:pStyle w:val="ListBullet"/>
+      </w:pPr>
+      <w:r>
+        <w:rPr>
+          <w:b/>
+        </w:rPr>
+        <w:t xml:space="preserve">Ética: </w:t>
+      </w:r>
+      <w:r>
+        <w:t>Emenda ao protocolo aprovado no CEP; TCLE; pseudônimos; Res. CNS nº 466/2012 e nº 510/2016.</w:t>
+      </w:r>
+    </w:p>
+    <w:p>
+      <w:r>
+        <w:rPr>
+          <w:b/>
+        </w:rPr>
+        <w:t xml:space="preserve">Autores e obras: </w:t>
+      </w:r>
+      <w:r>
+        <w:t>Mainardes (2006); Braun e Clarke (2006; 2019); BRASIL (2012; 2016).</w:t>
+      </w:r>
+    </w:p>
+    <w:p>
+      <w:r>
+        <w:rPr>
+          <w:b/>
+        </w:rPr>
+        <w:t xml:space="preserve">Onde aprofundar: </w:t>
+      </w:r>
+      <w:r>
+        <w:t>Cap. 4, seções 4.4.2 a 4.4.6, 4.5.1, 4.5.2 e 4.5.4 (cronograma); Apêndices D (questionário) e E (roteiros).</w:t>
+      </w:r>
+    </w:p>
+    <w:p>
+      <w:r>
+        <w:rPr>
+          <w:b/>
+        </w:rPr>
+        <w:t>Perguntas de estudo</w:t>
+      </w:r>
+    </w:p>
+    <w:p>
+      <w:pPr>
+        <w:pStyle w:val="ListBullet"/>
+      </w:pPr>
+      <w:r>
+        <w:rPr>
+          <w:i/>
+        </w:rPr>
+        <w:t>Qual a função do questionário, se não há generalização estatística? (caracterizar e contextualizar, 4.4.5).</w:t>
+      </w:r>
+    </w:p>
+    <w:p>
+      <w:r>
+        <w:rPr>
+          <w:b/>
+          <w:color w:val="B03A2E"/>
+        </w:rPr>
+        <w:t xml:space="preserve">Cuidado: </w:t>
+      </w:r>
+      <w:r>
+        <w:t>Fato: a emenda ao CEP ainda não foi submetida; dizer "será submetida".</w:t>
+      </w:r>
+    </w:p>
+    <w:p>
+      <w:r>
+        <w:br w:type="page"/>
+      </w:r>
+    </w:p>
+    <w:p>
+      <w:pPr>
+        <w:pStyle w:val="Heading1"/>
+      </w:pPr>
+      <w:r>
+        <w:t>AGENDA GLOBAL E PNED</w:t>
+      </w:r>
+    </w:p>
+    <w:p>
+      <w:pPr>
+        <w:pStyle w:val="Heading2"/>
+      </w:pPr>
+      <w:r>
+        <w:t>Slide 19 · Divisor: Agenda global e PNED</w:t>
+      </w:r>
+    </w:p>
+    <w:p>
+      <w:r>
+        <w:rPr>
+          <w:color w:val="555555"/>
+          <w:sz w:val="20"/>
+        </w:rPr>
+        <w:t>10 s  ·  ao final: 15:23</w:t>
       </w:r>
     </w:p>
     <w:tbl>
@@ -5560,7 +5832,7 @@
         <w:pStyle w:val="Heading2"/>
       </w:pPr>
       <w:r>
-        <w:t>Slide 19 · O que outros territórios nos ensinam</w:t>
+        <w:t>Slide 20 · O que outros territórios nos ensinam</w:t>
       </w:r>
     </w:p>
     <w:p>
@@ -5569,7 +5841,7 @@
           <w:color w:val="555555"/>
           <w:sz w:val="20"/>
         </w:rPr>
-        <w:t>65 s  ·  ao final: 16:10</w:t>
+        <w:t>65 s  ·  ao final: 16:28</w:t>
       </w:r>
     </w:p>
     <w:p>
@@ -5641,7 +5913,7 @@
         <w:drawing>
           <wp:inline xmlns:a="http://schemas.openxmlformats.org/drawingml/2006/main" xmlns:pic="http://schemas.openxmlformats.org/drawingml/2006/picture">
             <wp:extent cx="5903999" cy="2739456"/>
-            <wp:docPr id="14" name="Picture 14"/>
+            <wp:docPr id="15" name="Picture 15"/>
             <wp:cNvGraphicFramePr>
               <a:graphicFrameLocks noChangeAspect="1"/>
             </wp:cNvGraphicFramePr>
@@ -5649,11 +5921,11 @@
               <a:graphicData uri="http://schemas.openxmlformats.org/drawingml/2006/picture">
                 <pic:pic>
                   <pic:nvPicPr>
-                    <pic:cNvPr id="0" name="mapa_19.png"/>
+                    <pic:cNvPr id="0" name="mapa_20.png"/>
                     <pic:cNvPicPr/>
                   </pic:nvPicPr>
                   <pic:blipFill>
-                    <a:blip r:embed="rId22"/>
+                    <a:blip r:embed="rId23"/>
                     <a:stretch>
                       <a:fillRect/>
                     </a:stretch>
@@ -5793,7 +6065,7 @@
         <w:pStyle w:val="Heading2"/>
       </w:pPr>
       <w:r>
-        <w:t>Slide 20 · O que a comparação traz para a tese</w:t>
+        <w:t>Slide 21 · O que a comparação traz para a tese</w:t>
       </w:r>
     </w:p>
     <w:p>
@@ -5802,7 +6074,7 @@
           <w:color w:val="555555"/>
           <w:sz w:val="20"/>
         </w:rPr>
-        <w:t>70 s  ·  ao final: 17:20</w:t>
+        <w:t>70 s  ·  ao final: 17:38</w:t>
       </w:r>
     </w:p>
     <w:p>
@@ -5874,7 +6146,7 @@
         <w:drawing>
           <wp:inline xmlns:a="http://schemas.openxmlformats.org/drawingml/2006/main" xmlns:pic="http://schemas.openxmlformats.org/drawingml/2006/picture">
             <wp:extent cx="5903999" cy="2946096"/>
-            <wp:docPr id="15" name="Picture 15"/>
+            <wp:docPr id="16" name="Picture 16"/>
             <wp:cNvGraphicFramePr>
               <a:graphicFrameLocks noChangeAspect="1"/>
             </wp:cNvGraphicFramePr>
@@ -5882,11 +6154,11 @@
               <a:graphicData uri="http://schemas.openxmlformats.org/drawingml/2006/picture">
                 <pic:pic>
                   <pic:nvPicPr>
-                    <pic:cNvPr id="0" name="mapa_20.png"/>
+                    <pic:cNvPr id="0" name="mapa_21.png"/>
                     <pic:cNvPicPr/>
                   </pic:nvPicPr>
                   <pic:blipFill>
-                    <a:blip r:embed="rId23"/>
+                    <a:blip r:embed="rId24"/>
                     <a:stretch>
                       <a:fillRect/>
                     </a:stretch>
@@ -6040,7 +6312,7 @@
         <w:pStyle w:val="Heading2"/>
       </w:pPr>
       <w:r>
-        <w:t>Slide 21 · A PNED e o vazio material</w:t>
+        <w:t>Slide 22 · A PNED e o vazio material</w:t>
       </w:r>
     </w:p>
     <w:p>
@@ -6049,7 +6321,7 @@
           <w:color w:val="555555"/>
           <w:sz w:val="20"/>
         </w:rPr>
-        <w:t>85 s  ·  ao final: 18:45</w:t>
+        <w:t>85 s  ·  ao final: 19:03</w:t>
       </w:r>
     </w:p>
     <w:p>
@@ -6121,7 +6393,7 @@
         <w:drawing>
           <wp:inline xmlns:a="http://schemas.openxmlformats.org/drawingml/2006/main" xmlns:pic="http://schemas.openxmlformats.org/drawingml/2006/picture">
             <wp:extent cx="5903999" cy="3861215"/>
-            <wp:docPr id="16" name="Picture 16"/>
+            <wp:docPr id="17" name="Picture 17"/>
             <wp:cNvGraphicFramePr>
               <a:graphicFrameLocks noChangeAspect="1"/>
             </wp:cNvGraphicFramePr>
@@ -6129,11 +6401,11 @@
               <a:graphicData uri="http://schemas.openxmlformats.org/drawingml/2006/picture">
                 <pic:pic>
                   <pic:nvPicPr>
-                    <pic:cNvPr id="0" name="mapa_21.png"/>
+                    <pic:cNvPr id="0" name="mapa_22.png"/>
                     <pic:cNvPicPr/>
                   </pic:nvPicPr>
                   <pic:blipFill>
-                    <a:blip r:embed="rId24"/>
+                    <a:blip r:embed="rId25"/>
                     <a:stretch>
                       <a:fillRect/>
                     </a:stretch>
@@ -6337,7 +6609,7 @@
         <w:pStyle w:val="Heading2"/>
       </w:pPr>
       <w:r>
-        <w:t>Slide 22 · Divisor: Do município à escola</w:t>
+        <w:t>Slide 23 · Divisor: Do município à escola</w:t>
       </w:r>
     </w:p>
     <w:p>
@@ -6346,7 +6618,7 @@
           <w:color w:val="555555"/>
           <w:sz w:val="20"/>
         </w:rPr>
-        <w:t>10 s  ·  ao final: 18:55</w:t>
+        <w:t>10 s  ·  ao final: 19:13</w:t>
       </w:r>
     </w:p>
     <w:tbl>
@@ -6420,7 +6692,7 @@
         <w:pStyle w:val="Heading2"/>
       </w:pPr>
       <w:r>
-        <w:t>Slide 23 · Tibau do Sul</w:t>
+        <w:t>Slide 24 · Tibau do Sul</w:t>
       </w:r>
     </w:p>
     <w:p>
@@ -6429,7 +6701,7 @@
           <w:color w:val="555555"/>
           <w:sz w:val="20"/>
         </w:rPr>
-        <w:t>65 s  ·  ao final: 20:00</w:t>
+        <w:t>65 s  ·  ao final: 20:18</w:t>
       </w:r>
     </w:p>
     <w:p>
@@ -6501,7 +6773,7 @@
         <w:drawing>
           <wp:inline xmlns:a="http://schemas.openxmlformats.org/drawingml/2006/main" xmlns:pic="http://schemas.openxmlformats.org/drawingml/2006/picture">
             <wp:extent cx="5903999" cy="2739456"/>
-            <wp:docPr id="17" name="Picture 17"/>
+            <wp:docPr id="18" name="Picture 18"/>
             <wp:cNvGraphicFramePr>
               <a:graphicFrameLocks noChangeAspect="1"/>
             </wp:cNvGraphicFramePr>
@@ -6509,11 +6781,11 @@
               <a:graphicData uri="http://schemas.openxmlformats.org/drawingml/2006/picture">
                 <pic:pic>
                   <pic:nvPicPr>
-                    <pic:cNvPr id="0" name="mapa_23.png"/>
+                    <pic:cNvPr id="0" name="mapa_24.png"/>
                     <pic:cNvPicPr/>
                   </pic:nvPicPr>
                   <pic:blipFill>
-                    <a:blip r:embed="rId25"/>
+                    <a:blip r:embed="rId26"/>
                     <a:stretch>
                       <a:fillRect/>
                     </a:stretch>
@@ -6690,7 +6962,7 @@
         <w:pStyle w:val="Heading2"/>
       </w:pPr>
       <w:r>
-        <w:t>Slide 24 · Pipa</w:t>
+        <w:t>Slide 25 · Pipa</w:t>
       </w:r>
     </w:p>
     <w:p>
@@ -6699,7 +6971,7 @@
           <w:color w:val="555555"/>
           <w:sz w:val="20"/>
         </w:rPr>
-        <w:t>45 s  ·  ao final: 20:45</w:t>
+        <w:t>40 s  ·  ao final: 20:58</w:t>
       </w:r>
     </w:p>
     <w:p>
@@ -6737,265 +7009,6 @@
                 <w:sz w:val="24"/>
               </w:rPr>
               <w:t>Pipa é o foco da tese. Nos anos 1970, era uma comunidade agrícola e pesqueira; os surfistas chegaram em meados daquela década, e a divulgação se intensificou nos anos 1990, como registra Aires. As fotografias acompanham esse percurso: a embarcação artesanal, os surfistas em abril de 1991 e a vista aérea de hoje. Hoje, pousadas, restaurantes e passeios se vendem pela internet. Em Pipa, o digital já move a economia do lugar.</w:t>
-            </w:r>
-          </w:p>
-        </w:tc>
-      </w:tr>
-    </w:tbl>
-    <w:p>
-      <w:pPr>
-        <w:spacing w:after="0"/>
-      </w:pPr>
-    </w:p>
-    <w:p>
-      <w:pPr>
-        <w:pStyle w:val="Heading3"/>
-      </w:pPr>
-      <w:r>
-        <w:t>Estudo dirigido</w:t>
-      </w:r>
-    </w:p>
-    <w:p>
-      <w:r>
-        <w:rPr>
-          <w:b/>
-        </w:rPr>
-        <w:t>Mapa conceitual</w:t>
-      </w:r>
-    </w:p>
-    <w:p>
-      <w:pPr>
-        <w:jc w:val="center"/>
-      </w:pPr>
-      <w:r>
-        <w:drawing>
-          <wp:inline xmlns:a="http://schemas.openxmlformats.org/drawingml/2006/main" xmlns:pic="http://schemas.openxmlformats.org/drawingml/2006/picture">
-            <wp:extent cx="5903999" cy="2456064"/>
-            <wp:docPr id="18" name="Picture 18"/>
-            <wp:cNvGraphicFramePr>
-              <a:graphicFrameLocks noChangeAspect="1"/>
-            </wp:cNvGraphicFramePr>
-            <a:graphic>
-              <a:graphicData uri="http://schemas.openxmlformats.org/drawingml/2006/picture">
-                <pic:pic>
-                  <pic:nvPicPr>
-                    <pic:cNvPr id="0" name="mapa_24.png"/>
-                    <pic:cNvPicPr/>
-                  </pic:nvPicPr>
-                  <pic:blipFill>
-                    <a:blip r:embed="rId26"/>
-                    <a:stretch>
-                      <a:fillRect/>
-                    </a:stretch>
-                  </pic:blipFill>
-                  <pic:spPr>
-                    <a:xfrm>
-                      <a:off x="0" y="0"/>
-                      <a:ext cx="5903999" cy="2456064"/>
-                    </a:xfrm>
-                    <a:prstGeom prst="rect"/>
-                  </pic:spPr>
-                </pic:pic>
-              </a:graphicData>
-            </a:graphic>
-          </wp:inline>
-        </w:drawing>
-      </w:r>
-    </w:p>
-    <w:p>
-      <w:r>
-        <w:rPr>
-          <w:b/>
-        </w:rPr>
-        <w:t xml:space="preserve">Ideia central: </w:t>
-      </w:r>
-      <w:r>
-        <w:t>De comunidade agrícola e pesqueira a polo turístico, onde o digital já move a economia do lugar.</w:t>
-      </w:r>
-    </w:p>
-    <w:p>
-      <w:r>
-        <w:rPr>
-          <w:b/>
-        </w:rPr>
-        <w:t>Conceitos</w:t>
-      </w:r>
-    </w:p>
-    <w:p>
-      <w:pPr>
-        <w:pStyle w:val="ListBullet"/>
-      </w:pPr>
-      <w:r>
-        <w:rPr>
-          <w:b/>
-        </w:rPr>
-        <w:t xml:space="preserve">Transformação do distrito: </w:t>
-      </w:r>
-      <w:r>
-        <w:t>Anos 1970 sem energia elétrica e água encanada; surfistas desde meados da década; divulgação intensa nos anos 1990 (AIRES, 2012, p. 80-82).</w:t>
-      </w:r>
-    </w:p>
-    <w:p>
-      <w:pPr>
-        <w:pStyle w:val="ListBullet"/>
-      </w:pPr>
-      <w:r>
-        <w:rPr>
-          <w:b/>
-        </w:rPr>
-        <w:t xml:space="preserve">Fases do turismo: </w:t>
-      </w:r>
-      <w:r>
-        <w:t>Alves (2018, p. 100-111) descreve quatro fases do turismo em Pipa.</w:t>
-      </w:r>
-    </w:p>
-    <w:p>
-      <w:pPr>
-        <w:pStyle w:val="ListBullet"/>
-      </w:pPr>
-      <w:r>
-        <w:rPr>
-          <w:b/>
-        </w:rPr>
-        <w:t xml:space="preserve">Agência dos nativos: </w:t>
-      </w:r>
-      <w:r>
-        <w:t>A população nativa criou "mecanismos de reformulações materiais e simbólicas" (AIRES, 2012, p. 10).</w:t>
-      </w:r>
-    </w:p>
-    <w:p>
-      <w:pPr>
-        <w:pStyle w:val="ListBullet"/>
-      </w:pPr>
-      <w:r>
-        <w:rPr>
-          <w:b/>
-        </w:rPr>
-        <w:t xml:space="preserve">Contemporaneidade: </w:t>
-      </w:r>
-      <w:r>
-        <w:t>Massey critica a operação que "transforma a geografia em história, o espaço em tempo" (2008, p. 24).</w:t>
-      </w:r>
-    </w:p>
-    <w:p>
-      <w:pPr>
-        <w:pStyle w:val="ListBullet"/>
-      </w:pPr>
-      <w:r>
-        <w:rPr>
-          <w:b/>
-        </w:rPr>
-        <w:t xml:space="preserve">Escolas de Pipa: </w:t>
-      </w:r>
-      <w:r>
-        <w:t>A EM Vicência Castelo, fundada em 1988, é a única escola pública de anos finais em Pipa, com 4 computadores e sem laboratório (FERREIRA, 2022, p. 50-51).</w:t>
-      </w:r>
-    </w:p>
-    <w:p>
-      <w:r>
-        <w:rPr>
-          <w:b/>
-        </w:rPr>
-        <w:t xml:space="preserve">Autores e obras: </w:t>
-      </w:r>
-      <w:r>
-        <w:t>Aires (2012); Alves (2018); Ferreira (2022); Massey (2008).</w:t>
-      </w:r>
-    </w:p>
-    <w:p>
-      <w:r>
-        <w:rPr>
-          <w:b/>
-        </w:rPr>
-        <w:t xml:space="preserve">Onde aprofundar: </w:t>
-      </w:r>
-      <w:r>
-        <w:t>Cap. 6, seção 6.1 e Apêndice F (caderno iconográfico).</w:t>
-      </w:r>
-    </w:p>
-    <w:p>
-      <w:r>
-        <w:rPr>
-          <w:b/>
-        </w:rPr>
-        <w:t>Perguntas de estudo</w:t>
-      </w:r>
-    </w:p>
-    <w:p>
-      <w:pPr>
-        <w:pStyle w:val="ListBullet"/>
-      </w:pPr>
-      <w:r>
-        <w:rPr>
-          <w:i/>
-        </w:rPr>
-        <w:t>O que o registro iconográfico pode e não pode provar? (4.4.4 e 6.1).</w:t>
-      </w:r>
-    </w:p>
-    <w:p>
-      <w:r>
-        <w:rPr>
-          <w:b/>
-          <w:color w:val="B03A2E"/>
-        </w:rPr>
-        <w:t xml:space="preserve">Cuidado: </w:t>
-      </w:r>
-      <w:r>
-        <w:t>A conferir: licença das fotografias do Museu Digital de Pipa.</w:t>
-      </w:r>
-    </w:p>
-    <w:p>
-      <w:pPr>
-        <w:pStyle w:val="Heading2"/>
-      </w:pPr>
-      <w:r>
-        <w:t>Slide 25 · A escola</w:t>
-      </w:r>
-    </w:p>
-    <w:p>
-      <w:r>
-        <w:rPr>
-          <w:color w:val="555555"/>
-          <w:sz w:val="20"/>
-        </w:rPr>
-        <w:t>50 s  ·  ao final: 21:35</w:t>
-      </w:r>
-    </w:p>
-    <w:p>
-      <w:r>
-        <w:rPr>
-          <w:i/>
-          <w:color w:val="555555"/>
-        </w:rPr>
-        <w:t>[Apontar o laboratório, a sala e o alfabeto móvel.]</w:t>
-      </w:r>
-    </w:p>
-    <w:tbl>
-      <w:tblPr>
-        <w:tblStyle w:val="TableGrid"/>
-        <w:tblW w:type="auto" w:w="0"/>
-        <w:tblLook w:firstColumn="1" w:firstRow="1" w:lastColumn="0" w:lastRow="0" w:noHBand="0" w:noVBand="1" w:val="04A0"/>
-      </w:tblPr>
-      <w:tblGrid>
-        <w:gridCol w:w="9632"/>
-      </w:tblGrid>
-      <w:tr>
-        <w:tc>
-          <w:tcPr>
-            <w:tcW w:type="dxa" w:w="9632"/>
-            <w:shd w:val="clear" w:color="auto" w:fill="EEF0FB"/>
-          </w:tcPr>
-          <w:p>
-            <w:pPr>
-              <w:spacing w:line="300" w:lineRule="auto"/>
-              <w:jc w:val="both"/>
-            </w:pPr>
-            <w:r/>
-            <w:r>
-              <w:rPr>
-                <w:sz w:val="24"/>
-              </w:rPr>
-              <w:t>Na escola, o retrato é outro. O laboratório de informática foi fotografado com os equipamentos desligados, nas salas dos primeiros anos não havia nenhum dispositivo, e as crianças se alfabetizam com um alfabeto móvel feito à mão. Segundo informação preliminar, ainda a confirmar, os computadores foram comprados pela Prefeitura em 2022. Chamamos essa situação de rugosidade tecnológica, com Milton Santos: a forma permanece aguardando o próximo movimento dinâmico da sociedade. O caso de Sibaúma sugere que essa história pode se repetir na rede. E Massey nos impede de ler a distância entre a escola e o polo turístico como atraso: os dois são contemporâneos.</w:t>
             </w:r>
           </w:p>
         </w:tc>
@@ -7069,7 +7082,7 @@
         <w:t xml:space="preserve">Ideia central: </w:t>
       </w:r>
       <w:r>
-        <w:t>Laboratório desligado, salas sem telas e alfabeto móvel feito à mão.</w:t>
+        <w:t>De comunidade agrícola e pesqueira a polo turístico, onde o digital já move a economia do lugar.</w:t>
       </w:r>
     </w:p>
     <w:p>
@@ -7088,10 +7101,10 @@
         <w:rPr>
           <w:b/>
         </w:rPr>
-        <w:t xml:space="preserve">A escola: </w:t>
-      </w:r>
-      <w:r>
-        <w:t>EM Domitila Castelo da Silva: 351 crianças em 15 turmas dos anos iniciais (TIBAU DO SUL, 2026). Computadores comprados em 2022: informação preliminar a confirmar.</w:t>
+        <w:t xml:space="preserve">Transformação do distrito: </w:t>
+      </w:r>
+      <w:r>
+        <w:t>Anos 1970 sem energia elétrica e água encanada; surfistas desde meados da década; divulgação intensa nos anos 1990 (AIRES, 2012, p. 80-82).</w:t>
       </w:r>
     </w:p>
     <w:p>
@@ -7102,10 +7115,10 @@
         <w:rPr>
           <w:b/>
         </w:rPr>
-        <w:t xml:space="preserve">Sistemas de objetos e de ações: </w:t>
-      </w:r>
-      <w:r>
-        <w:t>Os objetos técnicos condicionam as ações possíveis (SANTOS, 2006, p. 39).</w:t>
+        <w:t xml:space="preserve">Fases do turismo: </w:t>
+      </w:r>
+      <w:r>
+        <w:t>Alves (2018, p. 100-111) descreve quatro fases do turismo em Pipa.</w:t>
       </w:r>
     </w:p>
     <w:p>
@@ -7116,10 +7129,10 @@
         <w:rPr>
           <w:b/>
         </w:rPr>
-        <w:t xml:space="preserve">Rugosidade tecnológica: </w:t>
-      </w:r>
-      <w:r>
-        <w:t>Formulação da tese: equipamentos de uma iniciativa anterior à lei chamados a nova função; a forma "permanece aguardando o próximo movimento dinâmico da sociedade" (SANTOS, 2012, p. 74-75).</w:t>
+        <w:t xml:space="preserve">Agência dos nativos: </w:t>
+      </w:r>
+      <w:r>
+        <w:t>A população nativa criou "mecanismos de reformulações materiais e simbólicas" (AIRES, 2012, p. 10).</w:t>
       </w:r>
     </w:p>
     <w:p>
@@ -7130,21 +7143,35 @@
         <w:rPr>
           <w:b/>
         </w:rPr>
-        <w:t xml:space="preserve">Passado técnico da forma: </w:t>
-      </w:r>
-      <w:r>
-        <w:t>"Uma realidade a ser levada em consideração" (SANTOS, 2012, p. 73).</w:t>
-      </w:r>
-    </w:p>
-    <w:p>
+        <w:t xml:space="preserve">Contemporaneidade: </w:t>
+      </w:r>
+      <w:r>
+        <w:t>Massey critica a operação que "transforma a geografia em história, o espaço em tempo" (2008, p. 24).</w:t>
+      </w:r>
+    </w:p>
+    <w:p>
+      <w:pPr>
+        <w:pStyle w:val="ListBullet"/>
+      </w:pPr>
       <w:r>
         <w:rPr>
           <w:b/>
         </w:rPr>
+        <w:t xml:space="preserve">Escolas de Pipa: </w:t>
+      </w:r>
+      <w:r>
+        <w:t>A EM Vicência Castelo, fundada em 1988, é a única escola pública de anos finais em Pipa, com 4 computadores e sem laboratório (FERREIRA, 2022, p. 50-51).</w:t>
+      </w:r>
+    </w:p>
+    <w:p>
+      <w:r>
+        <w:rPr>
+          <w:b/>
+        </w:rPr>
         <w:t xml:space="preserve">Autores e obras: </w:t>
       </w:r>
       <w:r>
-        <w:t>Santos (2006, p. 39, 92); Santos (2012, p. 73-75).</w:t>
+        <w:t>Aires (2012); Alves (2018); Ferreira (2022); Massey (2008).</w:t>
       </w:r>
     </w:p>
     <w:p>
@@ -7155,7 +7182,7 @@
         <w:t xml:space="preserve">Onde aprofundar: </w:t>
       </w:r>
       <w:r>
-        <w:t>Cap. 6, seções 6.2 e 6.3.</w:t>
+        <w:t>Cap. 6, seção 6.1 e Apêndice F (caderno iconográfico).</w:t>
       </w:r>
     </w:p>
     <w:p>
@@ -7174,7 +7201,7 @@
         <w:rPr>
           <w:i/>
         </w:rPr>
-        <w:t>O laboratório desligado prova ausência de uso? (não: depende dos cadernos de uso e das entrevistas, 6.3).</w:t>
+        <w:t>O que o registro iconográfico pode e não pode provar? (4.4.4 e 6.1).</w:t>
       </w:r>
     </w:p>
     <w:p>
@@ -7186,20 +7213,7 @@
         <w:t xml:space="preserve">Cuidado: </w:t>
       </w:r>
       <w:r>
-        <w:t>Estimativa: a compra dos computadores em 2022 é informação preliminar.</w:t>
-      </w:r>
-    </w:p>
-    <w:p>
-      <w:r>
-        <w:br w:type="page"/>
-      </w:r>
-    </w:p>
-    <w:p>
-      <w:pPr>
-        <w:pStyle w:val="Heading1"/>
-      </w:pPr>
-      <w:r>
-        <w:t>TESE E ENCERRAMENTO</w:t>
+        <w:t>A conferir: licença das fotografias do Museu Digital de Pipa.</w:t>
       </w:r>
     </w:p>
     <w:p>
@@ -7207,7 +7221,7 @@
         <w:pStyle w:val="Heading2"/>
       </w:pPr>
       <w:r>
-        <w:t>Slide 26 · Tese de partida e formulações</w:t>
+        <w:t>Slide 26 · A escola</w:t>
       </w:r>
     </w:p>
     <w:p>
@@ -7216,7 +7230,265 @@
           <w:color w:val="555555"/>
           <w:sz w:val="20"/>
         </w:rPr>
-        <w:t>80 s  ·  ao final: 22:55</w:t>
+        <w:t>50 s  ·  ao final: 21:48</w:t>
+      </w:r>
+    </w:p>
+    <w:p>
+      <w:r>
+        <w:rPr>
+          <w:i/>
+          <w:color w:val="555555"/>
+        </w:rPr>
+        <w:t>[Apontar o laboratório, a sala e o alfabeto móvel.]</w:t>
+      </w:r>
+    </w:p>
+    <w:tbl>
+      <w:tblPr>
+        <w:tblStyle w:val="TableGrid"/>
+        <w:tblW w:type="auto" w:w="0"/>
+        <w:tblLook w:firstColumn="1" w:firstRow="1" w:lastColumn="0" w:lastRow="0" w:noHBand="0" w:noVBand="1" w:val="04A0"/>
+      </w:tblPr>
+      <w:tblGrid>
+        <w:gridCol w:w="9632"/>
+      </w:tblGrid>
+      <w:tr>
+        <w:tc>
+          <w:tcPr>
+            <w:tcW w:type="dxa" w:w="9632"/>
+            <w:shd w:val="clear" w:color="auto" w:fill="EEF0FB"/>
+          </w:tcPr>
+          <w:p>
+            <w:pPr>
+              <w:spacing w:line="300" w:lineRule="auto"/>
+              <w:jc w:val="both"/>
+            </w:pPr>
+            <w:r/>
+            <w:r>
+              <w:rPr>
+                <w:sz w:val="24"/>
+              </w:rPr>
+              <w:t>Na escola, o retrato é outro. O laboratório de informática foi fotografado com os equipamentos desligados, nas salas dos primeiros anos não havia nenhum dispositivo, e as crianças se alfabetizam com um alfabeto móvel feito à mão. Segundo informação preliminar, ainda a confirmar, os computadores foram comprados pela Prefeitura em 2022. Chamamos essa situação de rugosidade tecnológica, com Milton Santos: a forma permanece aguardando o próximo movimento dinâmico da sociedade. O caso de Sibaúma sugere que essa história pode se repetir na rede. E Massey nos impede de ler a distância entre a escola e o polo turístico como atraso: os dois são contemporâneos.</w:t>
+            </w:r>
+          </w:p>
+        </w:tc>
+      </w:tr>
+    </w:tbl>
+    <w:p>
+      <w:pPr>
+        <w:spacing w:after="0"/>
+      </w:pPr>
+    </w:p>
+    <w:p>
+      <w:pPr>
+        <w:pStyle w:val="Heading3"/>
+      </w:pPr>
+      <w:r>
+        <w:t>Estudo dirigido</w:t>
+      </w:r>
+    </w:p>
+    <w:p>
+      <w:r>
+        <w:rPr>
+          <w:b/>
+        </w:rPr>
+        <w:t>Mapa conceitual</w:t>
+      </w:r>
+    </w:p>
+    <w:p>
+      <w:pPr>
+        <w:jc w:val="center"/>
+      </w:pPr>
+      <w:r>
+        <w:drawing>
+          <wp:inline xmlns:a="http://schemas.openxmlformats.org/drawingml/2006/main" xmlns:pic="http://schemas.openxmlformats.org/drawingml/2006/picture">
+            <wp:extent cx="5903999" cy="2456064"/>
+            <wp:docPr id="20" name="Picture 20"/>
+            <wp:cNvGraphicFramePr>
+              <a:graphicFrameLocks noChangeAspect="1"/>
+            </wp:cNvGraphicFramePr>
+            <a:graphic>
+              <a:graphicData uri="http://schemas.openxmlformats.org/drawingml/2006/picture">
+                <pic:pic>
+                  <pic:nvPicPr>
+                    <pic:cNvPr id="0" name="mapa_26.png"/>
+                    <pic:cNvPicPr/>
+                  </pic:nvPicPr>
+                  <pic:blipFill>
+                    <a:blip r:embed="rId28"/>
+                    <a:stretch>
+                      <a:fillRect/>
+                    </a:stretch>
+                  </pic:blipFill>
+                  <pic:spPr>
+                    <a:xfrm>
+                      <a:off x="0" y="0"/>
+                      <a:ext cx="5903999" cy="2456064"/>
+                    </a:xfrm>
+                    <a:prstGeom prst="rect"/>
+                  </pic:spPr>
+                </pic:pic>
+              </a:graphicData>
+            </a:graphic>
+          </wp:inline>
+        </w:drawing>
+      </w:r>
+    </w:p>
+    <w:p>
+      <w:r>
+        <w:rPr>
+          <w:b/>
+        </w:rPr>
+        <w:t xml:space="preserve">Ideia central: </w:t>
+      </w:r>
+      <w:r>
+        <w:t>Laboratório desligado, salas sem telas e alfabeto móvel feito à mão.</w:t>
+      </w:r>
+    </w:p>
+    <w:p>
+      <w:r>
+        <w:rPr>
+          <w:b/>
+        </w:rPr>
+        <w:t>Conceitos</w:t>
+      </w:r>
+    </w:p>
+    <w:p>
+      <w:pPr>
+        <w:pStyle w:val="ListBullet"/>
+      </w:pPr>
+      <w:r>
+        <w:rPr>
+          <w:b/>
+        </w:rPr>
+        <w:t xml:space="preserve">A escola: </w:t>
+      </w:r>
+      <w:r>
+        <w:t>EM Domitila Castelo da Silva: 351 crianças em 15 turmas dos anos iniciais (TIBAU DO SUL, 2026). Computadores comprados em 2022: informação preliminar a confirmar.</w:t>
+      </w:r>
+    </w:p>
+    <w:p>
+      <w:pPr>
+        <w:pStyle w:val="ListBullet"/>
+      </w:pPr>
+      <w:r>
+        <w:rPr>
+          <w:b/>
+        </w:rPr>
+        <w:t xml:space="preserve">Sistemas de objetos e de ações: </w:t>
+      </w:r>
+      <w:r>
+        <w:t>Os objetos técnicos condicionam as ações possíveis (SANTOS, 2006, p. 39).</w:t>
+      </w:r>
+    </w:p>
+    <w:p>
+      <w:pPr>
+        <w:pStyle w:val="ListBullet"/>
+      </w:pPr>
+      <w:r>
+        <w:rPr>
+          <w:b/>
+        </w:rPr>
+        <w:t xml:space="preserve">Rugosidade tecnológica: </w:t>
+      </w:r>
+      <w:r>
+        <w:t>Formulação da tese: equipamentos de uma iniciativa anterior à lei chamados a nova função; a forma "permanece aguardando o próximo movimento dinâmico da sociedade" (SANTOS, 2012, p. 74-75).</w:t>
+      </w:r>
+    </w:p>
+    <w:p>
+      <w:pPr>
+        <w:pStyle w:val="ListBullet"/>
+      </w:pPr>
+      <w:r>
+        <w:rPr>
+          <w:b/>
+        </w:rPr>
+        <w:t xml:space="preserve">Passado técnico da forma: </w:t>
+      </w:r>
+      <w:r>
+        <w:t>"Uma realidade a ser levada em consideração" (SANTOS, 2012, p. 73).</w:t>
+      </w:r>
+    </w:p>
+    <w:p>
+      <w:r>
+        <w:rPr>
+          <w:b/>
+        </w:rPr>
+        <w:t xml:space="preserve">Autores e obras: </w:t>
+      </w:r>
+      <w:r>
+        <w:t>Santos (2006, p. 39, 92); Santos (2012, p. 73-75).</w:t>
+      </w:r>
+    </w:p>
+    <w:p>
+      <w:r>
+        <w:rPr>
+          <w:b/>
+        </w:rPr>
+        <w:t xml:space="preserve">Onde aprofundar: </w:t>
+      </w:r>
+      <w:r>
+        <w:t>Cap. 6, seções 6.2 e 6.3.</w:t>
+      </w:r>
+    </w:p>
+    <w:p>
+      <w:r>
+        <w:rPr>
+          <w:b/>
+        </w:rPr>
+        <w:t>Perguntas de estudo</w:t>
+      </w:r>
+    </w:p>
+    <w:p>
+      <w:pPr>
+        <w:pStyle w:val="ListBullet"/>
+      </w:pPr>
+      <w:r>
+        <w:rPr>
+          <w:i/>
+        </w:rPr>
+        <w:t>O laboratório desligado prova ausência de uso? (não: depende dos cadernos de uso e das entrevistas, 6.3).</w:t>
+      </w:r>
+    </w:p>
+    <w:p>
+      <w:r>
+        <w:rPr>
+          <w:b/>
+          <w:color w:val="B03A2E"/>
+        </w:rPr>
+        <w:t xml:space="preserve">Cuidado: </w:t>
+      </w:r>
+      <w:r>
+        <w:t>Estimativa: a compra dos computadores em 2022 é informação preliminar.</w:t>
+      </w:r>
+    </w:p>
+    <w:p>
+      <w:r>
+        <w:br w:type="page"/>
+      </w:r>
+    </w:p>
+    <w:p>
+      <w:pPr>
+        <w:pStyle w:val="Heading1"/>
+      </w:pPr>
+      <w:r>
+        <w:t>TESE E ENCERRAMENTO</w:t>
+      </w:r>
+    </w:p>
+    <w:p>
+      <w:pPr>
+        <w:pStyle w:val="Heading2"/>
+      </w:pPr>
+      <w:r>
+        <w:t>Slide 27 · Tese de partida e formulações</w:t>
+      </w:r>
+    </w:p>
+    <w:p>
+      <w:r>
+        <w:rPr>
+          <w:color w:val="555555"/>
+          <w:sz w:val="20"/>
+        </w:rPr>
+        <w:t>75 s  ·  ao final: 23:03</w:t>
       </w:r>
     </w:p>
     <w:p>
@@ -7288,7 +7560,7 @@
         <w:drawing>
           <wp:inline xmlns:a="http://schemas.openxmlformats.org/drawingml/2006/main" xmlns:pic="http://schemas.openxmlformats.org/drawingml/2006/picture">
             <wp:extent cx="5903999" cy="3011039"/>
-            <wp:docPr id="20" name="Picture 20"/>
+            <wp:docPr id="21" name="Picture 21"/>
             <wp:cNvGraphicFramePr>
               <a:graphicFrameLocks noChangeAspect="1"/>
             </wp:cNvGraphicFramePr>
@@ -7296,11 +7568,11 @@
               <a:graphicData uri="http://schemas.openxmlformats.org/drawingml/2006/picture">
                 <pic:pic>
                   <pic:nvPicPr>
-                    <pic:cNvPr id="0" name="mapa_26.png"/>
+                    <pic:cNvPr id="0" name="mapa_27.png"/>
                     <pic:cNvPicPr/>
                   </pic:nvPicPr>
                   <pic:blipFill>
-                    <a:blip r:embed="rId28"/>
+                    <a:blip r:embed="rId29"/>
                     <a:stretch>
                       <a:fillRect/>
                     </a:stretch>
@@ -7412,7 +7684,7 @@
         <w:pStyle w:val="Heading2"/>
       </w:pPr>
       <w:r>
-        <w:t>Slide 27 · A questão aberta</w:t>
+        <w:t>Slide 28 · A questão aberta</w:t>
       </w:r>
     </w:p>
     <w:p>
@@ -7421,7 +7693,7 @@
           <w:color w:val="555555"/>
           <w:sz w:val="20"/>
         </w:rPr>
-        <w:t>40 s  ·  ao final: 23:35</w:t>
+        <w:t>37 s  ·  ao final: 23:40</w:t>
       </w:r>
     </w:p>
     <w:p>
@@ -7493,7 +7765,7 @@
         <w:drawing>
           <wp:inline xmlns:a="http://schemas.openxmlformats.org/drawingml/2006/main" xmlns:pic="http://schemas.openxmlformats.org/drawingml/2006/picture">
             <wp:extent cx="5903999" cy="2249424"/>
-            <wp:docPr id="21" name="Picture 21"/>
+            <wp:docPr id="22" name="Picture 22"/>
             <wp:cNvGraphicFramePr>
               <a:graphicFrameLocks noChangeAspect="1"/>
             </wp:cNvGraphicFramePr>
@@ -7501,11 +7773,11 @@
               <a:graphicData uri="http://schemas.openxmlformats.org/drawingml/2006/picture">
                 <pic:pic>
                   <pic:nvPicPr>
-                    <pic:cNvPr id="0" name="mapa_27.png"/>
+                    <pic:cNvPr id="0" name="mapa_28.png"/>
                     <pic:cNvPicPr/>
                   </pic:nvPicPr>
                   <pic:blipFill>
-                    <a:blip r:embed="rId29"/>
+                    <a:blip r:embed="rId30"/>
                     <a:stretch>
                       <a:fillRect/>
                     </a:stretch>
@@ -7615,7 +7887,7 @@
         <w:pStyle w:val="Heading2"/>
       </w:pPr>
       <w:r>
-        <w:t>Slide 28 · O que foi feito e o que falta fazer</w:t>
+        <w:t>Slide 29 · O que foi feito e o que falta fazer</w:t>
       </w:r>
     </w:p>
     <w:p>
@@ -7624,7 +7896,7 @@
           <w:color w:val="555555"/>
           <w:sz w:val="20"/>
         </w:rPr>
-        <w:t>70 s  ·  ao final: 24:45</w:t>
+        <w:t>70 s  ·  ao final: 24:50</w:t>
       </w:r>
     </w:p>
     <w:p>
@@ -7696,7 +7968,7 @@
         <w:drawing>
           <wp:inline xmlns:a="http://schemas.openxmlformats.org/drawingml/2006/main" xmlns:pic="http://schemas.openxmlformats.org/drawingml/2006/picture">
             <wp:extent cx="5903999" cy="3577823"/>
-            <wp:docPr id="22" name="Picture 22"/>
+            <wp:docPr id="23" name="Picture 23"/>
             <wp:cNvGraphicFramePr>
               <a:graphicFrameLocks noChangeAspect="1"/>
             </wp:cNvGraphicFramePr>
@@ -7704,11 +7976,11 @@
               <a:graphicData uri="http://schemas.openxmlformats.org/drawingml/2006/picture">
                 <pic:pic>
                   <pic:nvPicPr>
-                    <pic:cNvPr id="0" name="mapa_28.png"/>
+                    <pic:cNvPr id="0" name="mapa_29.png"/>
                     <pic:cNvPicPr/>
                   </pic:nvPicPr>
                   <pic:blipFill>
-                    <a:blip r:embed="rId30"/>
+                    <a:blip r:embed="rId31"/>
                     <a:stretch>
                       <a:fillRect/>
                     </a:stretch>
@@ -7857,7 +8129,7 @@
         <w:pStyle w:val="Heading2"/>
       </w:pPr>
       <w:r>
-        <w:t>Slide 29 · Agradecimento</w:t>
+        <w:t>Slide 30 · Agradecimento</w:t>
       </w:r>
     </w:p>
     <w:p>
@@ -7866,7 +8138,7 @@
           <w:color w:val="555555"/>
           <w:sz w:val="20"/>
         </w:rPr>
-        <w:t>15 s  ·  ao final: 25:00</w:t>
+        <w:t>10 s  ·  ao final: 25:00</w:t>
       </w:r>
     </w:p>
     <w:tbl>
@@ -7923,7 +8195,7 @@
         <w:pStyle w:val="Heading2"/>
       </w:pPr>
       <w:r>
-        <w:t>Slide 30 · Referências (1/2)</w:t>
+        <w:t>Slide 31 · Referências (1/2)</w:t>
       </w:r>
     </w:p>
     <w:p>
@@ -7979,7 +8251,7 @@
         <w:pStyle w:val="Heading2"/>
       </w:pPr>
       <w:r>
-        <w:t>Slide 31 · Referências (2/2)</w:t>
+        <w:t>Slide 32 · Referências (2/2)</w:t>
       </w:r>
     </w:p>
     <w:p>
@@ -8021,7 +8293,7 @@
         <w:rPr>
           <w:b/>
         </w:rPr>
-        <w:t xml:space="preserve">Slide 19 (mapa): </w:t>
+        <w:t xml:space="preserve">Slide 20 (mapa): </w:t>
       </w:r>
       <w:r>
         <w:t>dizer só a primeira e a terceira frases e apontar o mapa, sem citar os países. Ganho de cerca de 40 s.</w:t>
@@ -8049,7 +8321,7 @@
         <w:rPr>
           <w:b/>
         </w:rPr>
-        <w:t xml:space="preserve">Slide 20 (comparação): </w:t>
+        <w:t xml:space="preserve">Slide 21 (comparação): </w:t>
       </w:r>
       <w:r>
         <w:t>nomear as cinco categorias e ler apenas a pergunta final. Ganho de cerca de 30 s.</w:t>
@@ -8063,7 +8335,7 @@
         <w:rPr>
           <w:b/>
         </w:rPr>
-        <w:t xml:space="preserve">Slide 23 (Tibau do Sul): </w:t>
+        <w:t xml:space="preserve">Slide 24 (Tibau do Sul): </w:t>
       </w:r>
       <w:r>
         <w:t>dizer só as localidades e a pergunta final. Ganho de cerca de 20 s.</w:t>
@@ -8077,7 +8349,7 @@
         <w:rPr>
           <w:b/>
         </w:rPr>
-        <w:t xml:space="preserve">Slide 21 (vazio material): </w:t>
+        <w:t xml:space="preserve">Slide 22 (vazio material): </w:t>
       </w:r>
       <w:r>
         <w:t>omitir a frase sobre a definição da lei e começar em "Há o que é inegociável". Ganho de cerca de 15 s.</w:t>
@@ -8276,7 +8548,7 @@
         <w:pStyle w:val="ListBullet"/>
       </w:pPr>
       <w:r>
-        <w:t>"Vazio formativo" (slide 27): expressão nova, ainda não definida nos capítulos.</w:t>
+        <w:t>"Vazio formativo" (slide 28): expressão nova, ainda não definida nos capítulos.</w:t>
       </w:r>
     </w:p>
     <w:p>

</xml_diff>

<commit_message>
Inclui a cultura digital e o contexto das tecnologias no slide de conceitos e teóricos
Co-Authored-By: Claude Opus 5.5 <noreply@anthropic.com>
Claude-Session: https://claude.ai/code/session_01HxStpW4pQoDfJdTDYr6zEC
</commit_message>
<xml_diff>
--- a/apresentacao_qualificacao/ROTEIRO_E_ESTUDO_DIRIGIDO.docx
+++ b/apresentacao_qualificacao/ROTEIRO_E_ESTUDO_DIRIGIDO.docx
@@ -52,7 +52,7 @@
         <w:pStyle w:val="ListBullet"/>
       </w:pPr>
       <w:r>
-        <w:t>A fala soma 3087 palavras, cerca de 25 minutos a 125 palavras por minuto, ritmo pausado. O restante dos 25 minutos fica para trocas de slide, pausas e o tempo de apontar fotos e mapa.</w:t>
+        <w:t>A fala soma 3107 palavras, cerca de 25 minutos a 125 palavras por minuto, ritmo pausado. O restante dos 25 minutos fica para trocas de slide, pausas e o tempo de apontar fotos e mapa.</w:t>
       </w:r>
     </w:p>
     <w:p>
@@ -60,7 +60,7 @@
         <w:pStyle w:val="ListBullet"/>
       </w:pPr>
       <w:r>
-        <w:t>Pontos de controle: fim do slide 10 por volta de 08:40; fim do slide 18 por volta de 15:13; fim do slide 26 por volta de 21:48.</w:t>
+        <w:t>Pontos de controle: fim do slide 10 por volta de 08:40; fim do slide 18 por volta de 15:20; fim do slide 26 por volta de 21:50.</w:t>
       </w:r>
     </w:p>
     <w:p>
@@ -322,7 +322,7 @@
           </w:tcPr>
           <w:p>
             <w:r>
-              <w:t>04:43</w:t>
+              <w:t>04:50</w:t>
             </w:r>
           </w:p>
         </w:tc>
@@ -332,7 +332,7 @@
           </w:tcPr>
           <w:p>
             <w:r>
-              <w:t>13:23</w:t>
+              <w:t>13:30</w:t>
             </w:r>
           </w:p>
         </w:tc>
@@ -374,7 +374,7 @@
           </w:tcPr>
           <w:p>
             <w:r>
-              <w:t>15:13</w:t>
+              <w:t>15:20</w:t>
             </w:r>
           </w:p>
         </w:tc>
@@ -416,7 +416,7 @@
           </w:tcPr>
           <w:p>
             <w:r>
-              <w:t>19:03</w:t>
+              <w:t>19:10</w:t>
             </w:r>
           </w:p>
         </w:tc>
@@ -448,7 +448,7 @@
           </w:tcPr>
           <w:p>
             <w:r>
-              <w:t>02:45</w:t>
+              <w:t>02:40</w:t>
             </w:r>
           </w:p>
         </w:tc>
@@ -458,7 +458,7 @@
           </w:tcPr>
           <w:p>
             <w:r>
-              <w:t>21:48</w:t>
+              <w:t>21:50</w:t>
             </w:r>
           </w:p>
         </w:tc>
@@ -490,7 +490,7 @@
           </w:tcPr>
           <w:p>
             <w:r>
-              <w:t>03:12</w:t>
+              <w:t>03:10</w:t>
             </w:r>
           </w:p>
         </w:tc>
@@ -1544,7 +1544,7 @@
               <w:rPr>
                 <w:sz w:val="20"/>
               </w:rPr>
-              <w:t>14</w:t>
+              <w:t>14, 15</w:t>
             </w:r>
           </w:p>
         </w:tc>
@@ -4891,7 +4891,7 @@
           <w:color w:val="555555"/>
           <w:sz w:val="20"/>
         </w:rPr>
-        <w:t>43 s  ·  ao final: 13:23</w:t>
+        <w:t>50 s  ·  ao final: 13:30</w:t>
       </w:r>
     </w:p>
     <w:p>
@@ -4900,7 +4900,7 @@
           <w:i/>
           <w:color w:val="555555"/>
         </w:rPr>
-        <w:t>[Apontar as quatro colunas da esquerda para a direita e, por fim, a faixa amarela.]</w:t>
+        <w:t>[Apontar as cinco colunas da esquerda para a direita e, por fim, a faixa amarela.]</w:t>
       </w:r>
     </w:p>
     <w:tbl>
@@ -4928,7 +4928,7 @@
               <w:rPr>
                 <w:sz w:val="24"/>
               </w:rPr>
-              <w:t>Antes da metodologia, reúno os conceitos e os autores que guiam a tese. A política é lida pelo ciclo de políticas, de Bowe, Ball e Gold, com Mainardes, e pela teoria da atuação de Ball, Maguire e Braun. Os profissionais, pelas culturas profissionais de Hargreaves, pela performatividade em Ball, pelo poder em Foucault e pelos sentidos em Hall. O território, por Milton Santos e Doreen Massey e pelo habitar em Schlemmer, Backes e Palagi. As crianças, pelo Comentário Geral nº 25 da ONU. Daí nascem as três formulações da tese.</w:t>
+              <w:t>Reúno os conceitos e os autores que guiam a tese. A política é lida pelo ciclo de políticas, de Bowe, Ball e Gold, com Mainardes, e pela teoria da atuação de Ball, Maguire e Braun. Os profissionais, pelas culturas profissionais de Hargreaves, pela performatividade em Ball, pelo poder em Foucault e pelos sentidos em Hall. O território, por Milton Santos e Doreen Massey e pelo habitar em Schlemmer, Backes e Palagi. A cultura digital, pela participação que a lei promete e pela crítica às plataformas e aos dados, com Zuboff, Silveira, Morozov e Pretto. As crianças, pelo Comentário Geral nº 25 da ONU. Daí nascem as três formulações da tese.</w:t>
             </w:r>
           </w:p>
         </w:tc>
@@ -4962,7 +4962,7 @@
       <w:r>
         <w:drawing>
           <wp:inline xmlns:a="http://schemas.openxmlformats.org/drawingml/2006/main" xmlns:pic="http://schemas.openxmlformats.org/drawingml/2006/picture">
-            <wp:extent cx="5903999" cy="3306239"/>
+            <wp:extent cx="5903999" cy="3937967"/>
             <wp:docPr id="12" name="Picture 12"/>
             <wp:cNvGraphicFramePr>
               <a:graphicFrameLocks noChangeAspect="1"/>
@@ -4983,7 +4983,7 @@
                   <pic:spPr>
                     <a:xfrm>
                       <a:off x="0" y="0"/>
-                      <a:ext cx="5903999" cy="3306239"/>
+                      <a:ext cx="5903999" cy="3937967"/>
                     </a:xfrm>
                     <a:prstGeom prst="rect"/>
                   </pic:spPr>
@@ -5002,7 +5002,7 @@
         <w:t xml:space="preserve">Ideia central: </w:t>
       </w:r>
       <w:r>
-        <w:t>Síntese do quadro teórico em quatro frentes (política, profissionais, território, crianças) e as três formulações próprias da tese.</w:t>
+        <w:t>Síntese do quadro teórico em cinco frentes (política, profissionais, território, cultura digital, crianças) e as três formulações próprias da tese.</w:t>
       </w:r>
     </w:p>
     <w:p>
@@ -5053,6 +5053,20 @@
       </w:r>
       <w:r>
         <w:t>Território usado e rugosidades (SANTOS, 1999; 2006; 2012); lugar como encontro de trajetórias (MASSEY, 2008); habitar e Educação OnLIFE (SCHLEMMER; BACKES; PALAGI, 2021; DI FELICE, 2009).</w:t>
+      </w:r>
+    </w:p>
+    <w:p>
+      <w:pPr>
+        <w:pStyle w:val="ListBullet"/>
+      </w:pPr>
+      <w:r>
+        <w:rPr>
+          <w:b/>
+        </w:rPr>
+        <w:t xml:space="preserve">A cultura digital: </w:t>
+      </w:r>
+      <w:r>
+        <w:t>Contexto das tecnologias digitais, sem virar categoria de análise: participação consciente e democrática (BRASIL, 2023, art. 3º, III) e competência geral 5 da BNCC (BRASIL, 2018); capitalismo de vigilância (ZUBOFF, 2021) e dados pessoais (SILVEIRA, 2017); solucionismo (MOROZOV, 2018); sujeitos como produtores de cultura (PRETTO; CORDEIRO; OLIVEIRA, 2013). Entra no campo pelo Eixo 6 da entrevista.</w:t>
       </w:r>
     </w:p>
     <w:p>
@@ -5162,7 +5176,7 @@
           <w:color w:val="555555"/>
           <w:sz w:val="20"/>
         </w:rPr>
-        <w:t>10 s  ·  ao final: 13:33</w:t>
+        <w:t>10 s  ·  ao final: 13:40</w:t>
       </w:r>
     </w:p>
     <w:tbl>
@@ -5245,7 +5259,7 @@
           <w:color w:val="555555"/>
           <w:sz w:val="20"/>
         </w:rPr>
-        <w:t>50 s  ·  ao final: 14:23</w:t>
+        <w:t>50 s  ·  ao final: 14:30</w:t>
       </w:r>
     </w:p>
     <w:tbl>
@@ -5495,7 +5509,7 @@
           <w:color w:val="555555"/>
           <w:sz w:val="20"/>
         </w:rPr>
-        <w:t>50 s  ·  ao final: 15:13</w:t>
+        <w:t>50 s  ·  ao final: 15:20</w:t>
       </w:r>
     </w:p>
     <w:tbl>
@@ -5758,7 +5772,7 @@
           <w:color w:val="555555"/>
           <w:sz w:val="20"/>
         </w:rPr>
-        <w:t>10 s  ·  ao final: 15:23</w:t>
+        <w:t>10 s  ·  ao final: 15:30</w:t>
       </w:r>
     </w:p>
     <w:tbl>
@@ -5841,7 +5855,7 @@
           <w:color w:val="555555"/>
           <w:sz w:val="20"/>
         </w:rPr>
-        <w:t>65 s  ·  ao final: 16:28</w:t>
+        <w:t>65 s  ·  ao final: 16:35</w:t>
       </w:r>
     </w:p>
     <w:p>
@@ -6074,7 +6088,7 @@
           <w:color w:val="555555"/>
           <w:sz w:val="20"/>
         </w:rPr>
-        <w:t>70 s  ·  ao final: 17:38</w:t>
+        <w:t>70 s  ·  ao final: 17:45</w:t>
       </w:r>
     </w:p>
     <w:p>
@@ -6321,7 +6335,7 @@
           <w:color w:val="555555"/>
           <w:sz w:val="20"/>
         </w:rPr>
-        <w:t>85 s  ·  ao final: 19:03</w:t>
+        <w:t>85 s  ·  ao final: 19:10</w:t>
       </w:r>
     </w:p>
     <w:p>
@@ -6618,7 +6632,7 @@
           <w:color w:val="555555"/>
           <w:sz w:val="20"/>
         </w:rPr>
-        <w:t>10 s  ·  ao final: 19:13</w:t>
+        <w:t>10 s  ·  ao final: 19:20</w:t>
       </w:r>
     </w:p>
     <w:tbl>
@@ -6701,7 +6715,7 @@
           <w:color w:val="555555"/>
           <w:sz w:val="20"/>
         </w:rPr>
-        <w:t>65 s  ·  ao final: 20:18</w:t>
+        <w:t>65 s  ·  ao final: 20:25</w:t>
       </w:r>
     </w:p>
     <w:p>
@@ -6971,7 +6985,7 @@
           <w:color w:val="555555"/>
           <w:sz w:val="20"/>
         </w:rPr>
-        <w:t>40 s  ·  ao final: 20:58</w:t>
+        <w:t>35 s  ·  ao final: 21:00</w:t>
       </w:r>
     </w:p>
     <w:p>
@@ -7230,7 +7244,7 @@
           <w:color w:val="555555"/>
           <w:sz w:val="20"/>
         </w:rPr>
-        <w:t>50 s  ·  ao final: 21:48</w:t>
+        <w:t>50 s  ·  ao final: 21:50</w:t>
       </w:r>
     </w:p>
     <w:p>
@@ -7488,7 +7502,7 @@
           <w:color w:val="555555"/>
           <w:sz w:val="20"/>
         </w:rPr>
-        <w:t>75 s  ·  ao final: 23:03</w:t>
+        <w:t>75 s  ·  ao final: 23:05</w:t>
       </w:r>
     </w:p>
     <w:p>
@@ -7693,7 +7707,7 @@
           <w:color w:val="555555"/>
           <w:sz w:val="20"/>
         </w:rPr>
-        <w:t>37 s  ·  ao final: 23:40</w:t>
+        <w:t>35 s  ·  ao final: 23:40</w:t>
       </w:r>
     </w:p>
     <w:p>

</xml_diff>

<commit_message>
Deixa apenas teóricos no slide de conceitos, sem leis e documentos normativos
Co-Authored-By: Claude Opus 5.5 <noreply@anthropic.com>
Claude-Session: https://claude.ai/code/session_01HxStpW4pQoDfJdTDYr6zEC
</commit_message>
<xml_diff>
--- a/apresentacao_qualificacao/ROTEIRO_E_ESTUDO_DIRIGIDO.docx
+++ b/apresentacao_qualificacao/ROTEIRO_E_ESTUDO_DIRIGIDO.docx
@@ -52,7 +52,7 @@
         <w:pStyle w:val="ListBullet"/>
       </w:pPr>
       <w:r>
-        <w:t>A fala soma 3107 palavras, cerca de 25 minutos a 125 palavras por minuto, ritmo pausado. O restante dos 25 minutos fica para trocas de slide, pausas e o tempo de apontar fotos e mapa.</w:t>
+        <w:t>A fala soma 3099 palavras, cerca de 25 minutos a 125 palavras por minuto, ritmo pausado. O restante dos 25 minutos fica para trocas de slide, pausas e o tempo de apontar fotos e mapa.</w:t>
       </w:r>
     </w:p>
     <w:p>
@@ -60,7 +60,7 @@
         <w:pStyle w:val="ListBullet"/>
       </w:pPr>
       <w:r>
-        <w:t>Pontos de controle: fim do slide 10 por volta de 08:40; fim do slide 18 por volta de 15:20; fim do slide 26 por volta de 21:50.</w:t>
+        <w:t>Pontos de controle: fim do slide 10 por volta de 08:40; fim do slide 18 por volta de 15:15; fim do slide 26 por volta de 21:50.</w:t>
       </w:r>
     </w:p>
     <w:p>
@@ -322,7 +322,7 @@
           </w:tcPr>
           <w:p>
             <w:r>
-              <w:t>04:50</w:t>
+              <w:t>04:45</w:t>
             </w:r>
           </w:p>
         </w:tc>
@@ -332,7 +332,7 @@
           </w:tcPr>
           <w:p>
             <w:r>
-              <w:t>13:30</w:t>
+              <w:t>13:25</w:t>
             </w:r>
           </w:p>
         </w:tc>
@@ -374,7 +374,7 @@
           </w:tcPr>
           <w:p>
             <w:r>
-              <w:t>15:20</w:t>
+              <w:t>15:15</w:t>
             </w:r>
           </w:p>
         </w:tc>
@@ -406,7 +406,7 @@
           </w:tcPr>
           <w:p>
             <w:r>
-              <w:t>03:50</w:t>
+              <w:t>03:55</w:t>
             </w:r>
           </w:p>
         </w:tc>
@@ -4891,7 +4891,7 @@
           <w:color w:val="555555"/>
           <w:sz w:val="20"/>
         </w:rPr>
-        <w:t>50 s  ·  ao final: 13:30</w:t>
+        <w:t>45 s  ·  ao final: 13:25</w:t>
       </w:r>
     </w:p>
     <w:p>
@@ -4900,7 +4900,7 @@
           <w:i/>
           <w:color w:val="555555"/>
         </w:rPr>
-        <w:t>[Apontar as cinco colunas da esquerda para a direita e, por fim, a faixa amarela.]</w:t>
+        <w:t>[Apontar as quatro colunas da esquerda para a direita e, por fim, a faixa amarela.]</w:t>
       </w:r>
     </w:p>
     <w:tbl>
@@ -4928,7 +4928,7 @@
               <w:rPr>
                 <w:sz w:val="24"/>
               </w:rPr>
-              <w:t>Reúno os conceitos e os autores que guiam a tese. A política é lida pelo ciclo de políticas, de Bowe, Ball e Gold, com Mainardes, e pela teoria da atuação de Ball, Maguire e Braun. Os profissionais, pelas culturas profissionais de Hargreaves, pela performatividade em Ball, pelo poder em Foucault e pelos sentidos em Hall. O território, por Milton Santos e Doreen Massey e pelo habitar em Schlemmer, Backes e Palagi. A cultura digital, pela participação que a lei promete e pela crítica às plataformas e aos dados, com Zuboff, Silveira, Morozov e Pretto. As crianças, pelo Comentário Geral nº 25 da ONU. Daí nascem as três formulações da tese.</w:t>
+              <w:t>Reúno os conceitos e os autores que guiam a tese. A política é lida pelo ciclo de políticas, de Bowe, Ball e Gold, com Mainardes, e pela teoria da atuação de Ball, Maguire e Braun. Os profissionais, pelas culturas profissionais de Hargreaves, pela performatividade em Ball, pelo poder em Foucault e pelos sentidos em Hall. O território, por Milton Santos e Doreen Massey e pelo habitar em Schlemmer, Backes e Palagi. A cultura digital, pela crítica às plataformas e aos dados, com Zuboff, Silveira e Morozov, e pelos sujeitos como produtores de cultura, com Pretto. Daí nascem as três formulações da tese.</w:t>
             </w:r>
           </w:p>
         </w:tc>
@@ -4962,7 +4962,7 @@
       <w:r>
         <w:drawing>
           <wp:inline xmlns:a="http://schemas.openxmlformats.org/drawingml/2006/main" xmlns:pic="http://schemas.openxmlformats.org/drawingml/2006/picture">
-            <wp:extent cx="5903999" cy="3937967"/>
+            <wp:extent cx="5903999" cy="3447935"/>
             <wp:docPr id="12" name="Picture 12"/>
             <wp:cNvGraphicFramePr>
               <a:graphicFrameLocks noChangeAspect="1"/>
@@ -4983,7 +4983,7 @@
                   <pic:spPr>
                     <a:xfrm>
                       <a:off x="0" y="0"/>
-                      <a:ext cx="5903999" cy="3937967"/>
+                      <a:ext cx="5903999" cy="3447935"/>
                     </a:xfrm>
                     <a:prstGeom prst="rect"/>
                   </pic:spPr>
@@ -5002,7 +5002,7 @@
         <w:t xml:space="preserve">Ideia central: </w:t>
       </w:r>
       <w:r>
-        <w:t>Síntese do quadro teórico em cinco frentes (política, profissionais, território, cultura digital, crianças) e as três formulações próprias da tese.</w:t>
+        <w:t>Síntese do quadro teórico em quatro frentes (política, profissionais, território, cultura digital); só teóricos, sem leis nem documentos normativos, e as três formulações próprias da tese.</w:t>
       </w:r>
     </w:p>
     <w:p>
@@ -5066,7 +5066,7 @@
         <w:t xml:space="preserve">A cultura digital: </w:t>
       </w:r>
       <w:r>
-        <w:t>Contexto das tecnologias digitais, sem virar categoria de análise: participação consciente e democrática (BRASIL, 2023, art. 3º, III) e competência geral 5 da BNCC (BRASIL, 2018); capitalismo de vigilância (ZUBOFF, 2021) e dados pessoais (SILVEIRA, 2017); solucionismo (MOROZOV, 2018); sujeitos como produtores de cultura (PRETTO; CORDEIRO; OLIVEIRA, 2013). Entra no campo pelo Eixo 6 da entrevista.</w:t>
+        <w:t>Contexto das tecnologias digitais, sem virar categoria de análise: capitalismo de vigilância (ZUBOFF, 2021) e dados pessoais (SILVEIRA, 2017); solucionismo (MOROZOV, 2018); sujeitos como produtores de cultura (PRETTO; CORDEIRO; OLIVEIRA, 2013). Entra no campo pelo Eixo 6 da entrevista.</w:t>
       </w:r>
     </w:p>
     <w:p>
@@ -5077,35 +5077,21 @@
         <w:rPr>
           <w:b/>
         </w:rPr>
-        <w:t xml:space="preserve">As crianças: </w:t>
-      </w:r>
-      <w:r>
-        <w:t>Provisão, proteção e participação no ambiente digital (ONU, 2021); direitos do eixo à participação e à proteção dos dados (BRASIL, 2023, art. 3º, III e IV).</w:t>
-      </w:r>
-    </w:p>
-    <w:p>
-      <w:pPr>
-        <w:pStyle w:val="ListBullet"/>
-      </w:pPr>
+        <w:t xml:space="preserve">Formulações da tese: </w:t>
+      </w:r>
+      <w:r>
+        <w:t>Habitar o digital (cap. 3), rugosidade tecnológica (cap. 6) e vazio material (cap. 5).</w:t>
+      </w:r>
+    </w:p>
+    <w:p>
       <w:r>
         <w:rPr>
           <w:b/>
         </w:rPr>
-        <w:t xml:space="preserve">Formulações da tese: </w:t>
-      </w:r>
-      <w:r>
-        <w:t>Habitar o digital (cap. 3), rugosidade tecnológica (cap. 6) e vazio material (cap. 5).</w:t>
-      </w:r>
-    </w:p>
-    <w:p>
-      <w:r>
-        <w:rPr>
-          <w:b/>
-        </w:rPr>
         <w:t xml:space="preserve">Autores e obras: </w:t>
       </w:r>
       <w:r>
-        <w:t>Os mesmos autores dos slides 12 a 14, reunidos.</w:t>
+        <w:t>Os mesmos autores dos slides 12 a 14, reunidos. A ONU (2021) e as normas ficam fora deste slide por não serem referenciais teóricos; as crianças aparecem nos slides 5, 6 e 28.</w:t>
       </w:r>
     </w:p>
     <w:p>
@@ -5176,7 +5162,7 @@
           <w:color w:val="555555"/>
           <w:sz w:val="20"/>
         </w:rPr>
-        <w:t>10 s  ·  ao final: 13:40</w:t>
+        <w:t>10 s  ·  ao final: 13:35</w:t>
       </w:r>
     </w:p>
     <w:tbl>
@@ -5259,7 +5245,7 @@
           <w:color w:val="555555"/>
           <w:sz w:val="20"/>
         </w:rPr>
-        <w:t>50 s  ·  ao final: 14:30</w:t>
+        <w:t>50 s  ·  ao final: 14:25</w:t>
       </w:r>
     </w:p>
     <w:tbl>
@@ -5509,7 +5495,7 @@
           <w:color w:val="555555"/>
           <w:sz w:val="20"/>
         </w:rPr>
-        <w:t>50 s  ·  ao final: 15:20</w:t>
+        <w:t>50 s  ·  ao final: 15:15</w:t>
       </w:r>
     </w:p>
     <w:tbl>
@@ -5772,7 +5758,7 @@
           <w:color w:val="555555"/>
           <w:sz w:val="20"/>
         </w:rPr>
-        <w:t>10 s  ·  ao final: 15:30</w:t>
+        <w:t>10 s  ·  ao final: 15:25</w:t>
       </w:r>
     </w:p>
     <w:tbl>
@@ -5855,7 +5841,7 @@
           <w:color w:val="555555"/>
           <w:sz w:val="20"/>
         </w:rPr>
-        <w:t>65 s  ·  ao final: 16:35</w:t>
+        <w:t>65 s  ·  ao final: 16:30</w:t>
       </w:r>
     </w:p>
     <w:p>
@@ -6088,7 +6074,7 @@
           <w:color w:val="555555"/>
           <w:sz w:val="20"/>
         </w:rPr>
-        <w:t>70 s  ·  ao final: 17:45</w:t>
+        <w:t>75 s  ·  ao final: 17:45</w:t>
       </w:r>
     </w:p>
     <w:p>

</xml_diff>

<commit_message>
Retira o objetivo (a) e divide o antigo (d) em formas de atuação e implicações para as crianças
Co-Authored-By: Claude Opus 5.5 <noreply@anthropic.com>
Claude-Session: https://claude.ai/code/session_01HxStpW4pQoDfJdTDYr6zEC
</commit_message>
<xml_diff>
--- a/apresentacao_qualificacao/ROTEIRO_E_ESTUDO_DIRIGIDO.docx
+++ b/apresentacao_qualificacao/ROTEIRO_E_ESTUDO_DIRIGIDO.docx
@@ -52,7 +52,7 @@
         <w:pStyle w:val="ListBullet"/>
       </w:pPr>
       <w:r>
-        <w:t>A fala soma 3099 palavras, cerca de 25 minutos a 125 palavras por minuto, ritmo pausado. O restante dos 25 minutos fica para trocas de slide, pausas e o tempo de apontar fotos e mapa.</w:t>
+        <w:t>A fala soma 3071 palavras, cerca de 25 minutos a 125 palavras por minuto, ritmo pausado. O restante dos 25 minutos fica para trocas de slide, pausas e o tempo de apontar fotos e mapa.</w:t>
       </w:r>
     </w:p>
     <w:p>
@@ -60,7 +60,7 @@
         <w:pStyle w:val="ListBullet"/>
       </w:pPr>
       <w:r>
-        <w:t>Pontos de controle: fim do slide 10 por volta de 08:40; fim do slide 18 por volta de 15:15; fim do slide 26 por volta de 21:50.</w:t>
+        <w:t>Pontos de controle: fim do slide 10 por volta de 08:35; fim do slide 18 por volta de 15:15; fim do slide 26 por volta de 21:50.</w:t>
       </w:r>
     </w:p>
     <w:p>
@@ -196,7 +196,7 @@
           </w:tcPr>
           <w:p>
             <w:r>
-              <w:t>00:55</w:t>
+              <w:t>01:00</w:t>
             </w:r>
           </w:p>
         </w:tc>
@@ -206,7 +206,7 @@
           </w:tcPr>
           <w:p>
             <w:r>
-              <w:t>00:55</w:t>
+              <w:t>01:00</w:t>
             </w:r>
           </w:p>
         </w:tc>
@@ -238,7 +238,7 @@
           </w:tcPr>
           <w:p>
             <w:r>
-              <w:t>05:15</w:t>
+              <w:t>05:05</w:t>
             </w:r>
           </w:p>
         </w:tc>
@@ -248,7 +248,7 @@
           </w:tcPr>
           <w:p>
             <w:r>
-              <w:t>06:10</w:t>
+              <w:t>06:05</w:t>
             </w:r>
           </w:p>
         </w:tc>
@@ -290,7 +290,7 @@
           </w:tcPr>
           <w:p>
             <w:r>
-              <w:t>08:40</w:t>
+              <w:t>08:35</w:t>
             </w:r>
           </w:p>
         </w:tc>
@@ -322,7 +322,7 @@
           </w:tcPr>
           <w:p>
             <w:r>
-              <w:t>04:45</w:t>
+              <w:t>04:50</w:t>
             </w:r>
           </w:p>
         </w:tc>
@@ -1955,7 +1955,7 @@
           <w:color w:val="555555"/>
           <w:sz w:val="20"/>
         </w:rPr>
-        <w:t>30 s  ·  ao final: 00:30</w:t>
+        <w:t>35 s  ·  ao final: 00:35</w:t>
       </w:r>
     </w:p>
     <w:p>
@@ -2113,7 +2113,7 @@
           <w:color w:val="555555"/>
           <w:sz w:val="20"/>
         </w:rPr>
-        <w:t>25 s  ·  ao final: 00:55</w:t>
+        <w:t>25 s  ·  ao final: 01:00</w:t>
       </w:r>
     </w:p>
     <w:p>
@@ -2218,7 +2218,7 @@
           <w:color w:val="555555"/>
           <w:sz w:val="20"/>
         </w:rPr>
-        <w:t>55 s  ·  ao final: 01:50</w:t>
+        <w:t>55 s  ·  ao final: 01:55</w:t>
       </w:r>
     </w:p>
     <w:tbl>
@@ -2454,7 +2454,7 @@
           <w:color w:val="555555"/>
           <w:sz w:val="20"/>
         </w:rPr>
-        <w:t>55 s  ·  ao final: 02:45</w:t>
+        <w:t>55 s  ·  ao final: 02:50</w:t>
       </w:r>
     </w:p>
     <w:p>
@@ -2726,7 +2726,7 @@
           <w:color w:val="555555"/>
           <w:sz w:val="20"/>
         </w:rPr>
-        <w:t>90 s  ·  ao final: 04:15</w:t>
+        <w:t>80 s  ·  ao final: 04:10</w:t>
       </w:r>
     </w:p>
     <w:p>
@@ -2735,7 +2735,7 @@
           <w:i/>
           <w:color w:val="555555"/>
         </w:rPr>
-        <w:t>[Cada cartão tem um rótulo: do município a Pipa, interpretação, condições e território, formas de atuação e crianças. Destacar os verbos: analisar, compreender, examinar, identificar.]</w:t>
+        <w:t>[Cada cartão tem um rótulo: interpretação, condições e território, formas de atuação, crianças. Destacar os verbos: compreender, examinar, identificar, discutir.]</w:t>
       </w:r>
     </w:p>
     <w:tbl>
@@ -2763,7 +2763,7 @@
               <w:rPr>
                 <w:sz w:val="24"/>
               </w:rPr>
-              <w:t>O objetivo geral é analisar a recontextualização da Política Nacional de Educação Digital da Secretaria Municipal de Educação de Tibau do Sul até o contexto da prática da Escola Municipal Domitila Castelo da Silva, considerando a diversidade socioespacial do território municipal, as culturas profissionais e as condições materiais e institucionais da rede e da escola. Os quatro objetivos específicos seguem o funil. O primeiro faz o caminho do município a Pipa: analisar a recontextualização da PNED pela Secretaria em planos, currículos, formações e orientações, considerando as especificidades das localidades, entre elas as áreas rurais e a comunidade quilombola de Sibaúma, até chegar a Pipa. O segundo é compreender a interpretação da política e das orientações municipais pelos profissionais da escola, à luz de suas experiências, crenças e valores. O terceiro é examinar a relação entre as condições materiais e institucionais da escola, articuladas às especificidades de Pipa, e a tradução da política em ações e escolhas cotidianas. O quarto é identificar as formas de atuação produzidas, da adesão à resistência, e suas implicações para a provisão, a proteção e a participação das crianças no ambiente digital.</w:t>
+              <w:t>O objetivo geral é analisar a recontextualização da Política Nacional de Educação Digital da Secretaria Municipal de Educação de Tibau do Sul até o contexto da prática da Escola Municipal Domitila Castelo da Silva, em Pipa, considerando a diversidade socioespacial do território municipal, as culturas profissionais e as condições materiais e institucionais da rede e da escola. O caminho do município a Pipa já está no objetivo geral, e os quatro específicos se concentram na escola. O primeiro é compreender a interpretação da política e das orientações municipais pelos profissionais, à luz de suas experiências, crenças e valores. O segundo é examinar a relação entre as condições da escola, articuladas às especificidades de Pipa, e a tradução da política em ações cotidianas. O terceiro é identificar as formas de atuação produzidas, da adesão à resistência. O quarto é discutir as implicações dessas formas de atuação para a provisão, a proteção e a participação das crianças no ambiente digital.</w:t>
             </w:r>
           </w:p>
         </w:tc>
@@ -2837,7 +2837,7 @@
         <w:t xml:space="preserve">Ideia central: </w:t>
       </w:r>
       <w:r>
-        <w:t>Um objetivo geral e quatro específicos, em funil: do município a Pipa, interpretação, condições e território, formas de atuação e crianças.</w:t>
+        <w:t>Um objetivo geral, que já contém o percurso do município a Pipa, e quatro específicos voltados à escola: interpretação, condições e território, formas de atuação e crianças.</w:t>
       </w:r>
     </w:p>
     <w:p>
@@ -2856,10 +2856,10 @@
         <w:rPr>
           <w:b/>
         </w:rPr>
-        <w:t xml:space="preserve">Do município a Pipa (obj. a): </w:t>
-      </w:r>
-      <w:r>
-        <w:t>Analisar a recontextualização da PNED pela SME em planos, currículos, formações e orientações, considerando as localidades (áreas rurais, comunidade quilombola de Sibaúma), até chegar a Pipa. É onde a dimensão externa do contexto ganha fonte própria.</w:t>
+        <w:t xml:space="preserve">Objetivo geral: </w:t>
+      </w:r>
+      <w:r>
+        <w:t>Analisar a recontextualização da PNED da SME até o contexto da prática da escola de Pipa, considerando a diversidade socioespacial do município, as culturas profissionais e as condições da rede e da escola. O funil (território, SME, Pipa) está aqui.</w:t>
       </w:r>
     </w:p>
     <w:p>
@@ -2870,7 +2870,7 @@
         <w:rPr>
           <w:b/>
         </w:rPr>
-        <w:t xml:space="preserve">Interpretação (obj. b): </w:t>
+        <w:t xml:space="preserve">Interpretação (obj. a): </w:t>
       </w:r>
       <w:r>
         <w:t>Compreender como os profissionais leem a PNED e as orientações municipais a partir de experiências, crenças, valores e organização do trabalho. Dialoga com culturas profissionais (Hargreaves).</w:t>
@@ -2884,7 +2884,7 @@
         <w:rPr>
           <w:b/>
         </w:rPr>
-        <w:t xml:space="preserve">Condições e território (obj. c): </w:t>
+        <w:t xml:space="preserve">Condições e território (obj. b): </w:t>
       </w:r>
       <w:r>
         <w:t>Examinar a relação entre as condições da escola, articuladas às especificidades de Pipa, e a tradução da política. Dimensões situada e material (BMB, 2016, p. 38).</w:t>
@@ -2898,10 +2898,10 @@
         <w:rPr>
           <w:b/>
         </w:rPr>
-        <w:t xml:space="preserve">Formas de atuação e crianças (obj. d): </w:t>
-      </w:r>
-      <w:r>
-        <w:t>Identificar as formas de atuação, da adesão à resistência, e suas implicações para provisão, proteção e participação das crianças no ambiente digital (ONU, 2021).</w:t>
+        <w:t xml:space="preserve">Formas de atuação (obj. c): </w:t>
+      </w:r>
+      <w:r>
+        <w:t>Identificar as formas de atuação, da adesão à resistência, sem pressupor qual prevalece.</w:t>
       </w:r>
     </w:p>
     <w:p>
@@ -2912,10 +2912,24 @@
         <w:rPr>
           <w:b/>
         </w:rPr>
+        <w:t xml:space="preserve">Crianças (obj. d): </w:t>
+      </w:r>
+      <w:r>
+        <w:t>Discutir as implicações dessas formas de atuação para provisão, proteção e participação das crianças no ambiente digital (ONU, 2021).</w:t>
+      </w:r>
+    </w:p>
+    <w:p>
+      <w:pPr>
+        <w:pStyle w:val="ListBullet"/>
+      </w:pPr>
+      <w:r>
+        <w:rPr>
+          <w:b/>
+        </w:rPr>
         <w:t xml:space="preserve">Verbos: </w:t>
       </w:r>
       <w:r>
-        <w:t>Analisar, compreender, examinar, identificar: um verbo por objetivo.</w:t>
+        <w:t>Compreender, examinar, identificar, discutir: um verbo por objetivo, sem repetir o "analisar" do geral.</w:t>
       </w:r>
     </w:p>
     <w:p>
@@ -2956,7 +2970,7 @@
         <w:rPr>
           <w:i/>
         </w:rPr>
-        <w:t>Em que capítulo cada objetivo é respondido? (a: caps. 6 e 7; b, c, d: cap. 7 com as narrativas; Quadro 9 do cap. 4).</w:t>
+        <w:t>Por que não há objetivo específico sobre a Secretaria? (o percurso do município a Pipa está no objetivo geral; a SME entra pelos documentos e pela entrevista com o técnico, como contexto da escola).</w:t>
       </w:r>
     </w:p>
     <w:p>
@@ -2967,7 +2981,7 @@
         <w:rPr>
           <w:i/>
         </w:rPr>
-        <w:t>Por que o objetivo (a) não ouve outras escolas? (a rede entra por documentos, dados e o técnico da SME).</w:t>
+        <w:t>Por que separar formas de atuação e crianças? (identificar o que os profissionais fazem é diferente de discutir o que isso implica para os direitos das crianças).</w:t>
       </w:r>
     </w:p>
     <w:p>
@@ -2984,7 +2998,7 @@
           <w:color w:val="555555"/>
           <w:sz w:val="20"/>
         </w:rPr>
-        <w:t>60 s  ·  ao final: 05:15</w:t>
+        <w:t>60 s  ·  ao final: 05:10</w:t>
       </w:r>
     </w:p>
     <w:tbl>
@@ -3208,7 +3222,7 @@
           <w:color w:val="555555"/>
           <w:sz w:val="20"/>
         </w:rPr>
-        <w:t>55 s  ·  ao final: 06:10</w:t>
+        <w:t>55 s  ·  ao final: 06:05</w:t>
       </w:r>
     </w:p>
     <w:tbl>
@@ -3445,7 +3459,7 @@
           <w:color w:val="555555"/>
           <w:sz w:val="20"/>
         </w:rPr>
-        <w:t>10 s  ·  ao final: 06:20</w:t>
+        <w:t>10 s  ·  ao final: 06:15</w:t>
       </w:r>
     </w:p>
     <w:tbl>
@@ -3528,7 +3542,7 @@
           <w:color w:val="555555"/>
           <w:sz w:val="20"/>
         </w:rPr>
-        <w:t>60 s  ·  ao final: 07:20</w:t>
+        <w:t>60 s  ·  ao final: 07:15</w:t>
       </w:r>
     </w:p>
     <w:tbl>
@@ -3777,7 +3791,7 @@
           <w:color w:val="555555"/>
           <w:sz w:val="20"/>
         </w:rPr>
-        <w:t>80 s  ·  ao final: 08:40</w:t>
+        <w:t>80 s  ·  ao final: 08:35</w:t>
       </w:r>
     </w:p>
     <w:p>
@@ -3995,7 +4009,7 @@
           <w:color w:val="555555"/>
           <w:sz w:val="20"/>
         </w:rPr>
-        <w:t>10 s  ·  ao final: 08:50</w:t>
+        <w:t>10 s  ·  ao final: 08:45</w:t>
       </w:r>
     </w:p>
     <w:tbl>
@@ -4078,7 +4092,7 @@
           <w:color w:val="555555"/>
           <w:sz w:val="20"/>
         </w:rPr>
-        <w:t>85 s  ·  ao final: 10:15</w:t>
+        <w:t>85 s  ·  ao final: 10:10</w:t>
       </w:r>
     </w:p>
     <w:p>
@@ -4364,7 +4378,7 @@
           <w:color w:val="555555"/>
           <w:sz w:val="20"/>
         </w:rPr>
-        <w:t>80 s  ·  ao final: 11:35</w:t>
+        <w:t>80 s  ·  ao final: 11:30</w:t>
       </w:r>
     </w:p>
     <w:tbl>
@@ -4616,7 +4630,7 @@
           <w:color w:val="555555"/>
           <w:sz w:val="20"/>
         </w:rPr>
-        <w:t>65 s  ·  ao final: 12:40</w:t>
+        <w:t>65 s  ·  ao final: 12:35</w:t>
       </w:r>
     </w:p>
     <w:p>
@@ -4891,7 +4905,7 @@
           <w:color w:val="555555"/>
           <w:sz w:val="20"/>
         </w:rPr>
-        <w:t>45 s  ·  ao final: 13:25</w:t>
+        <w:t>50 s  ·  ao final: 13:25</w:t>
       </w:r>
     </w:p>
     <w:p>
@@ -6912,7 +6926,7 @@
         <w:t xml:space="preserve">Onde aprofundar: </w:t>
       </w:r>
       <w:r>
-        <w:t>Cap. 6, seções 6.1.1 e 6.1.2; Cap. 4, Quadro 9 (objetivo a).</w:t>
+        <w:t>Cap. 6, seções 6.1.1 e 6.1.2; Cap. 4, Quadro 9 (percurso do objetivo geral).</w:t>
       </w:r>
     </w:p>
     <w:p>

</xml_diff>

<commit_message>
Reorganiza os slides teóricos sem repetição e dá ao digital um slide próprio
Slide 15 passa a tratar do digital (habitar o digital, por que ensiná-lo e o
ambiente de plataformas e dados); o território fica no slide 14, com Castells;
as condições de trabalho (Queiroz e Paiva) entram no slide 13. Referências
equilibradas por tamanho.

Co-Authored-By: Claude Opus 5.5 <noreply@anthropic.com>
Claude-Session: https://claude.ai/code/session_01HxStpW4pQoDfJdTDYr6zEC
</commit_message>
<xml_diff>
--- a/apresentacao_qualificacao/ROTEIRO_E_ESTUDO_DIRIGIDO.docx
+++ b/apresentacao_qualificacao/ROTEIRO_E_ESTUDO_DIRIGIDO.docx
@@ -52,7 +52,7 @@
         <w:pStyle w:val="ListBullet"/>
       </w:pPr>
       <w:r>
-        <w:t>A fala soma 3071 palavras, cerca de 25 minutos a 125 palavras por minuto, ritmo pausado. O restante dos 25 minutos fica para trocas de slide, pausas e o tempo de apontar fotos e mapa.</w:t>
+        <w:t>A fala soma 3035 palavras, cerca de 24 minutos a 125 palavras por minuto, ritmo pausado. O restante dos 25 minutos fica para trocas de slide, pausas e o tempo de apontar fotos e mapa.</w:t>
       </w:r>
     </w:p>
     <w:p>
@@ -60,7 +60,7 @@
         <w:pStyle w:val="ListBullet"/>
       </w:pPr>
       <w:r>
-        <w:t>Pontos de controle: fim do slide 10 por volta de 08:35; fim do slide 18 por volta de 15:15; fim do slide 26 por volta de 21:50.</w:t>
+        <w:t>Pontos de controle: fim do slide 10 por volta de 08:40; fim do slide 18 por volta de 15:15; fim do slide 26 por volta de 21:50.</w:t>
       </w:r>
     </w:p>
     <w:p>
@@ -238,7 +238,7 @@
           </w:tcPr>
           <w:p>
             <w:r>
-              <w:t>05:05</w:t>
+              <w:t>05:10</w:t>
             </w:r>
           </w:p>
         </w:tc>
@@ -248,7 +248,7 @@
           </w:tcPr>
           <w:p>
             <w:r>
-              <w:t>06:05</w:t>
+              <w:t>06:10</w:t>
             </w:r>
           </w:p>
         </w:tc>
@@ -290,7 +290,7 @@
           </w:tcPr>
           <w:p>
             <w:r>
-              <w:t>08:35</w:t>
+              <w:t>08:40</w:t>
             </w:r>
           </w:p>
         </w:tc>
@@ -322,7 +322,7 @@
           </w:tcPr>
           <w:p>
             <w:r>
-              <w:t>04:50</w:t>
+              <w:t>04:45</w:t>
             </w:r>
           </w:p>
         </w:tc>
@@ -788,7 +788,7 @@
               <w:rPr>
                 <w:sz w:val="20"/>
               </w:rPr>
-              <w:t>12, 15</w:t>
+              <w:t>12</w:t>
             </w:r>
           </w:p>
         </w:tc>
@@ -842,7 +842,7 @@
               <w:rPr>
                 <w:sz w:val="20"/>
               </w:rPr>
-              <w:t>1, 3, 12, 15</w:t>
+              <w:t>1, 3, 12</w:t>
             </w:r>
           </w:p>
         </w:tc>
@@ -1004,7 +1004,7 @@
               <w:rPr>
                 <w:sz w:val="20"/>
               </w:rPr>
-              <w:t>5, 13, 15</w:t>
+              <w:t>5, 13</w:t>
             </w:r>
           </w:p>
         </w:tc>
@@ -1220,7 +1220,7 @@
               <w:rPr>
                 <w:sz w:val="20"/>
               </w:rPr>
-              <w:t>7, 14, 24, 15</w:t>
+              <w:t>7, 14, 24</w:t>
             </w:r>
           </w:p>
         </w:tc>
@@ -1382,7 +1382,7 @@
               <w:rPr>
                 <w:sz w:val="20"/>
               </w:rPr>
-              <w:t>14, 15</w:t>
+              <w:t>15</w:t>
             </w:r>
           </w:p>
         </w:tc>
@@ -1436,7 +1436,7 @@
               <w:rPr>
                 <w:sz w:val="20"/>
               </w:rPr>
-              <w:t>14, 27</w:t>
+              <w:t>15, 27</w:t>
             </w:r>
           </w:p>
         </w:tc>
@@ -1544,7 +1544,7 @@
               <w:rPr>
                 <w:sz w:val="20"/>
               </w:rPr>
-              <w:t>14, 15</w:t>
+              <w:t>15</w:t>
             </w:r>
           </w:p>
         </w:tc>
@@ -1927,6 +1927,168 @@
           </w:p>
         </w:tc>
       </w:tr>
+      <w:tr>
+        <w:tc>
+          <w:tcPr>
+            <w:tcW w:type="dxa" w:w="2408"/>
+          </w:tcPr>
+          <w:p>
+            <w:r>
+              <w:rPr>
+                <w:sz w:val="20"/>
+              </w:rPr>
+              <w:t>Condições de trabalho docente</w:t>
+            </w:r>
+          </w:p>
+        </w:tc>
+        <w:tc>
+          <w:tcPr>
+            <w:tcW w:type="dxa" w:w="2408"/>
+          </w:tcPr>
+          <w:p>
+            <w:r>
+              <w:rPr>
+                <w:sz w:val="20"/>
+              </w:rPr>
+              <w:t>Oliveira e Vieira (2012) apud Queiroz e Paiva (2014)</w:t>
+            </w:r>
+          </w:p>
+        </w:tc>
+        <w:tc>
+          <w:tcPr>
+            <w:tcW w:type="dxa" w:w="2408"/>
+          </w:tcPr>
+          <w:p>
+            <w:r>
+              <w:rPr>
+                <w:sz w:val="20"/>
+              </w:rPr>
+              <w:t>1.2</w:t>
+            </w:r>
+          </w:p>
+        </w:tc>
+        <w:tc>
+          <w:tcPr>
+            <w:tcW w:type="dxa" w:w="2408"/>
+          </w:tcPr>
+          <w:p>
+            <w:r>
+              <w:rPr>
+                <w:sz w:val="20"/>
+              </w:rPr>
+              <w:t>13</w:t>
+            </w:r>
+          </w:p>
+        </w:tc>
+      </w:tr>
+      <w:tr>
+        <w:tc>
+          <w:tcPr>
+            <w:tcW w:type="dxa" w:w="2408"/>
+          </w:tcPr>
+          <w:p>
+            <w:r>
+              <w:rPr>
+                <w:sz w:val="20"/>
+              </w:rPr>
+              <w:t>Espaço de fluxos</w:t>
+            </w:r>
+          </w:p>
+        </w:tc>
+        <w:tc>
+          <w:tcPr>
+            <w:tcW w:type="dxa" w:w="2408"/>
+          </w:tcPr>
+          <w:p>
+            <w:r>
+              <w:rPr>
+                <w:sz w:val="20"/>
+              </w:rPr>
+              <w:t>Castells (2013)</w:t>
+            </w:r>
+          </w:p>
+        </w:tc>
+        <w:tc>
+          <w:tcPr>
+            <w:tcW w:type="dxa" w:w="2408"/>
+          </w:tcPr>
+          <w:p>
+            <w:r>
+              <w:rPr>
+                <w:sz w:val="20"/>
+              </w:rPr>
+              <w:t>6.2; 6.5</w:t>
+            </w:r>
+          </w:p>
+        </w:tc>
+        <w:tc>
+          <w:tcPr>
+            <w:tcW w:type="dxa" w:w="2408"/>
+          </w:tcPr>
+          <w:p>
+            <w:r>
+              <w:rPr>
+                <w:sz w:val="20"/>
+              </w:rPr>
+              <w:t>14</w:t>
+            </w:r>
+          </w:p>
+        </w:tc>
+      </w:tr>
+      <w:tr>
+        <w:tc>
+          <w:tcPr>
+            <w:tcW w:type="dxa" w:w="2408"/>
+          </w:tcPr>
+          <w:p>
+            <w:r>
+              <w:rPr>
+                <w:sz w:val="20"/>
+              </w:rPr>
+              <w:t>Ensinar o digital: crianças, mediação e exclusão</w:t>
+            </w:r>
+          </w:p>
+        </w:tc>
+        <w:tc>
+          <w:tcPr>
+            <w:tcW w:type="dxa" w:w="2408"/>
+          </w:tcPr>
+          <w:p>
+            <w:r>
+              <w:rPr>
+                <w:sz w:val="20"/>
+              </w:rPr>
+              <w:t>Buckingham (2006); Valente (1999); Castells (2003)</w:t>
+            </w:r>
+          </w:p>
+        </w:tc>
+        <w:tc>
+          <w:tcPr>
+            <w:tcW w:type="dxa" w:w="2408"/>
+          </w:tcPr>
+          <w:p>
+            <w:r>
+              <w:rPr>
+                <w:sz w:val="20"/>
+              </w:rPr>
+              <w:t>1.1; 3.6; 6.5.2</w:t>
+            </w:r>
+          </w:p>
+        </w:tc>
+        <w:tc>
+          <w:tcPr>
+            <w:tcW w:type="dxa" w:w="2408"/>
+          </w:tcPr>
+          <w:p>
+            <w:r>
+              <w:rPr>
+                <w:sz w:val="20"/>
+              </w:rPr>
+              <w:t>15</w:t>
+            </w:r>
+          </w:p>
+        </w:tc>
+      </w:tr>
     </w:tbl>
     <w:p>
       <w:r>
@@ -2454,7 +2616,7 @@
           <w:color w:val="555555"/>
           <w:sz w:val="20"/>
         </w:rPr>
-        <w:t>55 s  ·  ao final: 02:50</w:t>
+        <w:t>60 s  ·  ao final: 02:55</w:t>
       </w:r>
     </w:p>
     <w:p>
@@ -2726,7 +2888,7 @@
           <w:color w:val="555555"/>
           <w:sz w:val="20"/>
         </w:rPr>
-        <w:t>80 s  ·  ao final: 04:10</w:t>
+        <w:t>80 s  ·  ao final: 04:15</w:t>
       </w:r>
     </w:p>
     <w:p>
@@ -2998,7 +3160,7 @@
           <w:color w:val="555555"/>
           <w:sz w:val="20"/>
         </w:rPr>
-        <w:t>60 s  ·  ao final: 05:10</w:t>
+        <w:t>60 s  ·  ao final: 05:15</w:t>
       </w:r>
     </w:p>
     <w:tbl>
@@ -3222,7 +3384,7 @@
           <w:color w:val="555555"/>
           <w:sz w:val="20"/>
         </w:rPr>
-        <w:t>55 s  ·  ao final: 06:05</w:t>
+        <w:t>55 s  ·  ao final: 06:10</w:t>
       </w:r>
     </w:p>
     <w:tbl>
@@ -3459,7 +3621,7 @@
           <w:color w:val="555555"/>
           <w:sz w:val="20"/>
         </w:rPr>
-        <w:t>10 s  ·  ao final: 06:15</w:t>
+        <w:t>10 s  ·  ao final: 06:20</w:t>
       </w:r>
     </w:p>
     <w:tbl>
@@ -3542,7 +3704,7 @@
           <w:color w:val="555555"/>
           <w:sz w:val="20"/>
         </w:rPr>
-        <w:t>60 s  ·  ao final: 07:15</w:t>
+        <w:t>60 s  ·  ao final: 07:20</w:t>
       </w:r>
     </w:p>
     <w:tbl>
@@ -3791,7 +3953,7 @@
           <w:color w:val="555555"/>
           <w:sz w:val="20"/>
         </w:rPr>
-        <w:t>80 s  ·  ao final: 08:35</w:t>
+        <w:t>80 s  ·  ao final: 08:40</w:t>
       </w:r>
     </w:p>
     <w:p>
@@ -4009,7 +4171,7 @@
           <w:color w:val="555555"/>
           <w:sz w:val="20"/>
         </w:rPr>
-        <w:t>10 s  ·  ao final: 08:45</w:t>
+        <w:t>10 s  ·  ao final: 08:50</w:t>
       </w:r>
     </w:p>
     <w:tbl>
@@ -4092,7 +4254,7 @@
           <w:color w:val="555555"/>
           <w:sz w:val="20"/>
         </w:rPr>
-        <w:t>85 s  ·  ao final: 10:10</w:t>
+        <w:t>85 s  ·  ao final: 10:15</w:t>
       </w:r>
     </w:p>
     <w:p>
@@ -4378,7 +4540,7 @@
           <w:color w:val="555555"/>
           <w:sz w:val="20"/>
         </w:rPr>
-        <w:t>80 s  ·  ao final: 11:30</w:t>
+        <w:t>70 s  ·  ao final: 11:25</w:t>
       </w:r>
     </w:p>
     <w:tbl>
@@ -4406,7 +4568,7 @@
               <w:rPr>
                 <w:sz w:val="24"/>
               </w:rPr>
-              <w:t>Dentro do contexto da prática, três noções ajudam a entender o que acontece com a política. As culturas profissionais filtram a leitura. Com Hargreaves, são crenças, valores, hábitos e formas de fazer das comunidades de professores, que podem tomar a forma do individualismo, da colaboração, da colegialidade artificial ou da balcanização. O que uma equipe considera um bom trabalho pesa sobre o que será priorizado. A performatividade pressiona. Ball a descreve como prestação de contas feita de julgamentos, comparações e exposições, e chama de fabricação a escola produzida para ser vista. Se a PNED traz essas exigências à escola é questão para os dados. As relações de poder tensionam. Com Foucault, o poder não é unívoco e tem focos de instabilidade; por isso as formas de atuação vão da adesão à resistência, sem que nenhuma seja pressuposta. Ball adverte contra culpar a escola e contra heroicizar os sujeitos, e Freire lembra que, sem condições favoráveis, o professor se move menos eficazmente no espaço pedagógico.</w:t>
+              <w:t>Dentro do contexto da prática, três noções ajudam a entender o que acontece com a política. As culturas profissionais filtram a leitura. Com Hargreaves, são crenças, valores, hábitos e formas de fazer das comunidades de professores, que podem tomar a forma do individualismo, da colaboração, da colegialidade artificial ou da balcanização. A performatividade pressiona. Ball a descreve como prestação de contas feita de julgamentos, comparações e exposições, e chama de fabricação a escola produzida para ser vista; essa pressão recai sobre um tempo de trabalho já ocupado, como mostram Queiroz e Paiva. As relações de poder tensionam. Com Foucault, o poder não é unívoco e tem focos de instabilidade; por isso as formas de atuação vão da adesão à resistência, sem que nenhuma seja pressuposta, e sem culpar nem heroicizar os sujeitos, como adverte Ball.</w:t>
             </w:r>
           </w:p>
         </w:tc>
@@ -4440,7 +4602,7 @@
       <w:r>
         <w:drawing>
           <wp:inline xmlns:a="http://schemas.openxmlformats.org/drawingml/2006/main" xmlns:pic="http://schemas.openxmlformats.org/drawingml/2006/picture">
-            <wp:extent cx="5903999" cy="2249424"/>
+            <wp:extent cx="5903999" cy="2739456"/>
             <wp:docPr id="10" name="Picture 10"/>
             <wp:cNvGraphicFramePr>
               <a:graphicFrameLocks noChangeAspect="1"/>
@@ -4461,7 +4623,7 @@
                   <pic:spPr>
                     <a:xfrm>
                       <a:off x="0" y="0"/>
-                      <a:ext cx="5903999" cy="2249424"/>
+                      <a:ext cx="5903999" cy="2739456"/>
                     </a:xfrm>
                     <a:prstGeom prst="rect"/>
                   </pic:spPr>
@@ -4576,14 +4738,28 @@
       </w:r>
     </w:p>
     <w:p>
+      <w:pPr>
+        <w:pStyle w:val="ListBullet"/>
+      </w:pPr>
       <w:r>
         <w:rPr>
           <w:b/>
         </w:rPr>
+        <w:t xml:space="preserve">Condições de trabalho: </w:t>
+      </w:r>
+      <w:r>
+        <w:t>Divisão de tarefas, jornada, recursos, tempos e espaços (OLIVEIRA; VIEIRA, 2012, p. 157 apud QUEIROZ; PAIVA, 2014, p. 254); exigências burocráticas que intensificam a jornada (QUEIROZ; PAIVA, 2014, p. 256).</w:t>
+      </w:r>
+    </w:p>
+    <w:p>
+      <w:r>
+        <w:rPr>
+          <w:b/>
+        </w:rPr>
         <w:t xml:space="preserve">Autores e obras: </w:t>
       </w:r>
       <w:r>
-        <w:t>Hargreaves (2005); Ball (2002; 2004; 2008; 2011); Foucault (1999); Freire (2019).</w:t>
+        <w:t>Hargreaves (2005); Ball (2002; 2004; 2008; 2011); Foucault (1999); Freire (2019); Queiroz e Paiva (2014).</w:t>
       </w:r>
     </w:p>
     <w:p>
@@ -4621,7 +4797,7 @@
         <w:pStyle w:val="Heading2"/>
       </w:pPr>
       <w:r>
-        <w:t>Slide 14 · Onde a política é posta em ato</w:t>
+        <w:t>Slide 14 · Onde a política é posta em ato: território e lugar</w:t>
       </w:r>
     </w:p>
     <w:p>
@@ -4630,7 +4806,7 @@
           <w:color w:val="555555"/>
           <w:sz w:val="20"/>
         </w:rPr>
-        <w:t>65 s  ·  ao final: 12:35</w:t>
+        <w:t>55 s  ·  ao final: 12:20</w:t>
       </w:r>
     </w:p>
     <w:p>
@@ -4667,7 +4843,7 @@
               <w:rPr>
                 <w:sz w:val="24"/>
               </w:rPr>
-              <w:t>Falta dizer onde a política é posta em ato. Com Milton Santos, a categoria de análise é o território usado, e as rugosidades são o que fica do passado como forma e paisagem. Com Doreen Massey, o lugar é um encontro de trajetórias. Tibau do Sul reúne lugares assim, e em Pipa as crianças da escola vêm de famílias de moradores antigos, de migrantes, de estrangeiros e de pessoas ligadas ao turismo. Desse diálogo, somado à tradição do habitar em Schlemmer, Backes e Palagi e em Di Felice, nasce a formulação própria da tese: habitar o digital designa as maneiras pelas quais as tecnologias digitais atravessam os espaços, as relações e as práticas cotidianas de um território, produzindo possibilidades desiguais de acesso, participação e apropriação. A formulação será confrontada com os dados e poderá ser revista.</w:t>
+              <w:t>Falta dizer onde a política é posta em ato. Com Milton Santos, a categoria de análise é o território usado, e as rugosidades são o que fica do passado como forma e paisagem. Com Doreen Massey, o lugar é um encontro de trajetórias, e com Castells, Pipa se liga a um espaço de fluxos que ultrapassa o lugar. Santos nomeia ainda a dissonância entre os usos econômicos e os usos sociais dos mesmos recursos: em Pipa, a densidade tecnológica do turismo convive com a escassez nas salas da escola. Massey impede que essa distância seja lida como atraso: escola e polo turístico são contemporâneos.</w:t>
             </w:r>
           </w:p>
         </w:tc>
@@ -4701,7 +4877,7 @@
       <w:r>
         <w:drawing>
           <wp:inline xmlns:a="http://schemas.openxmlformats.org/drawingml/2006/main" xmlns:pic="http://schemas.openxmlformats.org/drawingml/2006/picture">
-            <wp:extent cx="5903999" cy="2946096"/>
+            <wp:extent cx="5903999" cy="2804400"/>
             <wp:docPr id="11" name="Picture 11"/>
             <wp:cNvGraphicFramePr>
               <a:graphicFrameLocks noChangeAspect="1"/>
@@ -4722,7 +4898,7 @@
                   <pic:spPr>
                     <a:xfrm>
                       <a:off x="0" y="0"/>
-                      <a:ext cx="5903999" cy="2946096"/>
+                      <a:ext cx="5903999" cy="2804400"/>
                     </a:xfrm>
                     <a:prstGeom prst="rect"/>
                   </pic:spPr>
@@ -4741,7 +4917,7 @@
         <w:t xml:space="preserve">Ideia central: </w:t>
       </w:r>
       <w:r>
-        <w:t>Território, lugar e a formulação própria da tese.</w:t>
+        <w:t>O território e o lugar onde a política é posta em ato, e a dissonância de Pipa entre o digital do turismo e o da escola.</w:t>
       </w:r>
     </w:p>
     <w:p>
@@ -4802,10 +4978,10 @@
         <w:rPr>
           <w:b/>
         </w:rPr>
-        <w:t xml:space="preserve">Habitar: </w:t>
-      </w:r>
-      <w:r>
-        <w:t>"Tem o significado de estar presente" e "natureza relacional" (SCHLEMMER; BACKES; PALAGI, 2021, p. 15); Educação OnLIFE (p. 24); habitar como prática comunicativa (p. 17).</w:t>
+        <w:t xml:space="preserve">Dissonância: </w:t>
+      </w:r>
+      <w:r>
+        <w:t>"Dissonância entre os usos econômicos e os usos sociais dos mesmos recursos" (SANTOS, 1999, p. 20-21); "distinguem-se zonas servidas pelos meios de conhecimento e áreas desprovidas dessa vantagem" (SANTOS, 2006, p. 163).</w:t>
       </w:r>
     </w:p>
     <w:p>
@@ -4816,10 +4992,10 @@
         <w:rPr>
           <w:b/>
         </w:rPr>
-        <w:t xml:space="preserve">Habitar atópico e ecossistemas informativos: </w:t>
-      </w:r>
-      <w:r>
-        <w:t>Habitar realizado por interfaces, em rede (DI FELICE, 2009, p. 20, citação indireta). Escrita artificial e "novo modo de habitar" (p. 102).</w:t>
+        <w:t xml:space="preserve">Espaço de fluxos: </w:t>
+      </w:r>
+      <w:r>
+        <w:t>"Sequências intencionais, repetitivas e programáveis de intercâmbio e interação entre posições fisicamente desarticuladas" (CASTELLS, 2013, p. 437): Pipa ligada a circuitos turísticos que ultrapassam o lugar.</w:t>
       </w:r>
     </w:p>
     <w:p>
@@ -4830,10 +5006,40 @@
         <w:rPr>
           <w:b/>
         </w:rPr>
-        <w:t xml:space="preserve">Habitar o digital: </w:t>
-      </w:r>
-      <w:r>
-        <w:t>Formulação da tese: maneiras pelas quais as tecnologias digitais atravessam os espaços, as relações e as práticas cotidianas de um território, produzindo possibilidades desiguais de acesso, participação e apropriação.</w:t>
+        <w:t xml:space="preserve">Contemporaneidade: </w:t>
+      </w:r>
+      <w:r>
+        <w:t>Massey critica a operação que "transforma a geografia em história, o espaço em tempo" (MASSEY, 2008, p. 24): escola e polo turístico são contemporâneos.</w:t>
+      </w:r>
+    </w:p>
+    <w:p>
+      <w:r>
+        <w:rPr>
+          <w:b/>
+        </w:rPr>
+        <w:t xml:space="preserve">Autores e obras: </w:t>
+      </w:r>
+      <w:r>
+        <w:t>Santos (1999; 2006); Massey (2008); Castells (2013).</w:t>
+      </w:r>
+    </w:p>
+    <w:p>
+      <w:r>
+        <w:rPr>
+          <w:b/>
+        </w:rPr>
+        <w:t xml:space="preserve">Onde aprofundar: </w:t>
+      </w:r>
+      <w:r>
+        <w:t>Cap. 1, seção 1.4; cap. 3, seção 3.6; cap. 6, seções 6.2 e 6.5.</w:t>
+      </w:r>
+    </w:p>
+    <w:p>
+      <w:r>
+        <w:rPr>
+          <w:b/>
+        </w:rPr>
+        <w:t>Perguntas de estudo</w:t>
       </w:r>
     </w:p>
     <w:p>
@@ -4842,53 +5048,9 @@
       </w:pPr>
       <w:r>
         <w:rPr>
-          <w:b/>
-        </w:rPr>
-        <w:t xml:space="preserve">Plataformas, dados e solucionismo: </w:t>
-      </w:r>
-      <w:r>
-        <w:t>Capitalismo de vigilância (ZUBOFF, 2021, n. p.); privacidade como adversária do mercado de dados (SILVEIRA, 2017, p. 34); solucionismo (MOROZOV, 2018, p. 64, 88, 110); sujeitos como "produtores ativos de cultura" (PRETTO; CORDEIRO; OLIVEIRA, 2013, p. 35). Contexto teórico, sem virar categoria de análise; entra pelo Eixo 6 da entrevista.</w:t>
-      </w:r>
-    </w:p>
-    <w:p>
-      <w:r>
-        <w:rPr>
-          <w:b/>
-        </w:rPr>
-        <w:t xml:space="preserve">Autores e obras: </w:t>
-      </w:r>
-      <w:r>
-        <w:t>Santos (1999; 2006); Massey (2008); Schlemmer, Backes e Palagi (2021); Di Felice (2009); Zuboff (2021); Silveira (2017); Morozov (2018); Pretto, Cordeiro e Oliveira (2013).</w:t>
-      </w:r>
-    </w:p>
-    <w:p>
-      <w:r>
-        <w:rPr>
-          <w:b/>
-        </w:rPr>
-        <w:t xml:space="preserve">Onde aprofundar: </w:t>
-      </w:r>
-      <w:r>
-        <w:t>Cap. 3, seções 3.6 e 3.6.1; Cap. 6, seção 6.4.2 (as formas de habitar o digital em Pipa).</w:t>
-      </w:r>
-    </w:p>
-    <w:p>
-      <w:r>
-        <w:rPr>
-          <w:b/>
-        </w:rPr>
-        <w:t>Perguntas de estudo</w:t>
-      </w:r>
-    </w:p>
-    <w:p>
-      <w:pPr>
-        <w:pStyle w:val="ListBullet"/>
-      </w:pPr>
-      <w:r>
-        <w:rPr>
           <w:i/>
         </w:rPr>
-        <w:t>Habitar o digital é sinônimo de inclusão digital? (não: vai além de acesso e posse, 3.6).</w:t>
+        <w:t>Por que Castells, se o território já é lido com Santos? (Santos mostra os tempos acumulados; Castells e Bauman ajudam a ver os fluxos que mudam o lugar, cap. 6).</w:t>
       </w:r>
     </w:p>
     <w:p>
@@ -4896,7 +5058,7 @@
         <w:pStyle w:val="Heading2"/>
       </w:pPr>
       <w:r>
-        <w:t>Slide 15 · Conceitos e teóricos que guiam a tese</w:t>
+        <w:t>Slide 15 · O digital</w:t>
       </w:r>
     </w:p>
     <w:p>
@@ -4905,7 +5067,7 @@
           <w:color w:val="555555"/>
           <w:sz w:val="20"/>
         </w:rPr>
-        <w:t>50 s  ·  ao final: 13:25</w:t>
+        <w:t>65 s  ·  ao final: 13:25</w:t>
       </w:r>
     </w:p>
     <w:p>
@@ -4914,7 +5076,7 @@
           <w:i/>
           <w:color w:val="555555"/>
         </w:rPr>
-        <w:t>[Apontar as quatro colunas da esquerda para a direita e, por fim, a faixa amarela.]</w:t>
+        <w:t>[Apontar as três colunas da esquerda para a direita; a faixa amarela não precisa ser lida.]</w:t>
       </w:r>
     </w:p>
     <w:tbl>
@@ -4942,7 +5104,7 @@
               <w:rPr>
                 <w:sz w:val="24"/>
               </w:rPr>
-              <w:t>Reúno os conceitos e os autores que guiam a tese. A política é lida pelo ciclo de políticas, de Bowe, Ball e Gold, com Mainardes, e pela teoria da atuação de Ball, Maguire e Braun. Os profissionais, pelas culturas profissionais de Hargreaves, pela performatividade em Ball, pelo poder em Foucault e pelos sentidos em Hall. O território, por Milton Santos e Doreen Massey e pelo habitar em Schlemmer, Backes e Palagi. A cultura digital, pela crítica às plataformas e aos dados, com Zuboff, Silveira e Morozov, e pelos sujeitos como produtores de cultura, com Pretto. Daí nascem as três formulações da tese.</w:t>
+              <w:t>O que atravessa a tese, e a torna necessária, é o digital. Chamo de habitar o digital as maneiras pelas quais as tecnologias digitais atravessam os espaços, as relações e as práticas cotidianas de um território, produzindo possibilidades desiguais de acesso, participação e apropriação, com Schlemmer, Backes e Palagi e com Di Felice. Essa compreensão precisa ser ensinada: Buckingham lembra que as crianças não sabem naturalmente usar computadores, Valente adverte que computadores sem preparo dos professores não trazem os benefícios esperados, e Castells, que ser excluído das redes é uma das formas mais danosas de exclusão. E o ambiente em que isso acontece tem donos e interesses: Zuboff, Silveira e Morozov tratam dos dados e das soluções prontas, e Pretto lembra que as crianças podem produzir cultura.</w:t>
             </w:r>
           </w:p>
         </w:tc>
@@ -4976,7 +5138,7 @@
       <w:r>
         <w:drawing>
           <wp:inline xmlns:a="http://schemas.openxmlformats.org/drawingml/2006/main" xmlns:pic="http://schemas.openxmlformats.org/drawingml/2006/picture">
-            <wp:extent cx="5903999" cy="3447935"/>
+            <wp:extent cx="5903999" cy="3654575"/>
             <wp:docPr id="12" name="Picture 12"/>
             <wp:cNvGraphicFramePr>
               <a:graphicFrameLocks noChangeAspect="1"/>
@@ -4997,7 +5159,7 @@
                   <pic:spPr>
                     <a:xfrm>
                       <a:off x="0" y="0"/>
-                      <a:ext cx="5903999" cy="3447935"/>
+                      <a:ext cx="5903999" cy="3654575"/>
                     </a:xfrm>
                     <a:prstGeom prst="rect"/>
                   </pic:spPr>
@@ -5016,7 +5178,7 @@
         <w:t xml:space="preserve">Ideia central: </w:t>
       </w:r>
       <w:r>
-        <w:t>Síntese do quadro teórico em quatro frentes (política, profissionais, território, cultura digital); só teóricos, sem leis nem documentos normativos, e as três formulações próprias da tese.</w:t>
+        <w:t>O que atravessa a tese e por que ela é necessária: o habitar o digital, a razão de ensiná-lo e o ambiente de plataformas e dados em que ele acontece.</w:t>
       </w:r>
     </w:p>
     <w:p>
@@ -5035,10 +5197,10 @@
         <w:rPr>
           <w:b/>
         </w:rPr>
-        <w:t xml:space="preserve">A política: </w:t>
-      </w:r>
-      <w:r>
-        <w:t>Ciclo de políticas (BOWE; BALL; GOLD, 1992; MAINARDES, 2006); atuação como interpretar e traduzir (BALL; MAGUIRE; BRAUN, 2016); recontextualização, a política "recriada" na prática (BOWE; BALL; GOLD, 1992, p. 22).</w:t>
+        <w:t xml:space="preserve">Habitar o digital: </w:t>
+      </w:r>
+      <w:r>
+        <w:t>Formulação da tese: maneiras pelas quais as tecnologias digitais atravessam os espaços, as relações e as práticas cotidianas de um território, produzindo possibilidades desiguais de acesso, participação e apropriação. Habitar "tem o significado de estar presente" e "natureza relacional" (SCHLEMMER; BACKES; PALAGI, 2021, p. 15); Educação OnLIFE (p. 24); habitar atópico (DI FELICE, 2009).</w:t>
       </w:r>
     </w:p>
     <w:p>
@@ -5049,10 +5211,10 @@
         <w:rPr>
           <w:b/>
         </w:rPr>
-        <w:t xml:space="preserve">Os profissionais: </w:t>
-      </w:r>
-      <w:r>
-        <w:t>Culturas profissionais (HARGREAVES, 2005); performatividade e fabricação (BALL, 2002; 2008); poder e resistência (FOUCAULT, 1999; BALL, 2011; FREIRE, 2019); sentidos que organizam ações (HALL, 2006).</w:t>
+        <w:t xml:space="preserve">Por que ensinar o digital: </w:t>
+      </w:r>
+      <w:r>
+        <w:t>"As crianças não sabem 'naturalmente' como usar computadores" (BUCKINGHAM, 2006, p. 39), contra a ideia de nativos digitais; computadores "sem o devido preparo de professores e da comunidade escolar" não trazem os benefícios esperados (VALENTE, 1999, p. 83); ser excluído das redes é "uma das formas mais danosas de exclusão" (CASTELLS, 2003, p. 8). Daí a tarefa que a PNED atribui à escola.</w:t>
       </w:r>
     </w:p>
     <w:p>
@@ -5063,10 +5225,40 @@
         <w:rPr>
           <w:b/>
         </w:rPr>
-        <w:t xml:space="preserve">O território: </w:t>
-      </w:r>
-      <w:r>
-        <w:t>Território usado e rugosidades (SANTOS, 1999; 2006; 2012); lugar como encontro de trajetórias (MASSEY, 2008); habitar e Educação OnLIFE (SCHLEMMER; BACKES; PALAGI, 2021; DI FELICE, 2009).</w:t>
+        <w:t xml:space="preserve">O ambiente em que acontece: </w:t>
+      </w:r>
+      <w:r>
+        <w:t>Capitalismo de vigilância (ZUBOFF, 2021); dados pessoais e privacidade (SILVEIRA, 2017, p. 34; 37); solucionismo (MOROZOV, 2018, p. 88); crianças como "produtores ativos de cultura" (PRETTO; CORDEIRO; OLIVEIRA, 2013, p. 35). Contexto teórico, sem virar categoria de análise; entra no campo pelo Eixo 6 da entrevista.</w:t>
+      </w:r>
+    </w:p>
+    <w:p>
+      <w:r>
+        <w:rPr>
+          <w:b/>
+        </w:rPr>
+        <w:t xml:space="preserve">Autores e obras: </w:t>
+      </w:r>
+      <w:r>
+        <w:t>Schlemmer, Backes e Palagi (2021); Di Felice (2009); Buckingham (2006); Valente (1999); Castells (2003); Zuboff (2021); Silveira (2017); Morozov (2018); Pretto, Cordeiro e Oliveira (2013).</w:t>
+      </w:r>
+    </w:p>
+    <w:p>
+      <w:r>
+        <w:rPr>
+          <w:b/>
+        </w:rPr>
+        <w:t xml:space="preserve">Onde aprofundar: </w:t>
+      </w:r>
+      <w:r>
+        <w:t>Cap. 1, seção 1.1 (Buckingham, Castells); cap. 3, seções 3.6 e 3.6.1; cap. 6, seção 6.5.2 (Valente).</w:t>
+      </w:r>
+    </w:p>
+    <w:p>
+      <w:r>
+        <w:rPr>
+          <w:b/>
+        </w:rPr>
+        <w:t>Perguntas de estudo</w:t>
       </w:r>
     </w:p>
     <w:p>
@@ -5075,12 +5267,9 @@
       </w:pPr>
       <w:r>
         <w:rPr>
-          <w:b/>
-        </w:rPr>
-        <w:t xml:space="preserve">A cultura digital: </w:t>
-      </w:r>
-      <w:r>
-        <w:t>Contexto das tecnologias digitais, sem virar categoria de análise: capitalismo de vigilância (ZUBOFF, 2021) e dados pessoais (SILVEIRA, 2017); solucionismo (MOROZOV, 2018); sujeitos como produtores de cultura (PRETTO; CORDEIRO; OLIVEIRA, 2013). Entra no campo pelo Eixo 6 da entrevista.</w:t>
+          <w:i/>
+        </w:rPr>
+        <w:t>Habitar o digital é o mesmo que inclusão digital? (não se reduz a acesso e posse; envolve participação e apropriação, cap. 3.6).</w:t>
       </w:r>
     </w:p>
     <w:p>
@@ -5089,42 +5278,9 @@
       </w:pPr>
       <w:r>
         <w:rPr>
-          <w:b/>
-        </w:rPr>
-        <w:t xml:space="preserve">Formulações da tese: </w:t>
-      </w:r>
-      <w:r>
-        <w:t>Habitar o digital (cap. 3), rugosidade tecnológica (cap. 6) e vazio material (cap. 5).</w:t>
-      </w:r>
-    </w:p>
-    <w:p>
-      <w:r>
-        <w:rPr>
-          <w:b/>
-        </w:rPr>
-        <w:t xml:space="preserve">Autores e obras: </w:t>
-      </w:r>
-      <w:r>
-        <w:t>Os mesmos autores dos slides 12 a 14, reunidos. A ONU (2021) e as normas ficam fora deste slide por não serem referenciais teóricos; as crianças aparecem nos slides 5, 6 e 28.</w:t>
-      </w:r>
-    </w:p>
-    <w:p>
-      <w:r>
-        <w:rPr>
-          <w:b/>
-        </w:rPr>
-        <w:t xml:space="preserve">Onde aprofundar: </w:t>
-      </w:r>
-      <w:r>
-        <w:t>Cap. 3, seções 3.1 a 3.6.</w:t>
-      </w:r>
-    </w:p>
-    <w:p>
-      <w:r>
-        <w:rPr>
-          <w:b/>
-        </w:rPr>
-        <w:t>Perguntas de estudo</w:t>
+          <w:i/>
+        </w:rPr>
+        <w:t>Se as crianças já usam celular, por que a escola precisa ensinar o digital? (Buckingham: a familiaridade com os aparelhos não é compreensão do ambiente digital).</w:t>
       </w:r>
     </w:p>
     <w:p>
@@ -5135,18 +5291,7 @@
         <w:rPr>
           <w:i/>
         </w:rPr>
-        <w:t>Como autores de tradições diferentes conversam na tese? (o ciclo de políticas organiza; a atuação explica o contexto da prática; o território situa; os direitos das crianças dão o critério de leitura).</w:t>
-      </w:r>
-    </w:p>
-    <w:p>
-      <w:pPr>
-        <w:pStyle w:val="ListBullet"/>
-      </w:pPr>
-      <w:r>
-        <w:rPr>
-          <w:i/>
-        </w:rPr>
-        <w:t>Por que Hall aparece entre os teóricos? (sentidos que organizam ações; aproximação declarada, slide 4).</w:t>
+        <w:t>Por que Zuboff e Morozov não viram categorias de análise? (são contexto teórico; entram pelo Eixo 6).</w:t>
       </w:r>
     </w:p>
     <w:p>

</xml_diff>